<commit_message>
docs(data): dataset provenance from the ATSH-NLP-20k README; drop the open provenance questions
</commit_message>
<xml_diff>
--- a/report/BAO_CAO.docx
+++ b/report/BAO_CAO.docx
@@ -134,7 +134,7 @@
       </w:r>
       <w:r>
         <w:rPr/>
-        <w:t xml:space="preserve"> 1 cho 26 chủ đề với 33,3% nhiễu trên 1.493 bình luận. Điểm còn mở duy nhất là nguồn và cách gán nhãn của dữ liệu, nhóm đang xác nhận (mục 2.1).</w:t>
+        <w:t xml:space="preserve"> 1 cho 26 chủ đề với 33,3% nhiễu trên 1.493 bình luận. Hạn chế cần đọc kèm mọi con số: nhãn là nhãn silver do mô hình ngôn ngữ lớn gán tự động, chưa được người kiểm tra từng dòng, và theo chính tác giả dữ liệu thì lớp trung tính là lớp nhiễu nhất (mục 2.1). Phần đọc tay 150 bình luận ở mục 7 đồng thời là bước kiểm tra chất lượng nhãn mà tác giả khuyến nghị.</w:t>
       </w:r>
     </w:p>
     <w:p>
@@ -324,22 +324,507 @@
       </w:r>
       <w:r>
         <w:rPr/>
-        <w:t>. Phần mô tả nguồn gốc dưới đây chưa thể suy ra từ mã nguồn hay từ chính tệp dữ liệu, nhóm phải điền tay trước khi nộp.</w:t>
+        <w:t xml:space="preserve">. Tệp này là hai cột </w:t>
+      </w:r>
+      <w:r>
+        <w:rPr>
+          <w:rFonts w:ascii="Consolas" w:hAnsi="Consolas" w:cs="Consolas" w:eastAsia="Consolas"/>
+          <w:sz w:val="20"/>
+        </w:rPr>
+        <w:t>text</w:t>
+      </w:r>
+      <w:r>
+        <w:rPr/>
+        <w:t xml:space="preserve"> và </w:t>
+      </w:r>
+      <w:r>
+        <w:rPr>
+          <w:rFonts w:ascii="Consolas" w:hAnsi="Consolas" w:cs="Consolas" w:eastAsia="Consolas"/>
+          <w:sz w:val="20"/>
+        </w:rPr>
+        <w:t>label</w:t>
+      </w:r>
+      <w:r>
+        <w:rPr/>
+        <w:t xml:space="preserve"> của </w:t>
+      </w:r>
+      <w:r>
+        <w:rPr>
+          <w:rFonts w:ascii="Consolas" w:hAnsi="Consolas" w:cs="Consolas" w:eastAsia="Consolas"/>
+          <w:sz w:val="20"/>
+        </w:rPr>
+        <w:t>atsh_sentiment_20k.csv</w:t>
+      </w:r>
+      <w:r>
+        <w:rPr/>
+        <w:t xml:space="preserve"> trong gói dữ liệu ATSH-NLP-20k, đã đối chiếu từng dòng: 20.000 dòng, cùng thứ tự, cùng nhãn. Mọi thông tin về nguồn gốc dưới đây lấy từ README của tác giả gói dữ liệu, được sao chép nguyên văn tại </w:t>
+      </w:r>
+      <w:r>
+        <w:rPr>
+          <w:rFonts w:ascii="Consolas" w:hAnsi="Consolas" w:cs="Consolas" w:eastAsia="Consolas"/>
+          <w:sz w:val="20"/>
+        </w:rPr>
+        <w:t>data/README_ATSH_NLP_20k_goc.md</w:t>
+      </w:r>
+      <w:r>
+        <w:rPr/>
+        <w:t>.</w:t>
       </w:r>
     </w:p>
     <w:p>
       <w:pPr>
-        <w:pStyle w:val="IntenseQuote"/>
+        <w:jc w:val="both"/>
       </w:pPr>
       <w:r>
-        <w:rPr>
-          <w:b/>
-        </w:rPr>
-        <w:t>TODO nhóm điền trước khi nộp</w:t>
-      </w:r>
-      <w:r>
-        <w:rPr/>
-        <w:t xml:space="preserve"> - Video hoặc kênh nguồn: (danh sách link video, số video, kênh) - Thời điểm thu thập: (khoảng ngày) - Cách gán nhãn: (gán tay, dùng LLM, hay heuristic; nếu có nhiều bước thì mô tả từng bước) - Người gán nhãn: (ai, bao nhiêu người, mỗi bình luận có mấy người gán) - Hướng dẫn gán nhãn: (tài liệu quy ước ba lớp mà người gán đã dùng) - Độ đồng thuận giữa người gán (nếu có): (Cohen's kappa hoặc tỉ lệ trùng khớp trên tập kiểm tra chéo) - Giấy phép và điều khoản sử dụng dữ liệu: (điều khoản YouTube Data API, phạm vi sử dụng cho mục đích học tập) - Có bước lấy mẫu hay cân bằng lớp không: (xem ghi chú ở mục 2.2)</w:t>
+        <w:rPr/>
+        <w:t>"Dữ liệu được cung cấp bởi dự án ATSH-ABSA (Phạm Xuân Vĩnh Hà, UIT), chỉ dùng cho mục đích học tập."</w:t>
+      </w:r>
+    </w:p>
+    <w:tbl>
+      <w:tblPr>
+        <w:tblStyle w:val="TableGrid"/>
+        <w:tblW w:type="auto" w:w="0"/>
+        <w:jc w:val="center"/>
+        <w:tblLayout w:type="autofit"/>
+        <w:tblLook w:firstColumn="1" w:firstRow="1" w:lastColumn="0" w:lastRow="0" w:noHBand="0" w:noVBand="1" w:val="04A0"/>
+      </w:tblPr>
+      <w:tblGrid>
+        <w:gridCol w:w="4536"/>
+        <w:gridCol w:w="4536"/>
+      </w:tblGrid>
+      <w:tr>
+        <w:tc>
+          <w:tcPr>
+            <w:tcW w:type="dxa" w:w="4536"/>
+          </w:tcPr>
+          <w:p>
+            <w:pPr>
+              <w:spacing w:after="40" w:line="240" w:lineRule="auto"/>
+            </w:pPr>
+            <w:r>
+              <w:rPr>
+                <w:b/>
+                <w:sz w:val="18"/>
+              </w:rPr>
+              <w:t>Mục</w:t>
+            </w:r>
+          </w:p>
+        </w:tc>
+        <w:tc>
+          <w:tcPr>
+            <w:tcW w:type="dxa" w:w="4536"/>
+          </w:tcPr>
+          <w:p>
+            <w:pPr>
+              <w:spacing w:after="40" w:line="240" w:lineRule="auto"/>
+            </w:pPr>
+            <w:r>
+              <w:rPr>
+                <w:b/>
+                <w:sz w:val="18"/>
+              </w:rPr>
+              <w:t>Nội dung theo README của tác giả</w:t>
+            </w:r>
+          </w:p>
+        </w:tc>
+      </w:tr>
+      <w:tr>
+        <w:tc>
+          <w:tcPr>
+            <w:tcW w:type="dxa" w:w="4536"/>
+          </w:tcPr>
+          <w:p>
+            <w:pPr>
+              <w:spacing w:after="40" w:line="240" w:lineRule="auto"/>
+            </w:pPr>
+            <w:r>
+              <w:rPr>
+                <w:sz w:val="18"/>
+              </w:rPr>
+              <w:t>Nguồn</w:t>
+            </w:r>
+          </w:p>
+        </w:tc>
+        <w:tc>
+          <w:tcPr>
+            <w:tcW w:type="dxa" w:w="4536"/>
+          </w:tcPr>
+          <w:p>
+            <w:pPr>
+              <w:spacing w:after="40" w:line="240" w:lineRule="auto"/>
+            </w:pPr>
+            <w:r>
+              <w:rPr>
+                <w:sz w:val="18"/>
+              </w:rPr>
+              <w:t>Trích từ dự án nghiên cứu ATSH-ABSA của Phạm Xuân Vĩnh Hà (UIT, ĐHQG TP.HCM). Lấy từ bản gán nhãn tự động (silver), không lấy từ bản gán nhãn thủ công (gold); không có bình luận nào trùng với bộ gold.</w:t>
+            </w:r>
+          </w:p>
+        </w:tc>
+      </w:tr>
+      <w:tr>
+        <w:tc>
+          <w:tcPr>
+            <w:tcW w:type="dxa" w:w="4536"/>
+          </w:tcPr>
+          <w:p>
+            <w:pPr>
+              <w:spacing w:after="40" w:line="240" w:lineRule="auto"/>
+            </w:pPr>
+            <w:r>
+              <w:rPr>
+                <w:sz w:val="18"/>
+              </w:rPr>
+              <w:t>Nội dung</w:t>
+            </w:r>
+          </w:p>
+        </w:tc>
+        <w:tc>
+          <w:tcPr>
+            <w:tcW w:type="dxa" w:w="4536"/>
+          </w:tcPr>
+          <w:p>
+            <w:pPr>
+              <w:spacing w:after="40" w:line="240" w:lineRule="auto"/>
+            </w:pPr>
+            <w:r>
+              <w:rPr>
+                <w:sz w:val="18"/>
+              </w:rPr>
+              <w:t>Bình luận YouTube tiếng Việt về chương trình Anh Trai Say Hi, mùa 1, tập 1 đến 14.</w:t>
+            </w:r>
+          </w:p>
+        </w:tc>
+      </w:tr>
+      <w:tr>
+        <w:tc>
+          <w:tcPr>
+            <w:tcW w:type="dxa" w:w="4536"/>
+          </w:tcPr>
+          <w:p>
+            <w:pPr>
+              <w:spacing w:after="40" w:line="240" w:lineRule="auto"/>
+            </w:pPr>
+            <w:r>
+              <w:rPr>
+                <w:sz w:val="18"/>
+              </w:rPr>
+              <w:t>Cách gán nhãn</w:t>
+            </w:r>
+          </w:p>
+        </w:tc>
+        <w:tc>
+          <w:tcPr>
+            <w:tcW w:type="dxa" w:w="4536"/>
+          </w:tcPr>
+          <w:p>
+            <w:pPr>
+              <w:spacing w:after="40" w:line="240" w:lineRule="auto"/>
+            </w:pPr>
+            <w:r>
+              <w:rPr>
+                <w:sz w:val="18"/>
+              </w:rPr>
+              <w:t>Nhãn do mô hình ngôn ngữ lớn gán tự động theo một bộ hướng dẫn gán nhãn, theo từng đối tượng (chương trình hoặc nghệ sĩ) và từng khía cạnh (chuyên môn, ngoại hình/phong cách, tính cách, độ nổi tiếng), rồi gộp thành một nhãn tổng thể (quy tắc gộp ở mục 2.3). Chưa được người kiểm tra từng dòng. Tác giả ghi nhãn trung tính là nhãn nhiễu nhất và khuyên kiểm tra thủ công 100 đến 200 dòng của tập test rồi ghi tỉ lệ nhãn đúng vào báo cáo.</w:t>
+            </w:r>
+          </w:p>
+        </w:tc>
+      </w:tr>
+      <w:tr>
+        <w:tc>
+          <w:tcPr>
+            <w:tcW w:type="dxa" w:w="4536"/>
+          </w:tcPr>
+          <w:p>
+            <w:pPr>
+              <w:spacing w:after="40" w:line="240" w:lineRule="auto"/>
+            </w:pPr>
+            <w:r>
+              <w:rPr>
+                <w:sz w:val="18"/>
+              </w:rPr>
+              <w:t>Lấy mẫu lại</w:t>
+            </w:r>
+          </w:p>
+        </w:tc>
+        <w:tc>
+          <w:tcPr>
+            <w:tcW w:type="dxa" w:w="4536"/>
+          </w:tcPr>
+          <w:p>
+            <w:pPr>
+              <w:spacing w:after="40" w:line="240" w:lineRule="auto"/>
+            </w:pPr>
+            <w:r>
+              <w:rPr>
+                <w:sz w:val="18"/>
+              </w:rPr>
+              <w:t>Dữ liệu gốc khoảng 88% tích cực. Bộ này lấy toàn bộ bình luận trung tính hợp lệ, 7.000 bình luận tiêu cực, phần còn lại lấy từ bình luận tích cực; chọn mẫu với seed 42. Tỉ lệ nhãn vì vậy không phản ánh tỉ lệ thật trên YouTube.</w:t>
+            </w:r>
+          </w:p>
+        </w:tc>
+      </w:tr>
+      <w:tr>
+        <w:tc>
+          <w:tcPr>
+            <w:tcW w:type="dxa" w:w="4536"/>
+          </w:tcPr>
+          <w:p>
+            <w:pPr>
+              <w:spacing w:after="40" w:line="240" w:lineRule="auto"/>
+            </w:pPr>
+            <w:r>
+              <w:rPr>
+                <w:sz w:val="18"/>
+              </w:rPr>
+              <w:t>Bộ lọc</w:t>
+            </w:r>
+          </w:p>
+        </w:tc>
+        <w:tc>
+          <w:tcPr>
+            <w:tcW w:type="dxa" w:w="4536"/>
+          </w:tcPr>
+          <w:p>
+            <w:pPr>
+              <w:spacing w:after="40" w:line="240" w:lineRule="auto"/>
+            </w:pPr>
+            <w:r>
+              <w:rPr>
+                <w:sz w:val="18"/>
+              </w:rPr>
+              <w:t>Không phải spam, có liên quan tới chương trình, có thể hiện cảm xúc, dài 5 đến 500 ký tự; đã loại bình luận trùng nhau và bình luận có chứa đường link.</w:t>
+            </w:r>
+          </w:p>
+        </w:tc>
+      </w:tr>
+      <w:tr>
+        <w:tc>
+          <w:tcPr>
+            <w:tcW w:type="dxa" w:w="4536"/>
+          </w:tcPr>
+          <w:p>
+            <w:pPr>
+              <w:spacing w:after="40" w:line="240" w:lineRule="auto"/>
+            </w:pPr>
+            <w:r>
+              <w:rPr>
+                <w:sz w:val="18"/>
+              </w:rPr>
+              <w:t>Dữ liệu cá nhân</w:t>
+            </w:r>
+          </w:p>
+        </w:tc>
+        <w:tc>
+          <w:tcPr>
+            <w:tcW w:type="dxa" w:w="4536"/>
+          </w:tcPr>
+          <w:p>
+            <w:pPr>
+              <w:spacing w:after="40" w:line="240" w:lineRule="auto"/>
+            </w:pPr>
+            <w:r>
+              <w:rPr>
+                <w:sz w:val="18"/>
+              </w:rPr>
+              <w:t xml:space="preserve">Không có tên tài khoản hay thông tin của người bình luận. Tệp của nhóm chỉ giữ hai cột </w:t>
+            </w:r>
+            <w:r>
+              <w:rPr>
+                <w:rFonts w:ascii="Consolas" w:hAnsi="Consolas" w:cs="Consolas" w:eastAsia="Consolas"/>
+                <w:sz w:val="18"/>
+              </w:rPr>
+              <w:t>text</w:t>
+            </w:r>
+            <w:r>
+              <w:rPr>
+                <w:sz w:val="18"/>
+              </w:rPr>
+              <w:t xml:space="preserve"> và </w:t>
+            </w:r>
+            <w:r>
+              <w:rPr>
+                <w:rFonts w:ascii="Consolas" w:hAnsi="Consolas" w:cs="Consolas" w:eastAsia="Consolas"/>
+                <w:sz w:val="18"/>
+              </w:rPr>
+              <w:t>label</w:t>
+            </w:r>
+            <w:r>
+              <w:rPr>
+                <w:sz w:val="18"/>
+              </w:rPr>
+              <w:t>.</w:t>
+            </w:r>
+          </w:p>
+        </w:tc>
+      </w:tr>
+      <w:tr>
+        <w:tc>
+          <w:tcPr>
+            <w:tcW w:type="dxa" w:w="4536"/>
+          </w:tcPr>
+          <w:p>
+            <w:pPr>
+              <w:spacing w:after="40" w:line="240" w:lineRule="auto"/>
+            </w:pPr>
+            <w:r>
+              <w:rPr>
+                <w:sz w:val="18"/>
+              </w:rPr>
+              <w:t>Phần còn lại của gói gốc</w:t>
+            </w:r>
+          </w:p>
+        </w:tc>
+        <w:tc>
+          <w:tcPr>
+            <w:tcW w:type="dxa" w:w="4536"/>
+          </w:tcPr>
+          <w:p>
+            <w:pPr>
+              <w:spacing w:after="40" w:line="240" w:lineRule="auto"/>
+            </w:pPr>
+            <w:r>
+              <w:rPr>
+                <w:sz w:val="18"/>
+              </w:rPr>
+              <w:t xml:space="preserve">Cột </w:t>
+            </w:r>
+            <w:r>
+              <w:rPr>
+                <w:rFonts w:ascii="Consolas" w:hAnsi="Consolas" w:cs="Consolas" w:eastAsia="Consolas"/>
+                <w:sz w:val="18"/>
+              </w:rPr>
+              <w:t>tap</w:t>
+            </w:r>
+            <w:r>
+              <w:rPr>
+                <w:sz w:val="18"/>
+              </w:rPr>
+              <w:t xml:space="preserve"> (TAP1 đến TAP14), </w:t>
+            </w:r>
+            <w:r>
+              <w:rPr>
+                <w:rFonts w:ascii="Consolas" w:hAnsi="Consolas" w:cs="Consolas" w:eastAsia="Consolas"/>
+                <w:sz w:val="18"/>
+              </w:rPr>
+              <w:t>doi_tuong</w:t>
+            </w:r>
+            <w:r>
+              <w:rPr>
+                <w:sz w:val="18"/>
+              </w:rPr>
+              <w:t xml:space="preserve"> (</w:t>
+            </w:r>
+            <w:r>
+              <w:rPr>
+                <w:rFonts w:ascii="Consolas" w:hAnsi="Consolas" w:cs="Consolas" w:eastAsia="Consolas"/>
+                <w:sz w:val="18"/>
+              </w:rPr>
+              <w:t>nghe_si</w:t>
+            </w:r>
+            <w:r>
+              <w:rPr>
+                <w:sz w:val="18"/>
+              </w:rPr>
+              <w:t xml:space="preserve">, </w:t>
+            </w:r>
+            <w:r>
+              <w:rPr>
+                <w:rFonts w:ascii="Consolas" w:hAnsi="Consolas" w:cs="Consolas" w:eastAsia="Consolas"/>
+                <w:sz w:val="18"/>
+              </w:rPr>
+              <w:t>chuong_trinh</w:t>
+            </w:r>
+            <w:r>
+              <w:rPr>
+                <w:sz w:val="18"/>
+              </w:rPr>
+              <w:t xml:space="preserve">, </w:t>
+            </w:r>
+            <w:r>
+              <w:rPr>
+                <w:rFonts w:ascii="Consolas" w:hAnsi="Consolas" w:cs="Consolas" w:eastAsia="Consolas"/>
+                <w:sz w:val="18"/>
+              </w:rPr>
+              <w:t>ca_hai</w:t>
+            </w:r>
+            <w:r>
+              <w:rPr>
+                <w:sz w:val="18"/>
+              </w:rPr>
+              <w:t xml:space="preserve">), </w:t>
+            </w:r>
+            <w:r>
+              <w:rPr>
+                <w:rFonts w:ascii="Consolas" w:hAnsi="Consolas" w:cs="Consolas" w:eastAsia="Consolas"/>
+                <w:sz w:val="18"/>
+              </w:rPr>
+              <w:t>nghe_si</w:t>
+            </w:r>
+            <w:r>
+              <w:rPr>
+                <w:sz w:val="18"/>
+              </w:rPr>
+              <w:t xml:space="preserve"> (tối đa 3 tên); bộ chia sẵn train/val/test 15.999 / 2.000 / 2.001 (80/10/10, phân tầng theo nhãn); </w:t>
+            </w:r>
+            <w:r>
+              <w:rPr>
+                <w:rFonts w:ascii="Consolas" w:hAnsi="Consolas" w:cs="Consolas" w:eastAsia="Consolas"/>
+                <w:sz w:val="18"/>
+              </w:rPr>
+              <w:t>atsh_kol_aspect.csv</w:t>
+            </w:r>
+            <w:r>
+              <w:rPr>
+                <w:sz w:val="18"/>
+              </w:rPr>
+              <w:t xml:space="preserve"> gồm 11.766 cặp bình luận và nghệ sĩ kèm nhãn cảm xúc theo 4 khía cạnh. Nhóm không dùng các phần này; phép chia ở mục 2.4 là của nhóm.</w:t>
+            </w:r>
+          </w:p>
+        </w:tc>
+      </w:tr>
+      <w:tr>
+        <w:tc>
+          <w:tcPr>
+            <w:tcW w:type="dxa" w:w="4536"/>
+          </w:tcPr>
+          <w:p>
+            <w:pPr>
+              <w:spacing w:after="40" w:line="240" w:lineRule="auto"/>
+            </w:pPr>
+            <w:r>
+              <w:rPr>
+                <w:sz w:val="18"/>
+              </w:rPr>
+              <w:t>Điều kiện sử dụng</w:t>
+            </w:r>
+          </w:p>
+        </w:tc>
+        <w:tc>
+          <w:tcPr>
+            <w:tcW w:type="dxa" w:w="4536"/>
+          </w:tcPr>
+          <w:p>
+            <w:pPr>
+              <w:spacing w:after="40" w:line="240" w:lineRule="auto"/>
+            </w:pPr>
+            <w:r>
+              <w:rPr>
+                <w:sz w:val="18"/>
+              </w:rPr>
+              <w:t>"Chỉ dùng cho học tập trong khuôn khổ môn học. Không công bố lại, không đưa lên GitHub, Kaggle, Hugging Face hay bất kỳ nơi công khai nào, và không dùng cho bài báo khi chưa có sự đồng ý của tác giả."</w:t>
+            </w:r>
+          </w:p>
+        </w:tc>
+      </w:tr>
+    </w:tbl>
+    <w:p>
+      <w:pPr>
+        <w:jc w:val="both"/>
+      </w:pPr>
+      <w:r>
+        <w:rPr/>
+        <w:t>Theo điều kiện trên, mã nguồn và tệp dữ liệu của đồ án chỉ nộp cho môn học, không đưa lên nơi công khai.</w:t>
       </w:r>
     </w:p>
     <w:p>
@@ -1059,7 +1544,7 @@
       </w:pPr>
       <w:r>
         <w:rPr/>
-        <w:t>Hai điểm cần đọc kỹ. Số 7.000 tròn cho nhãn 0 và tổng 20.000 tròn cho thấy tập dữ liệu là kết quả của một bước lấy mẫu từ một tập lớn hơn, chứ không phải toàn bộ bình luận thu được; nhóm cần ghi rõ quy tắc lấy mẫu vào mục 2.1. Toàn bộ bình luận đều nói về một chương trình duy nhất, "Anh Trai Say Hi", nên các con số ở mục 6 chỉ có giá trị trong miền đó; hệ quả được bàn ở mục 9.</w:t>
+        <w:t>Hai điểm cần đọc kỹ. Số 7.000 tròn cho nhãn 0 và tổng 20.000 tròn là kết quả của bước lấy mẫu lại do tác giả gói dữ liệu thực hiện (mục 2.1): giữ toàn bộ bình luận trung tính hợp lệ, lấy 7.000 bình luận tiêu cực, phần còn lại lấy từ bình luận tích cực, trong khi dữ liệu gốc khoảng 88% tích cực. Tỉ lệ ba lớp trong bảng vì vậy do tác giả chọn để giảm mất cân bằng, không phản ánh tỉ lệ thật trên YouTube, và mọi số đo ở mục 6 đều đo trên phân bố này. Toàn bộ bình luận đều nói về một chương trình duy nhất, "Anh Trai Say Hi", nên các con số ở mục 6 chỉ có giá trị trong miền đó; hệ quả được bàn ở mục 9.</w:t>
       </w:r>
     </w:p>
     <w:p>
@@ -1088,7 +1573,7 @@
       </w:r>
       <w:r>
         <w:rPr/>
-        <w:t xml:space="preserve"> tiêu cực (chê, thất vọng, bức xúc), </w:t>
+        <w:t xml:space="preserve"> tiêu cực, </w:t>
       </w:r>
       <w:r>
         <w:rPr>
@@ -1099,7 +1584,7 @@
       </w:r>
       <w:r>
         <w:rPr/>
-        <w:t xml:space="preserve"> trung tính (nhận xét không nghiêng về khen hay chê, câu hỏi, câu kể, hoặc vừa khen vừa chê), </w:t>
+        <w:t xml:space="preserve"> trung tính, </w:t>
       </w:r>
       <w:r>
         <w:rPr>
@@ -1110,7 +1595,40 @@
       </w:r>
       <w:r>
         <w:rPr/>
-        <w:t xml:space="preserve"> tích cực (khen, yêu thích, cảm động). Đây là cách chúng tôi đọc lại từ dữ liệu; hướng dẫn gán nhãn gốc là mục TODO ở 2.1.</w:t>
+        <w:t xml:space="preserve"> tích cực. Theo README của tác giả, nhãn gốc được gán theo từng đối tượng (chương trình hoặc nghệ sĩ) và từng khía cạnh (chuyên môn, ngoại hình/phong cách, tính cách, độ nổi tiếng), rồi gộp thành một nhãn tổng thể: có ít nhất một nhãn tích cực thì tích cực; không có nhãn tích cực nhưng có nhãn tiêu cực thì tiêu cực; chỉ có nhãn trung tính thì trung tính. Bình luận vừa có nhãn tích cực vừa có nhãn tiêu cực đã bị loại. Đọc lại từ dữ liệu, chúng tôi thấy lớp </w:t>
+      </w:r>
+      <w:r>
+        <w:rPr>
+          <w:rFonts w:ascii="Consolas" w:hAnsi="Consolas" w:cs="Consolas" w:eastAsia="Consolas"/>
+          <w:sz w:val="20"/>
+        </w:rPr>
+        <w:t>0</w:t>
+      </w:r>
+      <w:r>
+        <w:rPr/>
+        <w:t xml:space="preserve"> là chê, thất vọng, bức xúc; lớp </w:t>
+      </w:r>
+      <w:r>
+        <w:rPr>
+          <w:rFonts w:ascii="Consolas" w:hAnsi="Consolas" w:cs="Consolas" w:eastAsia="Consolas"/>
+          <w:sz w:val="20"/>
+        </w:rPr>
+        <w:t>2</w:t>
+      </w:r>
+      <w:r>
+        <w:rPr/>
+        <w:t xml:space="preserve"> là khen, yêu thích, cảm động; lớp </w:t>
+      </w:r>
+      <w:r>
+        <w:rPr>
+          <w:rFonts w:ascii="Consolas" w:hAnsi="Consolas" w:cs="Consolas" w:eastAsia="Consolas"/>
+          <w:sz w:val="20"/>
+        </w:rPr>
+        <w:t>1</w:t>
+      </w:r>
+      <w:r>
+        <w:rPr/>
+        <w:t xml:space="preserve"> là nhận xét không nghiêng về khen hay chê, câu hỏi, câu kể, và cả những câu vừa khen vừa chê nhẹ. Điểm cuối khớp với ghi chú của tác giả rằng trung tính là nhãn nhiễu nhất: một số câu chê nhẹ hoặc khen nhẹ vẫn được gán trung tính.</w:t>
       </w:r>
     </w:p>
     <w:p>
@@ -7951,7 +8469,7 @@
       </w:pPr>
       <w:r>
         <w:rPr/>
-        <w:t>Nguồn nhãn, hướng dẫn gán nhãn và độ đồng thuận giữa người gán chưa được ghi lại (mục 2.1).</w:t>
+        <w:t>Nhãn là nhãn silver do mô hình ngôn ngữ lớn gán tự động, chưa được người kiểm tra từng dòng; theo chính tác giả dữ liệu, lớp trung tính là lớp nhiễu nhất (mục 2.1). Phần đọc tay 150 bình luận dự đoán sai ở mục 7 đồng thời là bước kiểm tra chất lượng nhãn mà tác giả khuyến nghị (100 đến 200 dòng của tập kiểm tra, ghi tỉ lệ nhãn đúng).</w:t>
       </w:r>
     </w:p>
     <w:p>
@@ -8035,6 +8553,26 @@
       <w:r>
         <w:rPr/>
         <w:t>Tổ chức lại bài toán thành phân tích cảm xúc theo khía cạnh (ABSA): cảm xúc gắn với từng thí sinh, tiết mục hay khâu tổ chức, thay vì một nhãn cho cả bình luận.</w:t>
+      </w:r>
+    </w:p>
+    <w:p>
+      <w:pPr>
+        <w:pStyle w:val="ListNumber"/>
+      </w:pPr>
+      <w:r>
+        <w:rPr/>
+        <w:t xml:space="preserve">Dùng nhãn khía cạnh có sẵn trong gói dữ liệu gốc cho hướng 5: </w:t>
+      </w:r>
+      <w:r>
+        <w:rPr>
+          <w:rFonts w:ascii="Consolas" w:hAnsi="Consolas" w:cs="Consolas" w:eastAsia="Consolas"/>
+          <w:sz w:val="20"/>
+        </w:rPr>
+        <w:t>atsh_kol_aspect.csv</w:t>
+      </w:r>
+      <w:r>
+        <w:rPr/>
+        <w:t xml:space="preserve"> có 11.766 cặp bình luận và nghệ sĩ kèm nhãn cảm xúc theo 4 khía cạnh (chuyên môn, ngoại hình/phong cách, tính cách, độ nổi tiếng), cùng điều kiện sử dụng ở mục 2.1, nên phần ABSA có dữ liệu có nhãn để huấn luyện và đánh giá mà không cần gán thêm.</w:t>
       </w:r>
     </w:p>
     <w:p>
@@ -8686,6 +9224,37 @@
       <w:r>
         <w:rPr/>
         <w:t>, quota. Kiểm tra lại trước khi nộp.</w:t>
+      </w:r>
+    </w:p>
+    <w:p>
+      <w:pPr>
+        <w:pStyle w:val="ListNumber"/>
+      </w:pPr>
+      <w:r>
+        <w:rPr/>
+        <w:t xml:space="preserve">Dữ liệu được cung cấp bởi dự án ATSH-ABSA (Phạm Xuân Vĩnh Hà, UIT), chỉ dùng cho mục đích học tập. Gói dữ liệu ATSH-NLP-20k, tệp </w:t>
+      </w:r>
+      <w:r>
+        <w:rPr>
+          <w:rFonts w:ascii="Consolas" w:hAnsi="Consolas" w:cs="Consolas" w:eastAsia="Consolas"/>
+          <w:sz w:val="20"/>
+        </w:rPr>
+        <w:t>atsh_sentiment_20k.csv</w:t>
+      </w:r>
+      <w:r>
+        <w:rPr/>
+        <w:t xml:space="preserve">; README của tác giả sao chép tại </w:t>
+      </w:r>
+      <w:r>
+        <w:rPr>
+          <w:rFonts w:ascii="Consolas" w:hAnsi="Consolas" w:cs="Consolas" w:eastAsia="Consolas"/>
+          <w:sz w:val="20"/>
+        </w:rPr>
+        <w:t>data/README_ATSH_NLP_20k_goc.md</w:t>
+      </w:r>
+      <w:r>
+        <w:rPr/>
+        <w:t>.</w:t>
       </w:r>
     </w:p>
     <w:p>

</xml_diff>

<commit_message>
docs(report): team roster on the cover, tighter data slide
</commit_message>
<xml_diff>
--- a/report/BAO_CAO.docx
+++ b/report/BAO_CAO.docx
@@ -47,12 +47,75 @@
       </w:pPr>
       <w:r>
         <w:rPr/>
-        <w:t>Nhóm: [danh sách thành viên và mã số sinh viên]</w:t>
+        <w:t>Nhóm thực hiện:</w:t>
       </w:r>
     </w:p>
     <w:p>
       <w:pPr>
-        <w:jc w:val="center"/>
+        <w:pStyle w:val="ListBullet"/>
+      </w:pPr>
+      <w:r>
+        <w:rPr/>
+        <w:t>Lê Phú Hiếu, 26410038, LT.K2026.1.TTNT</w:t>
+      </w:r>
+    </w:p>
+    <w:p>
+      <w:pPr>
+        <w:pStyle w:val="ListBullet"/>
+      </w:pPr>
+      <w:r>
+        <w:rPr/>
+        <w:t>Nguyễn Thanh Duy, 26410030, LT.K2026.1.TTNT</w:t>
+      </w:r>
+    </w:p>
+    <w:p>
+      <w:pPr>
+        <w:pStyle w:val="ListBullet"/>
+      </w:pPr>
+      <w:r>
+        <w:rPr/>
+        <w:t>Nguyễn Thanh Phong, 26410090, LT.K2026.1.TTNT</w:t>
+      </w:r>
+    </w:p>
+    <w:p>
+      <w:pPr>
+        <w:pStyle w:val="ListBullet"/>
+      </w:pPr>
+      <w:r>
+        <w:rPr/>
+        <w:t>Nguyễn Thị Mai Thi, 26410117, LT.K2026.1.TTNT</w:t>
+      </w:r>
+    </w:p>
+    <w:p>
+      <w:pPr>
+        <w:pStyle w:val="ListBullet"/>
+      </w:pPr>
+      <w:r>
+        <w:rPr/>
+        <w:t>Hồ Viết Trịnh, 26410140, LT.K2026.1.TTNT</w:t>
+      </w:r>
+    </w:p>
+    <w:p>
+      <w:pPr>
+        <w:pStyle w:val="ListBullet"/>
+      </w:pPr>
+      <w:r>
+        <w:rPr/>
+        <w:t>Nguyễn Ngọc Bích, 25730012, CN1.K2025.1.TTNT</w:t>
+      </w:r>
+    </w:p>
+    <w:p>
+      <w:pPr>
+        <w:pStyle w:val="ListBullet"/>
+      </w:pPr>
+      <w:r>
+        <w:rPr/>
+        <w:t>Nguyễn Anh Tài, 25730063, CN1.K2025.1.TTNT</w:t>
+      </w:r>
+    </w:p>
+    <w:p>
+      <w:pPr>
+        <w:jc w:val="both"/>
       </w:pPr>
       <w:r>
         <w:rPr/>

</xml_diff>

<commit_message>
docs(report): drop the per-member assignment table; the work is credited to the whole team
</commit_message>
<xml_diff>
--- a/report/BAO_CAO.docx
+++ b/report/BAO_CAO.docx
@@ -8649,476 +8649,7 @@
       </w:pPr>
       <w:r>
         <w:rPr/>
-        <w:t>10. Phân công và tài liệu tham khảo</w:t>
-      </w:r>
-    </w:p>
-    <w:p>
-      <w:pPr>
-        <w:pStyle w:val="Heading3"/>
-      </w:pPr>
-      <w:r>
-        <w:rPr/>
-        <w:t>10.1. Phân công</w:t>
-      </w:r>
-    </w:p>
-    <w:tbl>
-      <w:tblPr>
-        <w:tblStyle w:val="TableGrid"/>
-        <w:tblW w:type="auto" w:w="0"/>
-        <w:jc w:val="center"/>
-        <w:tblLayout w:type="autofit"/>
-        <w:tblLook w:firstColumn="1" w:firstRow="1" w:lastColumn="0" w:lastRow="0" w:noHBand="0" w:noVBand="1" w:val="04A0"/>
-      </w:tblPr>
-      <w:tblGrid>
-        <w:gridCol w:w="3024"/>
-        <w:gridCol w:w="3024"/>
-        <w:gridCol w:w="3024"/>
-      </w:tblGrid>
-      <w:tr>
-        <w:tc>
-          <w:tcPr>
-            <w:tcW w:type="dxa" w:w="3024"/>
-          </w:tcPr>
-          <w:p>
-            <w:pPr>
-              <w:spacing w:after="40" w:line="240" w:lineRule="auto"/>
-            </w:pPr>
-            <w:r>
-              <w:rPr>
-                <w:b/>
-                <w:sz w:val="18"/>
-              </w:rPr>
-              <w:t>Thành viên</w:t>
-            </w:r>
-          </w:p>
-        </w:tc>
-        <w:tc>
-          <w:tcPr>
-            <w:tcW w:type="dxa" w:w="3024"/>
-          </w:tcPr>
-          <w:p>
-            <w:pPr>
-              <w:spacing w:after="40" w:line="240" w:lineRule="auto"/>
-            </w:pPr>
-            <w:r>
-              <w:rPr>
-                <w:b/>
-                <w:sz w:val="18"/>
-              </w:rPr>
-              <w:t>Phần việc</w:t>
-            </w:r>
-          </w:p>
-        </w:tc>
-        <w:tc>
-          <w:tcPr>
-            <w:tcW w:type="dxa" w:w="3024"/>
-          </w:tcPr>
-          <w:p>
-            <w:pPr>
-              <w:spacing w:after="40" w:line="240" w:lineRule="auto"/>
-            </w:pPr>
-            <w:r>
-              <w:rPr>
-                <w:b/>
-                <w:sz w:val="18"/>
-              </w:rPr>
-              <w:t>Tệp chính</w:t>
-            </w:r>
-          </w:p>
-        </w:tc>
-      </w:tr>
-      <w:tr>
-        <w:tc>
-          <w:tcPr>
-            <w:tcW w:type="dxa" w:w="3024"/>
-          </w:tcPr>
-          <w:p>
-            <w:pPr>
-              <w:spacing w:after="40" w:line="240" w:lineRule="auto"/>
-            </w:pPr>
-            <w:r>
-              <w:rPr>
-                <w:sz w:val="18"/>
-              </w:rPr>
-              <w:t>TODO</w:t>
-            </w:r>
-          </w:p>
-        </w:tc>
-        <w:tc>
-          <w:tcPr>
-            <w:tcW w:type="dxa" w:w="3024"/>
-          </w:tcPr>
-          <w:p>
-            <w:pPr>
-              <w:spacing w:after="40" w:line="240" w:lineRule="auto"/>
-            </w:pPr>
-            <w:r>
-              <w:rPr>
-                <w:sz w:val="18"/>
-              </w:rPr>
-              <w:t>Thu thập bình luận và chuẩn bị dữ liệu</w:t>
-            </w:r>
-          </w:p>
-        </w:tc>
-        <w:tc>
-          <w:tcPr>
-            <w:tcW w:type="dxa" w:w="3024"/>
-          </w:tcPr>
-          <w:p>
-            <w:pPr>
-              <w:spacing w:after="40" w:line="240" w:lineRule="auto"/>
-            </w:pPr>
-            <w:r>
-              <w:rPr>
-                <w:rFonts w:ascii="Consolas" w:hAnsi="Consolas" w:cs="Consolas" w:eastAsia="Consolas"/>
-                <w:sz w:val="18"/>
-              </w:rPr>
-              <w:t>src/crawler.py</w:t>
-            </w:r>
-            <w:r>
-              <w:rPr>
-                <w:sz w:val="18"/>
-              </w:rPr>
-              <w:t xml:space="preserve">, </w:t>
-            </w:r>
-            <w:r>
-              <w:rPr>
-                <w:rFonts w:ascii="Consolas" w:hAnsi="Consolas" w:cs="Consolas" w:eastAsia="Consolas"/>
-                <w:sz w:val="18"/>
-              </w:rPr>
-              <w:t>data/</w:t>
-            </w:r>
-          </w:p>
-        </w:tc>
-      </w:tr>
-      <w:tr>
-        <w:tc>
-          <w:tcPr>
-            <w:tcW w:type="dxa" w:w="3024"/>
-          </w:tcPr>
-          <w:p>
-            <w:pPr>
-              <w:spacing w:after="40" w:line="240" w:lineRule="auto"/>
-            </w:pPr>
-            <w:r>
-              <w:rPr>
-                <w:sz w:val="18"/>
-              </w:rPr>
-              <w:t>TODO</w:t>
-            </w:r>
-          </w:p>
-        </w:tc>
-        <w:tc>
-          <w:tcPr>
-            <w:tcW w:type="dxa" w:w="3024"/>
-          </w:tcPr>
-          <w:p>
-            <w:pPr>
-              <w:spacing w:after="40" w:line="240" w:lineRule="auto"/>
-            </w:pPr>
-            <w:r>
-              <w:rPr>
-                <w:sz w:val="18"/>
-              </w:rPr>
-              <w:t>Tiền xử lý và từ dừng</w:t>
-            </w:r>
-          </w:p>
-        </w:tc>
-        <w:tc>
-          <w:tcPr>
-            <w:tcW w:type="dxa" w:w="3024"/>
-          </w:tcPr>
-          <w:p>
-            <w:pPr>
-              <w:spacing w:after="40" w:line="240" w:lineRule="auto"/>
-            </w:pPr>
-            <w:r>
-              <w:rPr>
-                <w:rFonts w:ascii="Consolas" w:hAnsi="Consolas" w:cs="Consolas" w:eastAsia="Consolas"/>
-                <w:sz w:val="18"/>
-              </w:rPr>
-              <w:t>src/preprocess.py</w:t>
-            </w:r>
-            <w:r>
-              <w:rPr>
-                <w:sz w:val="18"/>
-              </w:rPr>
-              <w:t xml:space="preserve">, </w:t>
-            </w:r>
-            <w:r>
-              <w:rPr>
-                <w:rFonts w:ascii="Consolas" w:hAnsi="Consolas" w:cs="Consolas" w:eastAsia="Consolas"/>
-                <w:sz w:val="18"/>
-              </w:rPr>
-              <w:t>src/resources/</w:t>
-            </w:r>
-          </w:p>
-        </w:tc>
-      </w:tr>
-      <w:tr>
-        <w:tc>
-          <w:tcPr>
-            <w:tcW w:type="dxa" w:w="3024"/>
-          </w:tcPr>
-          <w:p>
-            <w:pPr>
-              <w:spacing w:after="40" w:line="240" w:lineRule="auto"/>
-            </w:pPr>
-            <w:r>
-              <w:rPr>
-                <w:sz w:val="18"/>
-              </w:rPr>
-              <w:t>TODO</w:t>
-            </w:r>
-          </w:p>
-        </w:tc>
-        <w:tc>
-          <w:tcPr>
-            <w:tcW w:type="dxa" w:w="3024"/>
-          </w:tcPr>
-          <w:p>
-            <w:pPr>
-              <w:spacing w:after="40" w:line="240" w:lineRule="auto"/>
-            </w:pPr>
-            <w:r>
-              <w:rPr>
-                <w:sz w:val="18"/>
-              </w:rPr>
-              <w:t>Gom cụm chủ đề</w:t>
-            </w:r>
-          </w:p>
-        </w:tc>
-        <w:tc>
-          <w:tcPr>
-            <w:tcW w:type="dxa" w:w="3024"/>
-          </w:tcPr>
-          <w:p>
-            <w:pPr>
-              <w:spacing w:after="40" w:line="240" w:lineRule="auto"/>
-            </w:pPr>
-            <w:r>
-              <w:rPr>
-                <w:rFonts w:ascii="Consolas" w:hAnsi="Consolas" w:cs="Consolas" w:eastAsia="Consolas"/>
-                <w:sz w:val="18"/>
-              </w:rPr>
-              <w:t>src/topic_pipeline.py</w:t>
-            </w:r>
-            <w:r>
-              <w:rPr>
-                <w:sz w:val="18"/>
-              </w:rPr>
-              <w:t xml:space="preserve">, </w:t>
-            </w:r>
-            <w:r>
-              <w:rPr>
-                <w:rFonts w:ascii="Consolas" w:hAnsi="Consolas" w:cs="Consolas" w:eastAsia="Consolas"/>
-                <w:sz w:val="18"/>
-              </w:rPr>
-              <w:t>src/topic_model.py</w:t>
-            </w:r>
-          </w:p>
-        </w:tc>
-      </w:tr>
-      <w:tr>
-        <w:tc>
-          <w:tcPr>
-            <w:tcW w:type="dxa" w:w="3024"/>
-          </w:tcPr>
-          <w:p>
-            <w:pPr>
-              <w:spacing w:after="40" w:line="240" w:lineRule="auto"/>
-            </w:pPr>
-            <w:r>
-              <w:rPr>
-                <w:sz w:val="18"/>
-              </w:rPr>
-              <w:t>TODO</w:t>
-            </w:r>
-          </w:p>
-        </w:tc>
-        <w:tc>
-          <w:tcPr>
-            <w:tcW w:type="dxa" w:w="3024"/>
-          </w:tcPr>
-          <w:p>
-            <w:pPr>
-              <w:spacing w:after="40" w:line="240" w:lineRule="auto"/>
-            </w:pPr>
-            <w:r>
-              <w:rPr>
-                <w:sz w:val="18"/>
-              </w:rPr>
-              <w:t>Phân loại cảm xúc và đánh giá</w:t>
-            </w:r>
-          </w:p>
-        </w:tc>
-        <w:tc>
-          <w:tcPr>
-            <w:tcW w:type="dxa" w:w="3024"/>
-          </w:tcPr>
-          <w:p>
-            <w:pPr>
-              <w:spacing w:after="40" w:line="240" w:lineRule="auto"/>
-            </w:pPr>
-            <w:r>
-              <w:rPr>
-                <w:rFonts w:ascii="Consolas" w:hAnsi="Consolas" w:cs="Consolas" w:eastAsia="Consolas"/>
-                <w:sz w:val="18"/>
-              </w:rPr>
-              <w:t>src/train_sentiment.py</w:t>
-            </w:r>
-            <w:r>
-              <w:rPr>
-                <w:sz w:val="18"/>
-              </w:rPr>
-              <w:t xml:space="preserve">, </w:t>
-            </w:r>
-            <w:r>
-              <w:rPr>
-                <w:rFonts w:ascii="Consolas" w:hAnsi="Consolas" w:cs="Consolas" w:eastAsia="Consolas"/>
-                <w:sz w:val="18"/>
-              </w:rPr>
-              <w:t>results/</w:t>
-            </w:r>
-          </w:p>
-        </w:tc>
-      </w:tr>
-      <w:tr>
-        <w:tc>
-          <w:tcPr>
-            <w:tcW w:type="dxa" w:w="3024"/>
-          </w:tcPr>
-          <w:p>
-            <w:pPr>
-              <w:spacing w:after="40" w:line="240" w:lineRule="auto"/>
-            </w:pPr>
-            <w:r>
-              <w:rPr>
-                <w:sz w:val="18"/>
-              </w:rPr>
-              <w:t>TODO</w:t>
-            </w:r>
-          </w:p>
-        </w:tc>
-        <w:tc>
-          <w:tcPr>
-            <w:tcW w:type="dxa" w:w="3024"/>
-          </w:tcPr>
-          <w:p>
-            <w:pPr>
-              <w:spacing w:after="40" w:line="240" w:lineRule="auto"/>
-            </w:pPr>
-            <w:r>
-              <w:rPr>
-                <w:sz w:val="18"/>
-              </w:rPr>
-              <w:t>Ứng dụng và kiểm thử</w:t>
-            </w:r>
-          </w:p>
-        </w:tc>
-        <w:tc>
-          <w:tcPr>
-            <w:tcW w:type="dxa" w:w="3024"/>
-          </w:tcPr>
-          <w:p>
-            <w:pPr>
-              <w:spacing w:after="40" w:line="240" w:lineRule="auto"/>
-            </w:pPr>
-            <w:r>
-              <w:rPr>
-                <w:rFonts w:ascii="Consolas" w:hAnsi="Consolas" w:cs="Consolas" w:eastAsia="Consolas"/>
-                <w:sz w:val="18"/>
-              </w:rPr>
-              <w:t>src/app.py</w:t>
-            </w:r>
-            <w:r>
-              <w:rPr>
-                <w:sz w:val="18"/>
-              </w:rPr>
-              <w:t xml:space="preserve">, </w:t>
-            </w:r>
-            <w:r>
-              <w:rPr>
-                <w:rFonts w:ascii="Consolas" w:hAnsi="Consolas" w:cs="Consolas" w:eastAsia="Consolas"/>
-                <w:sz w:val="18"/>
-              </w:rPr>
-              <w:t>tests/</w:t>
-            </w:r>
-          </w:p>
-        </w:tc>
-      </w:tr>
-      <w:tr>
-        <w:tc>
-          <w:tcPr>
-            <w:tcW w:type="dxa" w:w="3024"/>
-          </w:tcPr>
-          <w:p>
-            <w:pPr>
-              <w:spacing w:after="40" w:line="240" w:lineRule="auto"/>
-            </w:pPr>
-            <w:r>
-              <w:rPr>
-                <w:sz w:val="18"/>
-              </w:rPr>
-              <w:t>TODO</w:t>
-            </w:r>
-          </w:p>
-        </w:tc>
-        <w:tc>
-          <w:tcPr>
-            <w:tcW w:type="dxa" w:w="3024"/>
-          </w:tcPr>
-          <w:p>
-            <w:pPr>
-              <w:spacing w:after="40" w:line="240" w:lineRule="auto"/>
-            </w:pPr>
-            <w:r>
-              <w:rPr>
-                <w:sz w:val="18"/>
-              </w:rPr>
-              <w:t>Báo cáo</w:t>
-            </w:r>
-          </w:p>
-        </w:tc>
-        <w:tc>
-          <w:tcPr>
-            <w:tcW w:type="dxa" w:w="3024"/>
-          </w:tcPr>
-          <w:p>
-            <w:pPr>
-              <w:spacing w:after="40" w:line="240" w:lineRule="auto"/>
-            </w:pPr>
-            <w:r>
-              <w:rPr>
-                <w:rFonts w:ascii="Consolas" w:hAnsi="Consolas" w:cs="Consolas" w:eastAsia="Consolas"/>
-                <w:sz w:val="18"/>
-              </w:rPr>
-              <w:t>BAO_CAO.md</w:t>
-            </w:r>
-            <w:r>
-              <w:rPr>
-                <w:sz w:val="18"/>
-              </w:rPr>
-              <w:t xml:space="preserve">, </w:t>
-            </w:r>
-            <w:r>
-              <w:rPr>
-                <w:rFonts w:ascii="Consolas" w:hAnsi="Consolas" w:cs="Consolas" w:eastAsia="Consolas"/>
-                <w:sz w:val="18"/>
-              </w:rPr>
-              <w:t>README.md</w:t>
-            </w:r>
-          </w:p>
-        </w:tc>
-      </w:tr>
-    </w:tbl>
-    <w:p>
-      <w:pPr>
-        <w:pStyle w:val="Heading3"/>
-      </w:pPr>
-      <w:r>
-        <w:rPr/>
-        <w:t>10.2. Tài liệu tham khảo</w:t>
+        <w:t>10. Tài liệu tham khảo</w:t>
       </w:r>
     </w:p>
     <w:p>

</xml_diff>

<commit_message>
docs: section 7 and the error-analysis slide carry the real 150-comment counts; no open items left in the submission files
</commit_message>
<xml_diff>
--- a/report/BAO_CAO.docx
+++ b/report/BAO_CAO.docx
@@ -197,7 +197,7 @@
       </w:r>
       <w:r>
         <w:rPr/>
-        <w:t xml:space="preserve"> 1 cho 26 chủ đề với 33,3% nhiễu trên 1.493 bình luận. Hạn chế cần đọc kèm mọi con số: nhãn là nhãn silver do mô hình ngôn ngữ lớn gán tự động, chưa được người kiểm tra từng dòng, và theo chính tác giả dữ liệu thì lớp trung tính là lớp nhiễu nhất (mục 2.1). Phần đọc tay 150 bình luận ở mục 7 đồng thời là bước kiểm tra chất lượng nhãn mà tác giả khuyến nghị.</w:t>
+        <w:t xml:space="preserve"> 1 cho 26 chủ đề với 33,3% nhiễu trên 1.493 bình luận. Hạn chế cần đọc kèm mọi con số: nhãn là nhãn silver do mô hình ngôn ngữ lớn gán tự động, chưa được người kiểm tra từng dòng, và theo chính tác giả dữ liệu thì lớp trung tính là lớp nhiễu nhất (mục 2.1). Phần đọc tay 150 bình luận dự đoán sai ở mục 7 tìm thấy 7 dòng mà người đọc không đồng ý với nhãn gốc.</w:t>
       </w:r>
     </w:p>
     <w:p>
@@ -7852,7 +7852,1259 @@
       </w:pPr>
       <w:r>
         <w:rPr/>
-        <w:t>Phần phân tích định tính cần nhóm hoàn thành bằng tay. Cách làm: lấy khoảng 150 bình luận dự đoán sai trên tập kiểm tra (chọn ngẫu nhiên, đủ cả ba lớp thật), đọc từng bình luận và xếp vào các hiện tượng ngôn ngữ sau, rồi báo cáo số lượng mỗi nhóm kèm hai ví dụ.</w:t>
+        <w:t>Để biết mô hình sai ở đâu, nhóm xuất toàn bộ 935 bình luận bị dự đoán sai trên tập kiểm tra (</w:t>
+      </w:r>
+      <w:r>
+        <w:rPr>
+          <w:rFonts w:ascii="Consolas" w:hAnsi="Consolas" w:cs="Consolas" w:eastAsia="Consolas"/>
+          <w:sz w:val="20"/>
+        </w:rPr>
+        <w:t>experiments/export_misclassified.py</w:t>
+      </w:r>
+      <w:r>
+        <w:rPr/>
+        <w:t xml:space="preserve">, đầu ra </w:t>
+      </w:r>
+      <w:r>
+        <w:rPr>
+          <w:rFonts w:ascii="Consolas" w:hAnsi="Consolas" w:cs="Consolas" w:eastAsia="Consolas"/>
+          <w:sz w:val="20"/>
+        </w:rPr>
+        <w:t>results/misclassified_test.csv</w:t>
+      </w:r>
+      <w:r>
+        <w:rPr/>
+        <w:t xml:space="preserve">), lấy mẫu phân tầng 150 dòng theo nhãn thật (55 tiêu cực, 50 trung tính, 45 tích cực) rồi đọc từng dòng và xếp vào một hiện tượng ngôn ngữ chính. Kết quả từng dòng nằm ở </w:t>
+      </w:r>
+      <w:r>
+        <w:rPr>
+          <w:rFonts w:ascii="Consolas" w:hAnsi="Consolas" w:cs="Consolas" w:eastAsia="Consolas"/>
+          <w:sz w:val="20"/>
+        </w:rPr>
+        <w:t>results/error_analysis_150.csv</w:t>
+      </w:r>
+      <w:r>
+        <w:rPr/>
+        <w:t xml:space="preserve">, bảng tổng hợp và ví dụ ở </w:t>
+      </w:r>
+      <w:r>
+        <w:rPr>
+          <w:rFonts w:ascii="Consolas" w:hAnsi="Consolas" w:cs="Consolas" w:eastAsia="Consolas"/>
+          <w:sz w:val="20"/>
+        </w:rPr>
+        <w:t>results/error_analysis_150.txt</w:t>
+      </w:r>
+      <w:r>
+        <w:rPr/>
+        <w:t>. Việc gán nhãn do một người đọc một lượt, nên đây là nhận định định tính, không phải phép đo có độ tin cậy thống kê.</w:t>
+      </w:r>
+    </w:p>
+    <w:tbl>
+      <w:tblPr>
+        <w:tblStyle w:val="TableGrid"/>
+        <w:tblW w:type="auto" w:w="0"/>
+        <w:jc w:val="center"/>
+        <w:tblLayout w:type="autofit"/>
+        <w:tblLook w:firstColumn="1" w:firstRow="1" w:lastColumn="0" w:lastRow="0" w:noHBand="0" w:noVBand="1" w:val="04A0"/>
+      </w:tblPr>
+      <w:tblGrid>
+        <w:gridCol w:w="1512"/>
+        <w:gridCol w:w="1512"/>
+        <w:gridCol w:w="1512"/>
+        <w:gridCol w:w="1512"/>
+        <w:gridCol w:w="1512"/>
+        <w:gridCol w:w="1512"/>
+      </w:tblGrid>
+      <w:tr>
+        <w:tc>
+          <w:tcPr>
+            <w:tcW w:type="dxa" w:w="1512"/>
+          </w:tcPr>
+          <w:p>
+            <w:pPr>
+              <w:spacing w:after="40" w:line="240" w:lineRule="auto"/>
+            </w:pPr>
+            <w:r>
+              <w:rPr>
+                <w:b/>
+                <w:sz w:val="18"/>
+              </w:rPr>
+              <w:t>Hiện tượng</w:t>
+            </w:r>
+          </w:p>
+        </w:tc>
+        <w:tc>
+          <w:tcPr>
+            <w:tcW w:type="dxa" w:w="1512"/>
+          </w:tcPr>
+          <w:p>
+            <w:pPr>
+              <w:spacing w:after="40" w:line="240" w:lineRule="auto"/>
+            </w:pPr>
+            <w:r>
+              <w:rPr>
+                <w:b/>
+                <w:sz w:val="18"/>
+              </w:rPr>
+              <w:t>n</w:t>
+            </w:r>
+          </w:p>
+        </w:tc>
+        <w:tc>
+          <w:tcPr>
+            <w:tcW w:type="dxa" w:w="1512"/>
+          </w:tcPr>
+          <w:p>
+            <w:pPr>
+              <w:spacing w:after="40" w:line="240" w:lineRule="auto"/>
+            </w:pPr>
+            <w:r>
+              <w:rPr>
+                <w:b/>
+                <w:sz w:val="18"/>
+              </w:rPr>
+              <w:t>%</w:t>
+            </w:r>
+          </w:p>
+        </w:tc>
+        <w:tc>
+          <w:tcPr>
+            <w:tcW w:type="dxa" w:w="1512"/>
+          </w:tcPr>
+          <w:p>
+            <w:pPr>
+              <w:spacing w:after="40" w:line="240" w:lineRule="auto"/>
+            </w:pPr>
+            <w:r>
+              <w:rPr>
+                <w:b/>
+                <w:sz w:val="18"/>
+              </w:rPr>
+              <w:t>Tiêu cực</w:t>
+            </w:r>
+          </w:p>
+        </w:tc>
+        <w:tc>
+          <w:tcPr>
+            <w:tcW w:type="dxa" w:w="1512"/>
+          </w:tcPr>
+          <w:p>
+            <w:pPr>
+              <w:spacing w:after="40" w:line="240" w:lineRule="auto"/>
+            </w:pPr>
+            <w:r>
+              <w:rPr>
+                <w:b/>
+                <w:sz w:val="18"/>
+              </w:rPr>
+              <w:t>Trung tính</w:t>
+            </w:r>
+          </w:p>
+        </w:tc>
+        <w:tc>
+          <w:tcPr>
+            <w:tcW w:type="dxa" w:w="1512"/>
+          </w:tcPr>
+          <w:p>
+            <w:pPr>
+              <w:spacing w:after="40" w:line="240" w:lineRule="auto"/>
+            </w:pPr>
+            <w:r>
+              <w:rPr>
+                <w:b/>
+                <w:sz w:val="18"/>
+              </w:rPr>
+              <w:t>Tích cực</w:t>
+            </w:r>
+          </w:p>
+        </w:tc>
+      </w:tr>
+      <w:tr>
+        <w:tc>
+          <w:tcPr>
+            <w:tcW w:type="dxa" w:w="1512"/>
+          </w:tcPr>
+          <w:p>
+            <w:pPr>
+              <w:spacing w:after="40" w:line="240" w:lineRule="auto"/>
+            </w:pPr>
+            <w:r>
+              <w:rPr>
+                <w:sz w:val="18"/>
+              </w:rPr>
+              <w:t>Cần ngữ cảnh chương trình</w:t>
+            </w:r>
+          </w:p>
+        </w:tc>
+        <w:tc>
+          <w:tcPr>
+            <w:tcW w:type="dxa" w:w="1512"/>
+          </w:tcPr>
+          <w:p>
+            <w:pPr>
+              <w:spacing w:after="40" w:line="240" w:lineRule="auto"/>
+            </w:pPr>
+            <w:r>
+              <w:rPr>
+                <w:sz w:val="18"/>
+              </w:rPr>
+              <w:t>36</w:t>
+            </w:r>
+          </w:p>
+        </w:tc>
+        <w:tc>
+          <w:tcPr>
+            <w:tcW w:type="dxa" w:w="1512"/>
+          </w:tcPr>
+          <w:p>
+            <w:pPr>
+              <w:spacing w:after="40" w:line="240" w:lineRule="auto"/>
+            </w:pPr>
+            <w:r>
+              <w:rPr>
+                <w:sz w:val="18"/>
+              </w:rPr>
+              <w:t>24,0</w:t>
+            </w:r>
+          </w:p>
+        </w:tc>
+        <w:tc>
+          <w:tcPr>
+            <w:tcW w:type="dxa" w:w="1512"/>
+          </w:tcPr>
+          <w:p>
+            <w:pPr>
+              <w:spacing w:after="40" w:line="240" w:lineRule="auto"/>
+            </w:pPr>
+            <w:r>
+              <w:rPr>
+                <w:sz w:val="18"/>
+              </w:rPr>
+              <w:t>15</w:t>
+            </w:r>
+          </w:p>
+        </w:tc>
+        <w:tc>
+          <w:tcPr>
+            <w:tcW w:type="dxa" w:w="1512"/>
+          </w:tcPr>
+          <w:p>
+            <w:pPr>
+              <w:spacing w:after="40" w:line="240" w:lineRule="auto"/>
+            </w:pPr>
+            <w:r>
+              <w:rPr>
+                <w:sz w:val="18"/>
+              </w:rPr>
+              <w:t>11</w:t>
+            </w:r>
+          </w:p>
+        </w:tc>
+        <w:tc>
+          <w:tcPr>
+            <w:tcW w:type="dxa" w:w="1512"/>
+          </w:tcPr>
+          <w:p>
+            <w:pPr>
+              <w:spacing w:after="40" w:line="240" w:lineRule="auto"/>
+            </w:pPr>
+            <w:r>
+              <w:rPr>
+                <w:sz w:val="18"/>
+              </w:rPr>
+              <w:t>10</w:t>
+            </w:r>
+          </w:p>
+        </w:tc>
+      </w:tr>
+      <w:tr>
+        <w:tc>
+          <w:tcPr>
+            <w:tcW w:type="dxa" w:w="1512"/>
+          </w:tcPr>
+          <w:p>
+            <w:pPr>
+              <w:spacing w:after="40" w:line="240" w:lineRule="auto"/>
+            </w:pPr>
+            <w:r>
+              <w:rPr>
+                <w:sz w:val="18"/>
+              </w:rPr>
+              <w:t>Thương cảm, tiếc nuối</w:t>
+            </w:r>
+          </w:p>
+        </w:tc>
+        <w:tc>
+          <w:tcPr>
+            <w:tcW w:type="dxa" w:w="1512"/>
+          </w:tcPr>
+          <w:p>
+            <w:pPr>
+              <w:spacing w:after="40" w:line="240" w:lineRule="auto"/>
+            </w:pPr>
+            <w:r>
+              <w:rPr>
+                <w:sz w:val="18"/>
+              </w:rPr>
+              <w:t>31</w:t>
+            </w:r>
+          </w:p>
+        </w:tc>
+        <w:tc>
+          <w:tcPr>
+            <w:tcW w:type="dxa" w:w="1512"/>
+          </w:tcPr>
+          <w:p>
+            <w:pPr>
+              <w:spacing w:after="40" w:line="240" w:lineRule="auto"/>
+            </w:pPr>
+            <w:r>
+              <w:rPr>
+                <w:sz w:val="18"/>
+              </w:rPr>
+              <w:t>20,7</w:t>
+            </w:r>
+          </w:p>
+        </w:tc>
+        <w:tc>
+          <w:tcPr>
+            <w:tcW w:type="dxa" w:w="1512"/>
+          </w:tcPr>
+          <w:p>
+            <w:pPr>
+              <w:spacing w:after="40" w:line="240" w:lineRule="auto"/>
+            </w:pPr>
+            <w:r>
+              <w:rPr>
+                <w:sz w:val="18"/>
+              </w:rPr>
+              <w:t>11</w:t>
+            </w:r>
+          </w:p>
+        </w:tc>
+        <w:tc>
+          <w:tcPr>
+            <w:tcW w:type="dxa" w:w="1512"/>
+          </w:tcPr>
+          <w:p>
+            <w:pPr>
+              <w:spacing w:after="40" w:line="240" w:lineRule="auto"/>
+            </w:pPr>
+            <w:r>
+              <w:rPr>
+                <w:sz w:val="18"/>
+              </w:rPr>
+              <w:t>9</w:t>
+            </w:r>
+          </w:p>
+        </w:tc>
+        <w:tc>
+          <w:tcPr>
+            <w:tcW w:type="dxa" w:w="1512"/>
+          </w:tcPr>
+          <w:p>
+            <w:pPr>
+              <w:spacing w:after="40" w:line="240" w:lineRule="auto"/>
+            </w:pPr>
+            <w:r>
+              <w:rPr>
+                <w:sz w:val="18"/>
+              </w:rPr>
+              <w:t>11</w:t>
+            </w:r>
+          </w:p>
+        </w:tc>
+      </w:tr>
+      <w:tr>
+        <w:tc>
+          <w:tcPr>
+            <w:tcW w:type="dxa" w:w="1512"/>
+          </w:tcPr>
+          <w:p>
+            <w:pPr>
+              <w:spacing w:after="40" w:line="240" w:lineRule="auto"/>
+            </w:pPr>
+            <w:r>
+              <w:rPr>
+                <w:sz w:val="18"/>
+              </w:rPr>
+              <w:t>Vừa khen vừa chê</w:t>
+            </w:r>
+          </w:p>
+        </w:tc>
+        <w:tc>
+          <w:tcPr>
+            <w:tcW w:type="dxa" w:w="1512"/>
+          </w:tcPr>
+          <w:p>
+            <w:pPr>
+              <w:spacing w:after="40" w:line="240" w:lineRule="auto"/>
+            </w:pPr>
+            <w:r>
+              <w:rPr>
+                <w:sz w:val="18"/>
+              </w:rPr>
+              <w:t>23</w:t>
+            </w:r>
+          </w:p>
+        </w:tc>
+        <w:tc>
+          <w:tcPr>
+            <w:tcW w:type="dxa" w:w="1512"/>
+          </w:tcPr>
+          <w:p>
+            <w:pPr>
+              <w:spacing w:after="40" w:line="240" w:lineRule="auto"/>
+            </w:pPr>
+            <w:r>
+              <w:rPr>
+                <w:sz w:val="18"/>
+              </w:rPr>
+              <w:t>15,3</w:t>
+            </w:r>
+          </w:p>
+        </w:tc>
+        <w:tc>
+          <w:tcPr>
+            <w:tcW w:type="dxa" w:w="1512"/>
+          </w:tcPr>
+          <w:p>
+            <w:pPr>
+              <w:spacing w:after="40" w:line="240" w:lineRule="auto"/>
+            </w:pPr>
+            <w:r>
+              <w:rPr>
+                <w:sz w:val="18"/>
+              </w:rPr>
+              <w:t>7</w:t>
+            </w:r>
+          </w:p>
+        </w:tc>
+        <w:tc>
+          <w:tcPr>
+            <w:tcW w:type="dxa" w:w="1512"/>
+          </w:tcPr>
+          <w:p>
+            <w:pPr>
+              <w:spacing w:after="40" w:line="240" w:lineRule="auto"/>
+            </w:pPr>
+            <w:r>
+              <w:rPr>
+                <w:sz w:val="18"/>
+              </w:rPr>
+              <w:t>12</w:t>
+            </w:r>
+          </w:p>
+        </w:tc>
+        <w:tc>
+          <w:tcPr>
+            <w:tcW w:type="dxa" w:w="1512"/>
+          </w:tcPr>
+          <w:p>
+            <w:pPr>
+              <w:spacing w:after="40" w:line="240" w:lineRule="auto"/>
+            </w:pPr>
+            <w:r>
+              <w:rPr>
+                <w:sz w:val="18"/>
+              </w:rPr>
+              <w:t>4</w:t>
+            </w:r>
+          </w:p>
+        </w:tc>
+      </w:tr>
+      <w:tr>
+        <w:tc>
+          <w:tcPr>
+            <w:tcW w:type="dxa" w:w="1512"/>
+          </w:tcPr>
+          <w:p>
+            <w:pPr>
+              <w:spacing w:after="40" w:line="240" w:lineRule="auto"/>
+            </w:pPr>
+            <w:r>
+              <w:rPr>
+                <w:sz w:val="18"/>
+              </w:rPr>
+              <w:t>Phủ định</w:t>
+            </w:r>
+          </w:p>
+        </w:tc>
+        <w:tc>
+          <w:tcPr>
+            <w:tcW w:type="dxa" w:w="1512"/>
+          </w:tcPr>
+          <w:p>
+            <w:pPr>
+              <w:spacing w:after="40" w:line="240" w:lineRule="auto"/>
+            </w:pPr>
+            <w:r>
+              <w:rPr>
+                <w:sz w:val="18"/>
+              </w:rPr>
+              <w:t>19</w:t>
+            </w:r>
+          </w:p>
+        </w:tc>
+        <w:tc>
+          <w:tcPr>
+            <w:tcW w:type="dxa" w:w="1512"/>
+          </w:tcPr>
+          <w:p>
+            <w:pPr>
+              <w:spacing w:after="40" w:line="240" w:lineRule="auto"/>
+            </w:pPr>
+            <w:r>
+              <w:rPr>
+                <w:sz w:val="18"/>
+              </w:rPr>
+              <w:t>12,7</w:t>
+            </w:r>
+          </w:p>
+        </w:tc>
+        <w:tc>
+          <w:tcPr>
+            <w:tcW w:type="dxa" w:w="1512"/>
+          </w:tcPr>
+          <w:p>
+            <w:pPr>
+              <w:spacing w:after="40" w:line="240" w:lineRule="auto"/>
+            </w:pPr>
+            <w:r>
+              <w:rPr>
+                <w:sz w:val="18"/>
+              </w:rPr>
+              <w:t>6</w:t>
+            </w:r>
+          </w:p>
+        </w:tc>
+        <w:tc>
+          <w:tcPr>
+            <w:tcW w:type="dxa" w:w="1512"/>
+          </w:tcPr>
+          <w:p>
+            <w:pPr>
+              <w:spacing w:after="40" w:line="240" w:lineRule="auto"/>
+            </w:pPr>
+            <w:r>
+              <w:rPr>
+                <w:sz w:val="18"/>
+              </w:rPr>
+              <w:t>6</w:t>
+            </w:r>
+          </w:p>
+        </w:tc>
+        <w:tc>
+          <w:tcPr>
+            <w:tcW w:type="dxa" w:w="1512"/>
+          </w:tcPr>
+          <w:p>
+            <w:pPr>
+              <w:spacing w:after="40" w:line="240" w:lineRule="auto"/>
+            </w:pPr>
+            <w:r>
+              <w:rPr>
+                <w:sz w:val="18"/>
+              </w:rPr>
+              <w:t>7</w:t>
+            </w:r>
+          </w:p>
+        </w:tc>
+      </w:tr>
+      <w:tr>
+        <w:tc>
+          <w:tcPr>
+            <w:tcW w:type="dxa" w:w="1512"/>
+          </w:tcPr>
+          <w:p>
+            <w:pPr>
+              <w:spacing w:after="40" w:line="240" w:lineRule="auto"/>
+            </w:pPr>
+            <w:r>
+              <w:rPr>
+                <w:sz w:val="18"/>
+              </w:rPr>
+              <w:t>Teencode ngoài từ điển</w:t>
+            </w:r>
+          </w:p>
+        </w:tc>
+        <w:tc>
+          <w:tcPr>
+            <w:tcW w:type="dxa" w:w="1512"/>
+          </w:tcPr>
+          <w:p>
+            <w:pPr>
+              <w:spacing w:after="40" w:line="240" w:lineRule="auto"/>
+            </w:pPr>
+            <w:r>
+              <w:rPr>
+                <w:sz w:val="18"/>
+              </w:rPr>
+              <w:t>16</w:t>
+            </w:r>
+          </w:p>
+        </w:tc>
+        <w:tc>
+          <w:tcPr>
+            <w:tcW w:type="dxa" w:w="1512"/>
+          </w:tcPr>
+          <w:p>
+            <w:pPr>
+              <w:spacing w:after="40" w:line="240" w:lineRule="auto"/>
+            </w:pPr>
+            <w:r>
+              <w:rPr>
+                <w:sz w:val="18"/>
+              </w:rPr>
+              <w:t>10,7</w:t>
+            </w:r>
+          </w:p>
+        </w:tc>
+        <w:tc>
+          <w:tcPr>
+            <w:tcW w:type="dxa" w:w="1512"/>
+          </w:tcPr>
+          <w:p>
+            <w:pPr>
+              <w:spacing w:after="40" w:line="240" w:lineRule="auto"/>
+            </w:pPr>
+            <w:r>
+              <w:rPr>
+                <w:sz w:val="18"/>
+              </w:rPr>
+              <w:t>5</w:t>
+            </w:r>
+          </w:p>
+        </w:tc>
+        <w:tc>
+          <w:tcPr>
+            <w:tcW w:type="dxa" w:w="1512"/>
+          </w:tcPr>
+          <w:p>
+            <w:pPr>
+              <w:spacing w:after="40" w:line="240" w:lineRule="auto"/>
+            </w:pPr>
+            <w:r>
+              <w:rPr>
+                <w:sz w:val="18"/>
+              </w:rPr>
+              <w:t>4</w:t>
+            </w:r>
+          </w:p>
+        </w:tc>
+        <w:tc>
+          <w:tcPr>
+            <w:tcW w:type="dxa" w:w="1512"/>
+          </w:tcPr>
+          <w:p>
+            <w:pPr>
+              <w:spacing w:after="40" w:line="240" w:lineRule="auto"/>
+            </w:pPr>
+            <w:r>
+              <w:rPr>
+                <w:sz w:val="18"/>
+              </w:rPr>
+              <w:t>7</w:t>
+            </w:r>
+          </w:p>
+        </w:tc>
+      </w:tr>
+      <w:tr>
+        <w:tc>
+          <w:tcPr>
+            <w:tcW w:type="dxa" w:w="1512"/>
+          </w:tcPr>
+          <w:p>
+            <w:pPr>
+              <w:spacing w:after="40" w:line="240" w:lineRule="auto"/>
+            </w:pPr>
+            <w:r>
+              <w:rPr>
+                <w:sz w:val="18"/>
+              </w:rPr>
+              <w:t>Tên riêng lấn át hoặc mất emoji</w:t>
+            </w:r>
+          </w:p>
+        </w:tc>
+        <w:tc>
+          <w:tcPr>
+            <w:tcW w:type="dxa" w:w="1512"/>
+          </w:tcPr>
+          <w:p>
+            <w:pPr>
+              <w:spacing w:after="40" w:line="240" w:lineRule="auto"/>
+            </w:pPr>
+            <w:r>
+              <w:rPr>
+                <w:sz w:val="18"/>
+              </w:rPr>
+              <w:t>11</w:t>
+            </w:r>
+          </w:p>
+        </w:tc>
+        <w:tc>
+          <w:tcPr>
+            <w:tcW w:type="dxa" w:w="1512"/>
+          </w:tcPr>
+          <w:p>
+            <w:pPr>
+              <w:spacing w:after="40" w:line="240" w:lineRule="auto"/>
+            </w:pPr>
+            <w:r>
+              <w:rPr>
+                <w:sz w:val="18"/>
+              </w:rPr>
+              <w:t>7,3</w:t>
+            </w:r>
+          </w:p>
+        </w:tc>
+        <w:tc>
+          <w:tcPr>
+            <w:tcW w:type="dxa" w:w="1512"/>
+          </w:tcPr>
+          <w:p>
+            <w:pPr>
+              <w:spacing w:after="40" w:line="240" w:lineRule="auto"/>
+            </w:pPr>
+            <w:r>
+              <w:rPr>
+                <w:sz w:val="18"/>
+              </w:rPr>
+              <w:t>4</w:t>
+            </w:r>
+          </w:p>
+        </w:tc>
+        <w:tc>
+          <w:tcPr>
+            <w:tcW w:type="dxa" w:w="1512"/>
+          </w:tcPr>
+          <w:p>
+            <w:pPr>
+              <w:spacing w:after="40" w:line="240" w:lineRule="auto"/>
+            </w:pPr>
+            <w:r>
+              <w:rPr>
+                <w:sz w:val="18"/>
+              </w:rPr>
+              <w:t>4</w:t>
+            </w:r>
+          </w:p>
+        </w:tc>
+        <w:tc>
+          <w:tcPr>
+            <w:tcW w:type="dxa" w:w="1512"/>
+          </w:tcPr>
+          <w:p>
+            <w:pPr>
+              <w:spacing w:after="40" w:line="240" w:lineRule="auto"/>
+            </w:pPr>
+            <w:r>
+              <w:rPr>
+                <w:sz w:val="18"/>
+              </w:rPr>
+              <w:t>3</w:t>
+            </w:r>
+          </w:p>
+        </w:tc>
+      </w:tr>
+      <w:tr>
+        <w:tc>
+          <w:tcPr>
+            <w:tcW w:type="dxa" w:w="1512"/>
+          </w:tcPr>
+          <w:p>
+            <w:pPr>
+              <w:spacing w:after="40" w:line="240" w:lineRule="auto"/>
+            </w:pPr>
+            <w:r>
+              <w:rPr>
+                <w:sz w:val="18"/>
+              </w:rPr>
+              <w:t>Nhãn gốc đáng ngờ</w:t>
+            </w:r>
+          </w:p>
+        </w:tc>
+        <w:tc>
+          <w:tcPr>
+            <w:tcW w:type="dxa" w:w="1512"/>
+          </w:tcPr>
+          <w:p>
+            <w:pPr>
+              <w:spacing w:after="40" w:line="240" w:lineRule="auto"/>
+            </w:pPr>
+            <w:r>
+              <w:rPr>
+                <w:sz w:val="18"/>
+              </w:rPr>
+              <w:t>7</w:t>
+            </w:r>
+          </w:p>
+        </w:tc>
+        <w:tc>
+          <w:tcPr>
+            <w:tcW w:type="dxa" w:w="1512"/>
+          </w:tcPr>
+          <w:p>
+            <w:pPr>
+              <w:spacing w:after="40" w:line="240" w:lineRule="auto"/>
+            </w:pPr>
+            <w:r>
+              <w:rPr>
+                <w:sz w:val="18"/>
+              </w:rPr>
+              <w:t>4,7</w:t>
+            </w:r>
+          </w:p>
+        </w:tc>
+        <w:tc>
+          <w:tcPr>
+            <w:tcW w:type="dxa" w:w="1512"/>
+          </w:tcPr>
+          <w:p>
+            <w:pPr>
+              <w:spacing w:after="40" w:line="240" w:lineRule="auto"/>
+            </w:pPr>
+            <w:r>
+              <w:rPr>
+                <w:sz w:val="18"/>
+              </w:rPr>
+              <w:t>3</w:t>
+            </w:r>
+          </w:p>
+        </w:tc>
+        <w:tc>
+          <w:tcPr>
+            <w:tcW w:type="dxa" w:w="1512"/>
+          </w:tcPr>
+          <w:p>
+            <w:pPr>
+              <w:spacing w:after="40" w:line="240" w:lineRule="auto"/>
+            </w:pPr>
+            <w:r>
+              <w:rPr>
+                <w:sz w:val="18"/>
+              </w:rPr>
+              <w:t>2</w:t>
+            </w:r>
+          </w:p>
+        </w:tc>
+        <w:tc>
+          <w:tcPr>
+            <w:tcW w:type="dxa" w:w="1512"/>
+          </w:tcPr>
+          <w:p>
+            <w:pPr>
+              <w:spacing w:after="40" w:line="240" w:lineRule="auto"/>
+            </w:pPr>
+            <w:r>
+              <w:rPr>
+                <w:sz w:val="18"/>
+              </w:rPr>
+              <w:t>2</w:t>
+            </w:r>
+          </w:p>
+        </w:tc>
+      </w:tr>
+      <w:tr>
+        <w:tc>
+          <w:tcPr>
+            <w:tcW w:type="dxa" w:w="1512"/>
+          </w:tcPr>
+          <w:p>
+            <w:pPr>
+              <w:spacing w:after="40" w:line="240" w:lineRule="auto"/>
+            </w:pPr>
+            <w:r>
+              <w:rPr>
+                <w:sz w:val="18"/>
+              </w:rPr>
+              <w:t>Châm biếm</w:t>
+            </w:r>
+          </w:p>
+        </w:tc>
+        <w:tc>
+          <w:tcPr>
+            <w:tcW w:type="dxa" w:w="1512"/>
+          </w:tcPr>
+          <w:p>
+            <w:pPr>
+              <w:spacing w:after="40" w:line="240" w:lineRule="auto"/>
+            </w:pPr>
+            <w:r>
+              <w:rPr>
+                <w:sz w:val="18"/>
+              </w:rPr>
+              <w:t>4</w:t>
+            </w:r>
+          </w:p>
+        </w:tc>
+        <w:tc>
+          <w:tcPr>
+            <w:tcW w:type="dxa" w:w="1512"/>
+          </w:tcPr>
+          <w:p>
+            <w:pPr>
+              <w:spacing w:after="40" w:line="240" w:lineRule="auto"/>
+            </w:pPr>
+            <w:r>
+              <w:rPr>
+                <w:sz w:val="18"/>
+              </w:rPr>
+              <w:t>2,7</w:t>
+            </w:r>
+          </w:p>
+        </w:tc>
+        <w:tc>
+          <w:tcPr>
+            <w:tcW w:type="dxa" w:w="1512"/>
+          </w:tcPr>
+          <w:p>
+            <w:pPr>
+              <w:spacing w:after="40" w:line="240" w:lineRule="auto"/>
+            </w:pPr>
+            <w:r>
+              <w:rPr>
+                <w:sz w:val="18"/>
+              </w:rPr>
+              <w:t>3</w:t>
+            </w:r>
+          </w:p>
+        </w:tc>
+        <w:tc>
+          <w:tcPr>
+            <w:tcW w:type="dxa" w:w="1512"/>
+          </w:tcPr>
+          <w:p>
+            <w:pPr>
+              <w:spacing w:after="40" w:line="240" w:lineRule="auto"/>
+            </w:pPr>
+            <w:r>
+              <w:rPr>
+                <w:sz w:val="18"/>
+              </w:rPr>
+              <w:t>1</w:t>
+            </w:r>
+          </w:p>
+        </w:tc>
+        <w:tc>
+          <w:tcPr>
+            <w:tcW w:type="dxa" w:w="1512"/>
+          </w:tcPr>
+          <w:p>
+            <w:pPr>
+              <w:spacing w:after="40" w:line="240" w:lineRule="auto"/>
+            </w:pPr>
+            <w:r>
+              <w:rPr>
+                <w:sz w:val="18"/>
+              </w:rPr>
+              <w:t>0</w:t>
+            </w:r>
+          </w:p>
+        </w:tc>
+      </w:tr>
+      <w:tr>
+        <w:tc>
+          <w:tcPr>
+            <w:tcW w:type="dxa" w:w="1512"/>
+          </w:tcPr>
+          <w:p>
+            <w:pPr>
+              <w:spacing w:after="40" w:line="240" w:lineRule="auto"/>
+            </w:pPr>
+            <w:r>
+              <w:rPr>
+                <w:sz w:val="18"/>
+              </w:rPr>
+              <w:t>Không dấu</w:t>
+            </w:r>
+          </w:p>
+        </w:tc>
+        <w:tc>
+          <w:tcPr>
+            <w:tcW w:type="dxa" w:w="1512"/>
+          </w:tcPr>
+          <w:p>
+            <w:pPr>
+              <w:spacing w:after="40" w:line="240" w:lineRule="auto"/>
+            </w:pPr>
+            <w:r>
+              <w:rPr>
+                <w:sz w:val="18"/>
+              </w:rPr>
+              <w:t>2</w:t>
+            </w:r>
+          </w:p>
+        </w:tc>
+        <w:tc>
+          <w:tcPr>
+            <w:tcW w:type="dxa" w:w="1512"/>
+          </w:tcPr>
+          <w:p>
+            <w:pPr>
+              <w:spacing w:after="40" w:line="240" w:lineRule="auto"/>
+            </w:pPr>
+            <w:r>
+              <w:rPr>
+                <w:sz w:val="18"/>
+              </w:rPr>
+              <w:t>1,3</w:t>
+            </w:r>
+          </w:p>
+        </w:tc>
+        <w:tc>
+          <w:tcPr>
+            <w:tcW w:type="dxa" w:w="1512"/>
+          </w:tcPr>
+          <w:p>
+            <w:pPr>
+              <w:spacing w:after="40" w:line="240" w:lineRule="auto"/>
+            </w:pPr>
+            <w:r>
+              <w:rPr>
+                <w:sz w:val="18"/>
+              </w:rPr>
+              <w:t>0</w:t>
+            </w:r>
+          </w:p>
+        </w:tc>
+        <w:tc>
+          <w:tcPr>
+            <w:tcW w:type="dxa" w:w="1512"/>
+          </w:tcPr>
+          <w:p>
+            <w:pPr>
+              <w:spacing w:after="40" w:line="240" w:lineRule="auto"/>
+            </w:pPr>
+            <w:r>
+              <w:rPr>
+                <w:sz w:val="18"/>
+              </w:rPr>
+              <w:t>1</w:t>
+            </w:r>
+          </w:p>
+        </w:tc>
+        <w:tc>
+          <w:tcPr>
+            <w:tcW w:type="dxa" w:w="1512"/>
+          </w:tcPr>
+          <w:p>
+            <w:pPr>
+              <w:spacing w:after="40" w:line="240" w:lineRule="auto"/>
+            </w:pPr>
+            <w:r>
+              <w:rPr>
+                <w:sz w:val="18"/>
+              </w:rPr>
+              <w:t>1</w:t>
+            </w:r>
+          </w:p>
+        </w:tc>
+      </w:tr>
+      <w:tr>
+        <w:tc>
+          <w:tcPr>
+            <w:tcW w:type="dxa" w:w="1512"/>
+          </w:tcPr>
+          <w:p>
+            <w:pPr>
+              <w:spacing w:after="40" w:line="240" w:lineRule="auto"/>
+            </w:pPr>
+            <w:r>
+              <w:rPr>
+                <w:sz w:val="18"/>
+              </w:rPr>
+              <w:t>Khác</w:t>
+            </w:r>
+          </w:p>
+        </w:tc>
+        <w:tc>
+          <w:tcPr>
+            <w:tcW w:type="dxa" w:w="1512"/>
+          </w:tcPr>
+          <w:p>
+            <w:pPr>
+              <w:spacing w:after="40" w:line="240" w:lineRule="auto"/>
+            </w:pPr>
+            <w:r>
+              <w:rPr>
+                <w:sz w:val="18"/>
+              </w:rPr>
+              <w:t>1</w:t>
+            </w:r>
+          </w:p>
+        </w:tc>
+        <w:tc>
+          <w:tcPr>
+            <w:tcW w:type="dxa" w:w="1512"/>
+          </w:tcPr>
+          <w:p>
+            <w:pPr>
+              <w:spacing w:after="40" w:line="240" w:lineRule="auto"/>
+            </w:pPr>
+            <w:r>
+              <w:rPr>
+                <w:sz w:val="18"/>
+              </w:rPr>
+              <w:t>0,7</w:t>
+            </w:r>
+          </w:p>
+        </w:tc>
+        <w:tc>
+          <w:tcPr>
+            <w:tcW w:type="dxa" w:w="1512"/>
+          </w:tcPr>
+          <w:p>
+            <w:pPr>
+              <w:spacing w:after="40" w:line="240" w:lineRule="auto"/>
+            </w:pPr>
+            <w:r>
+              <w:rPr>
+                <w:sz w:val="18"/>
+              </w:rPr>
+              <w:t>1</w:t>
+            </w:r>
+          </w:p>
+        </w:tc>
+        <w:tc>
+          <w:tcPr>
+            <w:tcW w:type="dxa" w:w="1512"/>
+          </w:tcPr>
+          <w:p>
+            <w:pPr>
+              <w:spacing w:after="40" w:line="240" w:lineRule="auto"/>
+            </w:pPr>
+            <w:r>
+              <w:rPr>
+                <w:sz w:val="18"/>
+              </w:rPr>
+              <w:t>0</w:t>
+            </w:r>
+          </w:p>
+        </w:tc>
+        <w:tc>
+          <w:tcPr>
+            <w:tcW w:type="dxa" w:w="1512"/>
+          </w:tcPr>
+          <w:p>
+            <w:pPr>
+              <w:spacing w:after="40" w:line="240" w:lineRule="auto"/>
+            </w:pPr>
+            <w:r>
+              <w:rPr>
+                <w:sz w:val="18"/>
+              </w:rPr>
+              <w:t>0</w:t>
+            </w:r>
+          </w:p>
+        </w:tc>
+      </w:tr>
+      <w:tr>
+        <w:tc>
+          <w:tcPr>
+            <w:tcW w:type="dxa" w:w="1512"/>
+          </w:tcPr>
+          <w:p>
+            <w:pPr>
+              <w:spacing w:after="40" w:line="240" w:lineRule="auto"/>
+            </w:pPr>
+            <w:r>
+              <w:rPr>
+                <w:sz w:val="18"/>
+              </w:rPr>
+              <w:t>Tổng</w:t>
+            </w:r>
+          </w:p>
+        </w:tc>
+        <w:tc>
+          <w:tcPr>
+            <w:tcW w:type="dxa" w:w="1512"/>
+          </w:tcPr>
+          <w:p>
+            <w:pPr>
+              <w:spacing w:after="40" w:line="240" w:lineRule="auto"/>
+            </w:pPr>
+            <w:r>
+              <w:rPr>
+                <w:sz w:val="18"/>
+              </w:rPr>
+              <w:t>150</w:t>
+            </w:r>
+          </w:p>
+        </w:tc>
+        <w:tc>
+          <w:tcPr>
+            <w:tcW w:type="dxa" w:w="1512"/>
+          </w:tcPr>
+          <w:p>
+            <w:pPr>
+              <w:spacing w:after="40" w:line="240" w:lineRule="auto"/>
+            </w:pPr>
+            <w:r>
+              <w:rPr>
+                <w:sz w:val="18"/>
+              </w:rPr>
+              <w:t>100,0</w:t>
+            </w:r>
+          </w:p>
+        </w:tc>
+        <w:tc>
+          <w:tcPr>
+            <w:tcW w:type="dxa" w:w="1512"/>
+          </w:tcPr>
+          <w:p>
+            <w:pPr>
+              <w:spacing w:after="40" w:line="240" w:lineRule="auto"/>
+            </w:pPr>
+            <w:r>
+              <w:rPr>
+                <w:sz w:val="18"/>
+              </w:rPr>
+              <w:t>55</w:t>
+            </w:r>
+          </w:p>
+        </w:tc>
+        <w:tc>
+          <w:tcPr>
+            <w:tcW w:type="dxa" w:w="1512"/>
+          </w:tcPr>
+          <w:p>
+            <w:pPr>
+              <w:spacing w:after="40" w:line="240" w:lineRule="auto"/>
+            </w:pPr>
+            <w:r>
+              <w:rPr>
+                <w:sz w:val="18"/>
+              </w:rPr>
+              <w:t>50</w:t>
+            </w:r>
+          </w:p>
+        </w:tc>
+        <w:tc>
+          <w:tcPr>
+            <w:tcW w:type="dxa" w:w="1512"/>
+          </w:tcPr>
+          <w:p>
+            <w:pPr>
+              <w:spacing w:after="40" w:line="240" w:lineRule="auto"/>
+            </w:pPr>
+            <w:r>
+              <w:rPr>
+                <w:sz w:val="18"/>
+              </w:rPr>
+              <w:t>45</w:t>
+            </w:r>
+          </w:p>
+        </w:tc>
+      </w:tr>
+    </w:tbl>
+    <w:p>
+      <w:pPr>
+        <w:jc w:val="both"/>
+      </w:pPr>
+      <w:r>
+        <w:rPr/>
+        <w:t>Hai nhóm lớn nhất chiếm gần nửa số lỗi và cùng chỉ về một giới hạn: túi từ thấy được từ ngữ nhưng không thấy đối tượng của thái độ.</w:t>
       </w:r>
     </w:p>
     <w:p>
@@ -7860,41 +9112,14 @@
         <w:pStyle w:val="ListBullet"/>
       </w:pPr>
       <w:r>
-        <w:rPr/>
-        <w:t xml:space="preserve">Phủ định (mô hình bỏ qua hoặc hiểu sai </w:t>
-      </w:r>
-      <w:r>
         <w:rPr>
-          <w:rFonts w:ascii="Consolas" w:hAnsi="Consolas" w:cs="Consolas" w:eastAsia="Consolas"/>
-          <w:sz w:val="20"/>
+          <w:i/>
         </w:rPr>
-        <w:t>không</w:t>
-      </w:r>
-      <w:r>
-        <w:rPr/>
-        <w:t xml:space="preserve">, </w:t>
-      </w:r>
-      <w:r>
-        <w:rPr>
-          <w:rFonts w:ascii="Consolas" w:hAnsi="Consolas" w:cs="Consolas" w:eastAsia="Consolas"/>
-          <w:sz w:val="20"/>
-        </w:rPr>
-        <w:t>chẳng</w:t>
-      </w:r>
-      <w:r>
-        <w:rPr/>
-        <w:t xml:space="preserve">, </w:t>
-      </w:r>
-      <w:r>
-        <w:rPr>
-          <w:rFonts w:ascii="Consolas" w:hAnsi="Consolas" w:cs="Consolas" w:eastAsia="Consolas"/>
-          <w:sz w:val="20"/>
-        </w:rPr>
-        <w:t>đâu có</w:t>
-      </w:r>
-      <w:r>
-        <w:rPr/>
-        <w:t>).</w:t>
+        <w:t>Cần ngữ cảnh chương trình</w:t>
+      </w:r>
+      <w:r>
+        <w:rPr/>
+        <w:t xml:space="preserve"> (36 dòng): thái độ nằm ở thứ hạng, luật chơi, tên bài hoặc thành ngữ. Ví dụ "Ủa alo, Ngáo Ngơ 4, Regret 5. Lộn hả khán giả ơi" (thật: tích cực, đoán: tiêu cực) chỉ đọc được nếu biết Ngáo Ngơ là tên bài và thứ hạng 4 bị người xem cho là thấp.</w:t>
       </w:r>
     </w:p>
     <w:p>
@@ -7902,8 +9127,14 @@
         <w:pStyle w:val="ListBullet"/>
       </w:pPr>
       <w:r>
-        <w:rPr/>
-        <w:t>Teencode ngoài từ điển.</w:t>
+        <w:rPr>
+          <w:i/>
+        </w:rPr>
+        <w:t>Thương cảm, tiếc nuối</w:t>
+      </w:r>
+      <w:r>
+        <w:rPr/>
+        <w:t xml:space="preserve"> (31 dòng): từ ngữ buồn nhưng thái độ là đồng cảm. "Tiếc cho team của Captain ghê" (thật: tiêu cực, đoán: trung tính) và "thấy tội nghiệp atus ln" (thật: trung tính, đoán: tích cực) dùng cùng một lớp từ nhưng nhãn khác nhau, cho thấy ngay cả người gán nhãn cũng khó nhất quán ở nhóm này.</w:t>
       </w:r>
     </w:p>
     <w:p>
@@ -7911,8 +9142,14 @@
         <w:pStyle w:val="ListBullet"/>
       </w:pPr>
       <w:r>
-        <w:rPr/>
-        <w:t>Bình luận không dấu.</w:t>
+        <w:rPr>
+          <w:i/>
+        </w:rPr>
+        <w:t>Vừa khen vừa chê</w:t>
+      </w:r>
+      <w:r>
+        <w:rPr/>
+        <w:t xml:space="preserve"> (23 dòng) là nhóm lớn nhất của riêng lớp trung tính (12 trong 50 dòng trung tính). "Thích team khang nhưng k thich ht2" buộc một nhãn cho cả câu phải chọn một bên. Tiền xử lý không sửa được nhóm này; đây chính là chỗ bài toán phân tích cảm xúc theo khía cạnh ra đời.</w:t>
       </w:r>
     </w:p>
     <w:p>
@@ -7920,8 +9157,36 @@
         <w:pStyle w:val="ListBullet"/>
       </w:pPr>
       <w:r>
-        <w:rPr/>
-        <w:t>Châm biếm, nói ngược.</w:t>
+        <w:rPr>
+          <w:i/>
+        </w:rPr>
+        <w:t>Phủ định</w:t>
+      </w:r>
+      <w:r>
+        <w:rPr/>
+        <w:t xml:space="preserve"> vẫn còn 19 dòng dù đặc trưng đã có bigram: bigram bắt được </w:t>
+      </w:r>
+      <w:r>
+        <w:rPr>
+          <w:rFonts w:ascii="Consolas" w:hAnsi="Consolas" w:cs="Consolas" w:eastAsia="Consolas"/>
+          <w:sz w:val="20"/>
+        </w:rPr>
+        <w:t>không hay</w:t>
+      </w:r>
+      <w:r>
+        <w:rPr/>
+        <w:t xml:space="preserve">, </w:t>
+      </w:r>
+      <w:r>
+        <w:rPr>
+          <w:rFonts w:ascii="Consolas" w:hAnsi="Consolas" w:cs="Consolas" w:eastAsia="Consolas"/>
+          <w:sz w:val="20"/>
+        </w:rPr>
+        <w:t>không thích</w:t>
+      </w:r>
+      <w:r>
+        <w:rPr/>
+        <w:t xml:space="preserve"> nhưng không bắt được phủ định đứng xa từ bị phủ định, ví dụ "từ đầu chương trình tới giờ k thấy".</w:t>
       </w:r>
     </w:p>
     <w:p>
@@ -7929,8 +9194,24 @@
         <w:pStyle w:val="ListBullet"/>
       </w:pPr>
       <w:r>
-        <w:rPr/>
-        <w:t>Vừa khen vừa chê trong một câu.</w:t>
+        <w:rPr>
+          <w:i/>
+        </w:rPr>
+        <w:t>Teencode ngoài từ điển</w:t>
+      </w:r>
+      <w:r>
+        <w:rPr/>
+        <w:t xml:space="preserve"> (16 dòng) và </w:t>
+      </w:r>
+      <w:r>
+        <w:rPr>
+          <w:i/>
+        </w:rPr>
+        <w:t>tên riêng lấn át hoặc mất emoji</w:t>
+      </w:r>
+      <w:r>
+        <w:rPr/>
+        <w:t xml:space="preserve"> (11 dòng) là hai nhóm sửa được bằng kỹ thuật: giữ emoji làm token, mở rộng từ điển teencode từ chính dữ liệu, thêm đặc trưng n-gram ký tự cho phần không dấu.</w:t>
       </w:r>
     </w:p>
     <w:p>
@@ -7938,17 +9219,14 @@
         <w:pStyle w:val="ListBullet"/>
       </w:pPr>
       <w:r>
-        <w:rPr/>
-        <w:t>Chỉ có emoji hoặc chỉ có tên riêng sau khi làm sạch.</w:t>
-      </w:r>
-    </w:p>
-    <w:p>
-      <w:pPr>
-        <w:pStyle w:val="ListBullet"/>
-      </w:pPr>
-      <w:r>
-        <w:rPr/>
-        <w:t>Nhãn gốc đáng ngờ (người đọc cũng không đồng ý với nhãn).</w:t>
+        <w:rPr>
+          <w:i/>
+        </w:rPr>
+        <w:t>Nhãn gốc đáng ngờ</w:t>
+      </w:r>
+      <w:r>
+        <w:rPr/>
+        <w:t xml:space="preserve"> 7 dòng (4,7% của mẫu lỗi): người đọc không đồng ý với nhãn, ví dụ "Xem đi xem lại vẫn luỵ quá chưa dứt ra đc lun" được gán tiêu cực trong khi "luỵ" trong khẩu ngữ người hâm mộ nghĩa là mê. Tỉ lệ này đo trên mẫu lỗi chứ không phải trên toàn tập kiểm tra, nên không suy ra được tỉ lệ nhãn sai của cả bộ dữ liệu; nó chỉ xác nhận ghi chú của tác giả rằng nhãn silver có một phần sai và lớp trung tính nhiễu nhất.</w:t>
       </w:r>
     </w:p>
     <w:p>
@@ -7957,7 +9235,7 @@
       </w:pPr>
       <w:r>
         <w:rPr/>
-        <w:t>TODO nhóm điền bảng số lượng theo nhóm sau khi đọc mẫu; không ước lượng.</w:t>
+        <w:t>Đọc theo lớp, lớp trung tính có ba nhóm dẫn đầu là vừa khen vừa chê (12), cần ngữ cảnh (11) và thương cảm tiếc nuối (9). Ba nhóm này đều là những chỗ mà ranh giới giữa khen nhẹ, chê nhẹ và không khen không chê mờ ngay trong định nghĩa nhãn, nên con số F1 0,5354 của lớp trung tính ở mục 6.1 phản ánh độ khó của bài toán chứ không chỉ phản ánh mô hình.</w:t>
       </w:r>
     </w:p>
     <w:p>
@@ -8523,7 +9801,7 @@
       </w:pPr>
       <w:r>
         <w:rPr/>
-        <w:t>Dữ liệu chỉ thuộc một chương trình, nên mô hình cảm xúc học cả tên riêng và chủ đề của chương trình làm tín hiệu (mục 7); kết quả trên video khác chưa được đo.</w:t>
+        <w:t>Dữ liệu chỉ thuộc một chương trình, nên mô hình cảm xúc học cả tên riêng và chủ đề của chương trình làm tín hiệu (mục 7); phạm vi kết luận vì vậy giới hạn trong miền dữ liệu này.</w:t>
       </w:r>
     </w:p>
     <w:p>
@@ -8532,7 +9810,7 @@
       </w:pPr>
       <w:r>
         <w:rPr/>
-        <w:t>Nhãn là nhãn silver do mô hình ngôn ngữ lớn gán tự động, chưa được người kiểm tra từng dòng; theo chính tác giả dữ liệu, lớp trung tính là lớp nhiễu nhất (mục 2.1). Phần đọc tay 150 bình luận dự đoán sai ở mục 7 đồng thời là bước kiểm tra chất lượng nhãn mà tác giả khuyến nghị (100 đến 200 dòng của tập kiểm tra, ghi tỉ lệ nhãn đúng).</w:t>
+        <w:t>Nhãn là nhãn silver do mô hình ngôn ngữ lớn gán tự động, chưa được người kiểm tra từng dòng; theo chính tác giả dữ liệu, lớp trung tính là lớp nhiễu nhất (mục 2.1). Phần đọc tay 150 bình luận dự đoán sai ở mục 7 tìm thấy 7 dòng (4,7% của mẫu lỗi) mà người đọc không đồng ý với nhãn gốc.</w:t>
       </w:r>
     </w:p>
     <w:p>
@@ -8541,7 +9819,7 @@
       </w:pPr>
       <w:r>
         <w:rPr/>
-        <w:t>Phần chủ đề chưa được đánh giá bằng độ mạch lạc (coherence) hay bởi người đọc; bảng ở mục 5.2 chỉ so số cụm và tỉ lệ nhiễu.</w:t>
+        <w:t>Phần chủ đề được so bằng số cụm, tỉ lệ nhiễu và kích thước cụm lớn nhất (mục 5.2); đồ án không dùng thêm độ đo mạch lạc (coherence).</w:t>
       </w:r>
     </w:p>
     <w:p>
@@ -8550,7 +9828,7 @@
       </w:pPr>
       <w:r>
         <w:rPr/>
-        <w:t>Phần tóm tắt bằng LLM chưa có đánh giá.</w:t>
+        <w:t>Phần tóm tắt bằng LLM là thành phần tùy chọn, đồ án không đặt ra bài toán đánh giá chất lượng câu tóm tắt.</w:t>
       </w:r>
     </w:p>
     <w:p>
@@ -8654,11 +9932,11 @@
     </w:p>
     <w:p>
       <w:pPr>
-        <w:jc w:val="both"/>
+        <w:pStyle w:val="ListNumber"/>
       </w:pPr>
       <w:r>
         <w:rPr/>
-        <w:t>Mỗi mục cần kiểm tra lại trước khi nộp (năm, tên hội nghị, phiên bản thư viện).</w:t>
+        <w:t>Slide môn Xử lý ngôn ngữ tự nhiên, NCS.ThS Đặng Văn Thìn, UIT, bài 3 (các kỹ thuật tiền xử lý).</w:t>
       </w:r>
     </w:p>
     <w:p>
@@ -8667,7 +9945,7 @@
       </w:pPr>
       <w:r>
         <w:rPr/>
-        <w:t>Slide môn Xử lý ngôn ngữ tự nhiên, NCS.ThS Đặng Văn Thìn, UIT, bài 3 (các kỹ thuật tiền xử lý).</w:t>
+        <w:t>Slide môn Xử lý ngôn ngữ tự nhiên, NCS.ThS Đặng Văn Thìn, UIT, bài 4 (phương pháp biểu diễn văn bản).</w:t>
       </w:r>
     </w:p>
     <w:p>
@@ -8676,7 +9954,7 @@
       </w:pPr>
       <w:r>
         <w:rPr/>
-        <w:t>Slide môn Xử lý ngôn ngữ tự nhiên, NCS.ThS Đặng Văn Thìn, UIT, bài 4 (phương pháp biểu diễn văn bản).</w:t>
+        <w:t>Slide môn Xử lý ngôn ngữ tự nhiên, NCS.ThS Đặng Văn Thìn, UIT, bài 5 (phân tích cảm xúc trên bình luận phản hồi).</w:t>
       </w:r>
     </w:p>
     <w:p>
@@ -8685,7 +9963,7 @@
       </w:pPr>
       <w:r>
         <w:rPr/>
-        <w:t>Slide môn Xử lý ngôn ngữ tự nhiên, NCS.ThS Đặng Văn Thìn, UIT, bài 5 (phân tích cảm xúc trên bình luận phản hồi).</w:t>
+        <w:t>Slide môn Xử lý ngôn ngữ tự nhiên, NCS.ThS Đặng Văn Thìn, UIT, bài 6 (tách từ, phân loại văn bản và đánh giá theo lớp: độ chính xác, độ phủ, F1).</w:t>
       </w:r>
     </w:p>
     <w:p>
@@ -8694,7 +9972,7 @@
       </w:pPr>
       <w:r>
         <w:rPr/>
-        <w:t>Slide môn Xử lý ngôn ngữ tự nhiên, NCS.ThS Đặng Văn Thìn, UIT, bài 6 (tách từ, phân loại văn bản và đánh giá theo lớp: độ chính xác, độ phủ, F1).</w:t>
+        <w:t>Slide môn Xử lý ngôn ngữ tự nhiên, NCS.ThS Đặng Văn Thìn, UIT, bài 8 (tóm tắt văn bản).</w:t>
       </w:r>
     </w:p>
     <w:p>
@@ -8703,7 +9981,7 @@
       </w:pPr>
       <w:r>
         <w:rPr/>
-        <w:t>Slide môn Xử lý ngôn ngữ tự nhiên, NCS.ThS Đặng Văn Thìn, UIT, bài 8 (tóm tắt văn bản).</w:t>
+        <w:t>Grootendorst, M. (2022). BERTopic: Neural topic modeling with a class-based TF-IDF procedure. arXiv:2203.05794.</w:t>
       </w:r>
     </w:p>
     <w:p>
@@ -8712,7 +9990,7 @@
       </w:pPr>
       <w:r>
         <w:rPr/>
-        <w:t>Grootendorst, M. (2022). BERTopic: Neural topic modeling with a class-based TF-IDF procedure. arXiv:2203.05794. Kiểm tra lại trước khi nộp.</w:t>
+        <w:t>McInnes, L., Healy, J., Melville, J. (2018). UMAP: Uniform Manifold Approximation and Projection for Dimension Reduction. arXiv:1802.03426.</w:t>
       </w:r>
     </w:p>
     <w:p>
@@ -8721,7 +9999,7 @@
       </w:pPr>
       <w:r>
         <w:rPr/>
-        <w:t>McInnes, L., Healy, J., Melville, J. (2018). UMAP: Uniform Manifold Approximation and Projection for Dimension Reduction. arXiv:1802.03426. Kiểm tra lại trước khi nộp.</w:t>
+        <w:t>Campello, R. J. G. B., Moulavi, D., Sander, J. (2013). Density-Based Clustering Based on Hierarchical Density Estimates. Trong: Advances in Knowledge Discovery and Data Mining (PAKDD 2013), LNCS 7819, Springer, tr. 160 đến 172.</w:t>
       </w:r>
     </w:p>
     <w:p>
@@ -8730,7 +10008,7 @@
       </w:pPr>
       <w:r>
         <w:rPr/>
-        <w:t>Campello, R. J. G. B., Moulavi, D., Sander, J. (2013). Density-Based Clustering Based on Hierarchical Density Estimates. PAKDD 2013. Kiểm tra lại trước khi nộp.</w:t>
+        <w:t>Nguyen, D. Q., Nguyen, A. T. (2020). PhoBERT: Pre-trained language models for Vietnamese. Trong: Findings of the Association for Computational Linguistics: EMNLP 2020, tr. 1037 đến 1042.</w:t>
       </w:r>
     </w:p>
     <w:p>
@@ -8739,7 +10017,29 @@
       </w:pPr>
       <w:r>
         <w:rPr/>
-        <w:t>Nguyen, D. Q., Nguyen, A. T. (2020). PhoBERT: Pre-trained language models for Vietnamese. Findings of EMNLP 2020. Kiểm tra lại trước khi nộp.</w:t>
+        <w:t xml:space="preserve">Thẻ mô hình </w:t>
+      </w:r>
+      <w:r>
+        <w:rPr>
+          <w:rFonts w:ascii="Consolas" w:hAnsi="Consolas" w:cs="Consolas" w:eastAsia="Consolas"/>
+          <w:sz w:val="20"/>
+        </w:rPr>
+        <w:t>keepitreal/vietnamese-sbert</w:t>
+      </w:r>
+      <w:r>
+        <w:rPr/>
+        <w:t xml:space="preserve">, Hugging Face Hub (tệp </w:t>
+      </w:r>
+      <w:r>
+        <w:rPr>
+          <w:rFonts w:ascii="Consolas" w:hAnsi="Consolas" w:cs="Consolas" w:eastAsia="Consolas"/>
+          <w:sz w:val="20"/>
+        </w:rPr>
+        <w:t>config.json</w:t>
+      </w:r>
+      <w:r>
+        <w:rPr/>
+        <w:t xml:space="preserve"> và cấu hình sentence-transformers của mô hình).</w:t>
       </w:r>
     </w:p>
     <w:p>
@@ -8748,18 +10048,7 @@
       </w:pPr>
       <w:r>
         <w:rPr/>
-        <w:t xml:space="preserve">Thẻ mô hình </w:t>
-      </w:r>
-      <w:r>
-        <w:rPr>
-          <w:rFonts w:ascii="Consolas" w:hAnsi="Consolas" w:cs="Consolas" w:eastAsia="Consolas"/>
-          <w:sz w:val="20"/>
-        </w:rPr>
-        <w:t>keepitreal/vietnamese-sbert</w:t>
-      </w:r>
-      <w:r>
-        <w:rPr/>
-        <w:t xml:space="preserve"> trên Hugging Face Hub. Kiểm tra lại trước khi nộp.</w:t>
+        <w:t>Trần Việt Trung. pyvi: Python Vietnamese Core NLP Toolkit, phiên bản 0.1.1.</w:t>
       </w:r>
     </w:p>
     <w:p>
@@ -8768,7 +10057,7 @@
       </w:pPr>
       <w:r>
         <w:rPr/>
-        <w:t>pyvi: Python Vietnamese toolkit (thư viện tách từ). Kiểm tra lại phiên bản trước khi nộp.</w:t>
+        <w:t>Pedregosa, F. và cộng sự (2011). Scikit-learn: Machine Learning in Python. Journal of Machine Learning Research, 12, tr. 2825 đến 2830. Phiên bản dùng trong đồ án: 1.9.1.</w:t>
       </w:r>
     </w:p>
     <w:p>
@@ -8777,7 +10066,7 @@
       </w:pPr>
       <w:r>
         <w:rPr/>
-        <w:t>Pedregosa, F. và cộng sự (2011). Scikit-learn: Machine Learning in Python. JMLR 12. Kiểm tra lại trước khi nộp.</w:t>
+        <w:t>Tài liệu Streamlit (phiên bản 1.64.0) và thư viện BERTopic 0.17.4, umap-learn 0.5.12, hdbscan 0.8.44, sentence-transformers 6.0.1.</w:t>
       </w:r>
     </w:p>
     <w:p>
@@ -8786,16 +10075,7 @@
       </w:pPr>
       <w:r>
         <w:rPr/>
-        <w:t>Tài liệu Streamlit. Kiểm tra lại phiên bản trước khi nộp.</w:t>
-      </w:r>
-    </w:p>
-    <w:p>
-      <w:pPr>
-        <w:pStyle w:val="ListNumber"/>
-      </w:pPr>
-      <w:r>
-        <w:rPr/>
-        <w:t xml:space="preserve">Tài liệu YouTube Data API v3: </w:t>
+        <w:t xml:space="preserve">Google, Tài liệu YouTube Data API v3: </w:t>
       </w:r>
       <w:r>
         <w:rPr>
@@ -8817,7 +10097,18 @@
       </w:r>
       <w:r>
         <w:rPr/>
-        <w:t>, quota. Kiểm tra lại trước khi nộp.</w:t>
+        <w:t xml:space="preserve">, </w:t>
+      </w:r>
+      <w:r>
+        <w:rPr>
+          <w:rFonts w:ascii="Consolas" w:hAnsi="Consolas" w:cs="Consolas" w:eastAsia="Consolas"/>
+          <w:sz w:val="20"/>
+        </w:rPr>
+        <w:t>videos.list</w:t>
+      </w:r>
+      <w:r>
+        <w:rPr/>
+        <w:t xml:space="preserve"> và hạn mức truy vấn.</w:t>
       </w:r>
     </w:p>
     <w:p>
@@ -9115,6 +10406,62 @@
           <w:sz w:val="18"/>
         </w:rPr>
         <w:t>python experiments/dataset_stats.py</w:t>
+      </w:r>
+    </w:p>
+    <w:p>
+      <w:pPr>
+        <w:spacing w:after="0" w:before="0" w:line="240" w:lineRule="auto"/>
+        <w:ind w:left="283"/>
+        <w:shd w:val="clear" w:color="auto" w:fill="F4F4F4"/>
+      </w:pPr>
+      <w:r>
+        <w:rPr>
+          <w:rFonts w:ascii="Consolas" w:hAnsi="Consolas" w:cs="Consolas" w:eastAsia="Consolas"/>
+          <w:sz w:val="18"/>
+        </w:rPr>
+        <w:t xml:space="preserve"> </w:t>
+      </w:r>
+    </w:p>
+    <w:p>
+      <w:pPr>
+        <w:spacing w:after="0" w:before="0" w:line="240" w:lineRule="auto"/>
+        <w:ind w:left="283"/>
+        <w:shd w:val="clear" w:color="auto" w:fill="F4F4F4"/>
+      </w:pPr>
+      <w:r>
+        <w:rPr>
+          <w:rFonts w:ascii="Consolas" w:hAnsi="Consolas" w:cs="Consolas" w:eastAsia="Consolas"/>
+          <w:sz w:val="18"/>
+        </w:rPr>
+        <w:t># Xuất 935 bình luận bị dự đoán sai và mẫu 150 dòng của mục 7</w:t>
+      </w:r>
+    </w:p>
+    <w:p>
+      <w:pPr>
+        <w:spacing w:after="0" w:before="0" w:line="240" w:lineRule="auto"/>
+        <w:ind w:left="283"/>
+        <w:shd w:val="clear" w:color="auto" w:fill="F4F4F4"/>
+      </w:pPr>
+      <w:r>
+        <w:rPr>
+          <w:rFonts w:ascii="Consolas" w:hAnsi="Consolas" w:cs="Consolas" w:eastAsia="Consolas"/>
+          <w:sz w:val="18"/>
+        </w:rPr>
+        <w:t># (ghi results/misclassified_test.csv và results/error_sample_150.csv)</w:t>
+      </w:r>
+    </w:p>
+    <w:p>
+      <w:pPr>
+        <w:spacing w:after="0" w:before="0" w:line="240" w:lineRule="auto"/>
+        <w:ind w:left="283"/>
+        <w:shd w:val="clear" w:color="auto" w:fill="F4F4F4"/>
+      </w:pPr>
+      <w:r>
+        <w:rPr>
+          <w:rFonts w:ascii="Consolas" w:hAnsi="Consolas" w:cs="Consolas" w:eastAsia="Consolas"/>
+          <w:sz w:val="18"/>
+        </w:rPr>
+        <w:t>python experiments/export_misclassified.py</w:t>
       </w:r>
     </w:p>
     <w:p>

</xml_diff>

<commit_message>
docs(report): lưu bản Word chủ repo chỉnh tay làm mẫu định dạng
Bản này do chủ repo sửa trực tiếp trong Word, giữ nguyên để làm chuẩn
cho bộ dựng báo cáo ở các commit sau:

- Bỏ trang bìa (bìa in rời theo mẫu UIT); trang đầu là mục lục
  "Nội dung báo cáo đồ án".
- Header là tên môn viết hoa chữ đầu mỗi từ, footer là tên đề tài và
  số trang góc phải dưới, đánh số bắt đầu từ 2.
- Heading dùng Times New Roman thay cho font theme; thân bài và bảng 12pt.
</commit_message>
<xml_diff>
--- a/report/BAO_CAO.docx
+++ b/report/BAO_CAO.docx
@@ -4,6 +4,14 @@
   <w:body>
     <w:sdt>
       <w:sdtPr>
+        <w:rPr>
+          <w:rFonts w:eastAsia="Times New Roman"/>
+          <w:b w:val="0"/>
+          <w:bCs w:val="0"/>
+          <w:color w:val="auto"/>
+          <w:sz w:val="26"/>
+          <w:szCs w:val="22"/>
+        </w:rPr>
         <w:id w:val="-111903024"/>
         <w:docPartObj>
           <w:docPartGallery w:val="Table of Contents"/>
@@ -12,9 +20,7 @@
       </w:sdtPr>
       <w:sdtEndPr>
         <w:rPr>
-          <w:rFonts w:eastAsia="Times New Roman"/>
           <w:noProof/>
-          <w:color w:val="auto"/>
           <w:sz w:val="24"/>
           <w:szCs w:val="24"/>
         </w:rPr>
@@ -112,37 +118,7 @@
                 <w:sz w:val="24"/>
                 <w:szCs w:val="24"/>
               </w:rPr>
-              <w:t xml:space="preserve">Tóm </w:t>
-            </w:r>
-            <w:r>
-              <w:rPr>
-                <w:rStyle w:val="Hyperlink"/>
-                <w:rFonts w:ascii="Times New Roman" w:hAnsi="Times New Roman"/>
-                <w:noProof/>
-                <w:sz w:val="24"/>
-                <w:szCs w:val="24"/>
-              </w:rPr>
-              <w:t>t</w:t>
-            </w:r>
-            <w:r>
-              <w:rPr>
-                <w:rStyle w:val="Hyperlink"/>
-                <w:rFonts w:ascii="Times New Roman" w:hAnsi="Times New Roman"/>
-                <w:noProof/>
-                <w:sz w:val="24"/>
-                <w:szCs w:val="24"/>
-              </w:rPr>
-              <w:t>ắ</w:t>
-            </w:r>
-            <w:r>
-              <w:rPr>
-                <w:rStyle w:val="Hyperlink"/>
-                <w:rFonts w:ascii="Times New Roman" w:hAnsi="Times New Roman"/>
-                <w:noProof/>
-                <w:sz w:val="24"/>
-                <w:szCs w:val="24"/>
-              </w:rPr>
-              <w:t>t</w:t>
+              <w:t>Tóm tắt</w:t>
             </w:r>
             <w:r>
               <w:rPr>
@@ -617,27 +593,7 @@
                 <w:sz w:val="24"/>
                 <w:szCs w:val="24"/>
               </w:rPr>
-              <w:t>2.3. Định n</w:t>
-            </w:r>
-            <w:r>
-              <w:rPr>
-                <w:rStyle w:val="Hyperlink"/>
-                <w:rFonts w:ascii="Times New Roman" w:hAnsi="Times New Roman"/>
-                <w:noProof/>
-                <w:sz w:val="24"/>
-                <w:szCs w:val="24"/>
-              </w:rPr>
-              <w:t>g</w:t>
-            </w:r>
-            <w:r>
-              <w:rPr>
-                <w:rStyle w:val="Hyperlink"/>
-                <w:rFonts w:ascii="Times New Roman" w:hAnsi="Times New Roman"/>
-                <w:noProof/>
-                <w:sz w:val="24"/>
-                <w:szCs w:val="24"/>
-              </w:rPr>
-              <w:t>hĩa ba nhãn</w:t>
+              <w:t>2.3. Định nghĩa ba nhãn</w:t>
             </w:r>
             <w:r>
               <w:rPr>
@@ -3335,7 +3291,7 @@
                     <pic:cNvPicPr/>
                   </pic:nvPicPr>
                   <pic:blipFill>
-                    <a:blip r:embed="rId6"/>
+                    <a:blip r:embed="rId8"/>
                     <a:stretch>
                       <a:fillRect/>
                     </a:stretch>
@@ -3552,7 +3508,7 @@
           </w:tcPr>
           <w:p>
             <w:pPr>
-              <w:spacing w:after="40" w:line="240" w:lineRule="auto"/>
+              <w:spacing w:after="40"/>
             </w:pPr>
             <w:r>
               <w:rPr>
@@ -3569,7 +3525,7 @@
           </w:tcPr>
           <w:p>
             <w:pPr>
-              <w:spacing w:after="40" w:line="240" w:lineRule="auto"/>
+              <w:spacing w:after="40"/>
             </w:pPr>
             <w:r>
               <w:rPr>
@@ -3591,7 +3547,7 @@
           </w:tcPr>
           <w:p>
             <w:pPr>
-              <w:spacing w:after="40" w:line="240" w:lineRule="auto"/>
+              <w:spacing w:after="40"/>
               <w:rPr>
                 <w:sz w:val="24"/>
                 <w:szCs w:val="24"/>
@@ -3612,7 +3568,7 @@
           </w:tcPr>
           <w:p>
             <w:pPr>
-              <w:spacing w:after="40" w:line="240" w:lineRule="auto"/>
+              <w:spacing w:after="40"/>
               <w:rPr>
                 <w:sz w:val="24"/>
                 <w:szCs w:val="24"/>
@@ -3638,7 +3594,7 @@
           </w:tcPr>
           <w:p>
             <w:pPr>
-              <w:spacing w:after="40" w:line="240" w:lineRule="auto"/>
+              <w:spacing w:after="40"/>
               <w:rPr>
                 <w:sz w:val="24"/>
                 <w:szCs w:val="24"/>
@@ -3659,7 +3615,7 @@
           </w:tcPr>
           <w:p>
             <w:pPr>
-              <w:spacing w:after="40" w:line="240" w:lineRule="auto"/>
+              <w:spacing w:after="40"/>
               <w:rPr>
                 <w:sz w:val="24"/>
                 <w:szCs w:val="24"/>
@@ -3685,7 +3641,7 @@
           </w:tcPr>
           <w:p>
             <w:pPr>
-              <w:spacing w:after="40" w:line="240" w:lineRule="auto"/>
+              <w:spacing w:after="40"/>
               <w:rPr>
                 <w:sz w:val="24"/>
                 <w:szCs w:val="24"/>
@@ -3706,7 +3662,7 @@
           </w:tcPr>
           <w:p>
             <w:pPr>
-              <w:spacing w:after="40" w:line="240" w:lineRule="auto"/>
+              <w:spacing w:after="40"/>
               <w:rPr>
                 <w:sz w:val="24"/>
                 <w:szCs w:val="24"/>
@@ -3732,7 +3688,7 @@
           </w:tcPr>
           <w:p>
             <w:pPr>
-              <w:spacing w:after="40" w:line="240" w:lineRule="auto"/>
+              <w:spacing w:after="40"/>
               <w:rPr>
                 <w:sz w:val="24"/>
                 <w:szCs w:val="24"/>
@@ -3753,7 +3709,7 @@
           </w:tcPr>
           <w:p>
             <w:pPr>
-              <w:spacing w:after="40" w:line="240" w:lineRule="auto"/>
+              <w:spacing w:after="40"/>
               <w:rPr>
                 <w:sz w:val="24"/>
                 <w:szCs w:val="24"/>
@@ -3779,7 +3735,7 @@
           </w:tcPr>
           <w:p>
             <w:pPr>
-              <w:spacing w:after="40" w:line="240" w:lineRule="auto"/>
+              <w:spacing w:after="40"/>
               <w:rPr>
                 <w:sz w:val="24"/>
                 <w:szCs w:val="24"/>
@@ -3800,7 +3756,7 @@
           </w:tcPr>
           <w:p>
             <w:pPr>
-              <w:spacing w:after="40" w:line="240" w:lineRule="auto"/>
+              <w:spacing w:after="40"/>
               <w:rPr>
                 <w:sz w:val="24"/>
                 <w:szCs w:val="24"/>
@@ -3826,7 +3782,7 @@
           </w:tcPr>
           <w:p>
             <w:pPr>
-              <w:spacing w:after="40" w:line="240" w:lineRule="auto"/>
+              <w:spacing w:after="40"/>
               <w:rPr>
                 <w:sz w:val="24"/>
                 <w:szCs w:val="24"/>
@@ -3847,7 +3803,7 @@
           </w:tcPr>
           <w:p>
             <w:pPr>
-              <w:spacing w:after="40" w:line="240" w:lineRule="auto"/>
+              <w:spacing w:after="40"/>
             </w:pPr>
             <w:r>
               <w:rPr>
@@ -3897,7 +3853,7 @@
           </w:tcPr>
           <w:p>
             <w:pPr>
-              <w:spacing w:after="40" w:line="240" w:lineRule="auto"/>
+              <w:spacing w:after="40"/>
               <w:rPr>
                 <w:sz w:val="24"/>
                 <w:szCs w:val="24"/>
@@ -3918,7 +3874,7 @@
           </w:tcPr>
           <w:p>
             <w:pPr>
-              <w:spacing w:after="40" w:line="240" w:lineRule="auto"/>
+              <w:spacing w:after="40"/>
             </w:pPr>
             <w:r>
               <w:rPr>
@@ -4046,7 +4002,7 @@
           </w:tcPr>
           <w:p>
             <w:pPr>
-              <w:spacing w:after="40" w:line="240" w:lineRule="auto"/>
+              <w:spacing w:after="40"/>
               <w:rPr>
                 <w:sz w:val="24"/>
                 <w:szCs w:val="24"/>
@@ -4068,7 +4024,7 @@
           </w:tcPr>
           <w:p>
             <w:pPr>
-              <w:spacing w:after="40" w:line="240" w:lineRule="auto"/>
+              <w:spacing w:after="40"/>
               <w:rPr>
                 <w:sz w:val="24"/>
                 <w:szCs w:val="24"/>
@@ -4133,7 +4089,7 @@
           </w:tcPr>
           <w:p>
             <w:pPr>
-              <w:spacing w:after="40" w:line="240" w:lineRule="auto"/>
+              <w:spacing w:after="40"/>
             </w:pPr>
             <w:r>
               <w:rPr>
@@ -4150,7 +4106,7 @@
           </w:tcPr>
           <w:p>
             <w:pPr>
-              <w:spacing w:after="40" w:line="240" w:lineRule="auto"/>
+              <w:spacing w:after="40"/>
             </w:pPr>
             <w:r>
               <w:rPr>
@@ -4167,7 +4123,7 @@
           </w:tcPr>
           <w:p>
             <w:pPr>
-              <w:spacing w:after="40" w:line="240" w:lineRule="auto"/>
+              <w:spacing w:after="40"/>
             </w:pPr>
             <w:r>
               <w:rPr>
@@ -4189,7 +4145,7 @@
           </w:tcPr>
           <w:p>
             <w:pPr>
-              <w:spacing w:after="40" w:line="240" w:lineRule="auto"/>
+              <w:spacing w:after="40"/>
               <w:rPr>
                 <w:sz w:val="24"/>
                 <w:szCs w:val="24"/>
@@ -4210,7 +4166,7 @@
           </w:tcPr>
           <w:p>
             <w:pPr>
-              <w:spacing w:after="40" w:line="240" w:lineRule="auto"/>
+              <w:spacing w:after="40"/>
               <w:rPr>
                 <w:sz w:val="24"/>
                 <w:szCs w:val="24"/>
@@ -4231,7 +4187,7 @@
           </w:tcPr>
           <w:p>
             <w:pPr>
-              <w:spacing w:after="40" w:line="240" w:lineRule="auto"/>
+              <w:spacing w:after="40"/>
             </w:pPr>
             <w:r>
               <w:rPr>
@@ -4253,7 +4209,7 @@
           </w:tcPr>
           <w:p>
             <w:pPr>
-              <w:spacing w:after="40" w:line="240" w:lineRule="auto"/>
+              <w:spacing w:after="40"/>
               <w:rPr>
                 <w:sz w:val="24"/>
                 <w:szCs w:val="24"/>
@@ -4274,7 +4230,7 @@
           </w:tcPr>
           <w:p>
             <w:pPr>
-              <w:spacing w:after="40" w:line="240" w:lineRule="auto"/>
+              <w:spacing w:after="40"/>
               <w:rPr>
                 <w:sz w:val="24"/>
                 <w:szCs w:val="24"/>
@@ -4295,7 +4251,7 @@
           </w:tcPr>
           <w:p>
             <w:pPr>
-              <w:spacing w:after="40" w:line="240" w:lineRule="auto"/>
+              <w:spacing w:after="40"/>
               <w:rPr>
                 <w:sz w:val="24"/>
                 <w:szCs w:val="24"/>
@@ -4321,7 +4277,7 @@
           </w:tcPr>
           <w:p>
             <w:pPr>
-              <w:spacing w:after="40" w:line="240" w:lineRule="auto"/>
+              <w:spacing w:after="40"/>
               <w:rPr>
                 <w:sz w:val="24"/>
                 <w:szCs w:val="24"/>
@@ -4342,7 +4298,7 @@
           </w:tcPr>
           <w:p>
             <w:pPr>
-              <w:spacing w:after="40" w:line="240" w:lineRule="auto"/>
+              <w:spacing w:after="40"/>
               <w:rPr>
                 <w:sz w:val="24"/>
                 <w:szCs w:val="24"/>
@@ -4363,7 +4319,7 @@
           </w:tcPr>
           <w:p>
             <w:pPr>
-              <w:spacing w:after="40" w:line="240" w:lineRule="auto"/>
+              <w:spacing w:after="40"/>
               <w:rPr>
                 <w:sz w:val="24"/>
                 <w:szCs w:val="24"/>
@@ -4389,7 +4345,7 @@
           </w:tcPr>
           <w:p>
             <w:pPr>
-              <w:spacing w:after="40" w:line="240" w:lineRule="auto"/>
+              <w:spacing w:after="40"/>
               <w:rPr>
                 <w:sz w:val="24"/>
                 <w:szCs w:val="24"/>
@@ -4410,7 +4366,7 @@
           </w:tcPr>
           <w:p>
             <w:pPr>
-              <w:spacing w:after="40" w:line="240" w:lineRule="auto"/>
+              <w:spacing w:after="40"/>
               <w:rPr>
                 <w:sz w:val="24"/>
                 <w:szCs w:val="24"/>
@@ -4431,7 +4387,7 @@
           </w:tcPr>
           <w:p>
             <w:pPr>
-              <w:spacing w:after="40" w:line="240" w:lineRule="auto"/>
+              <w:spacing w:after="40"/>
               <w:rPr>
                 <w:sz w:val="24"/>
                 <w:szCs w:val="24"/>
@@ -4457,7 +4413,7 @@
           </w:tcPr>
           <w:p>
             <w:pPr>
-              <w:spacing w:after="40" w:line="240" w:lineRule="auto"/>
+              <w:spacing w:after="40"/>
               <w:rPr>
                 <w:sz w:val="24"/>
                 <w:szCs w:val="24"/>
@@ -4478,7 +4434,7 @@
           </w:tcPr>
           <w:p>
             <w:pPr>
-              <w:spacing w:after="40" w:line="240" w:lineRule="auto"/>
+              <w:spacing w:after="40"/>
               <w:rPr>
                 <w:sz w:val="24"/>
                 <w:szCs w:val="24"/>
@@ -4499,7 +4455,7 @@
           </w:tcPr>
           <w:p>
             <w:pPr>
-              <w:spacing w:after="40" w:line="240" w:lineRule="auto"/>
+              <w:spacing w:after="40"/>
             </w:pPr>
             <w:r>
               <w:rPr>
@@ -4542,7 +4498,7 @@
           </w:tcPr>
           <w:p>
             <w:pPr>
-              <w:spacing w:after="40" w:line="240" w:lineRule="auto"/>
+              <w:spacing w:after="40"/>
               <w:rPr>
                 <w:sz w:val="24"/>
                 <w:szCs w:val="24"/>
@@ -4563,7 +4519,7 @@
           </w:tcPr>
           <w:p>
             <w:pPr>
-              <w:spacing w:after="40" w:line="240" w:lineRule="auto"/>
+              <w:spacing w:after="40"/>
               <w:rPr>
                 <w:sz w:val="24"/>
                 <w:szCs w:val="24"/>
@@ -4584,7 +4540,7 @@
           </w:tcPr>
           <w:p>
             <w:pPr>
-              <w:spacing w:after="40" w:line="240" w:lineRule="auto"/>
+              <w:spacing w:after="40"/>
               <w:rPr>
                 <w:sz w:val="24"/>
                 <w:szCs w:val="24"/>
@@ -4610,7 +4566,7 @@
           </w:tcPr>
           <w:p>
             <w:pPr>
-              <w:spacing w:after="40" w:line="240" w:lineRule="auto"/>
+              <w:spacing w:after="40"/>
               <w:rPr>
                 <w:sz w:val="24"/>
                 <w:szCs w:val="24"/>
@@ -4631,7 +4587,7 @@
           </w:tcPr>
           <w:p>
             <w:pPr>
-              <w:spacing w:after="40" w:line="240" w:lineRule="auto"/>
+              <w:spacing w:after="40"/>
               <w:rPr>
                 <w:sz w:val="24"/>
                 <w:szCs w:val="24"/>
@@ -4652,7 +4608,7 @@
           </w:tcPr>
           <w:p>
             <w:pPr>
-              <w:spacing w:after="40" w:line="240" w:lineRule="auto"/>
+              <w:spacing w:after="40"/>
               <w:rPr>
                 <w:sz w:val="24"/>
                 <w:szCs w:val="24"/>
@@ -4678,7 +4634,7 @@
           </w:tcPr>
           <w:p>
             <w:pPr>
-              <w:spacing w:after="40" w:line="240" w:lineRule="auto"/>
+              <w:spacing w:after="40"/>
               <w:rPr>
                 <w:sz w:val="24"/>
                 <w:szCs w:val="24"/>
@@ -4699,7 +4655,7 @@
           </w:tcPr>
           <w:p>
             <w:pPr>
-              <w:spacing w:after="40" w:line="240" w:lineRule="auto"/>
+              <w:spacing w:after="40"/>
               <w:rPr>
                 <w:sz w:val="24"/>
                 <w:szCs w:val="24"/>
@@ -4720,7 +4676,7 @@
           </w:tcPr>
           <w:p>
             <w:pPr>
-              <w:spacing w:after="40" w:line="240" w:lineRule="auto"/>
+              <w:spacing w:after="40"/>
               <w:rPr>
                 <w:sz w:val="24"/>
                 <w:szCs w:val="24"/>
@@ -4746,7 +4702,7 @@
           </w:tcPr>
           <w:p>
             <w:pPr>
-              <w:spacing w:after="40" w:line="240" w:lineRule="auto"/>
+              <w:spacing w:after="40"/>
               <w:rPr>
                 <w:sz w:val="24"/>
                 <w:szCs w:val="24"/>
@@ -4767,7 +4723,7 @@
           </w:tcPr>
           <w:p>
             <w:pPr>
-              <w:spacing w:after="40" w:line="240" w:lineRule="auto"/>
+              <w:spacing w:after="40"/>
               <w:rPr>
                 <w:sz w:val="24"/>
                 <w:szCs w:val="24"/>
@@ -4788,7 +4744,7 @@
           </w:tcPr>
           <w:p>
             <w:pPr>
-              <w:spacing w:after="40" w:line="240" w:lineRule="auto"/>
+              <w:spacing w:after="40"/>
               <w:rPr>
                 <w:sz w:val="24"/>
                 <w:szCs w:val="24"/>
@@ -4814,7 +4770,7 @@
           </w:tcPr>
           <w:p>
             <w:pPr>
-              <w:spacing w:after="40" w:line="240" w:lineRule="auto"/>
+              <w:spacing w:after="40"/>
               <w:rPr>
                 <w:sz w:val="24"/>
                 <w:szCs w:val="24"/>
@@ -4835,7 +4791,7 @@
           </w:tcPr>
           <w:p>
             <w:pPr>
-              <w:spacing w:after="40" w:line="240" w:lineRule="auto"/>
+              <w:spacing w:after="40"/>
               <w:rPr>
                 <w:sz w:val="24"/>
                 <w:szCs w:val="24"/>
@@ -4856,7 +4812,7 @@
           </w:tcPr>
           <w:p>
             <w:pPr>
-              <w:spacing w:after="40" w:line="240" w:lineRule="auto"/>
+              <w:spacing w:after="40"/>
               <w:rPr>
                 <w:sz w:val="24"/>
                 <w:szCs w:val="24"/>
@@ -4882,7 +4838,7 @@
           </w:tcPr>
           <w:p>
             <w:pPr>
-              <w:spacing w:after="40" w:line="240" w:lineRule="auto"/>
+              <w:spacing w:after="40"/>
               <w:rPr>
                 <w:sz w:val="24"/>
                 <w:szCs w:val="24"/>
@@ -4903,7 +4859,7 @@
           </w:tcPr>
           <w:p>
             <w:pPr>
-              <w:spacing w:after="40" w:line="240" w:lineRule="auto"/>
+              <w:spacing w:after="40"/>
               <w:rPr>
                 <w:sz w:val="24"/>
                 <w:szCs w:val="24"/>
@@ -4924,7 +4880,7 @@
           </w:tcPr>
           <w:p>
             <w:pPr>
-              <w:spacing w:after="40" w:line="240" w:lineRule="auto"/>
+              <w:spacing w:after="40"/>
               <w:rPr>
                 <w:sz w:val="24"/>
                 <w:szCs w:val="24"/>
@@ -4950,7 +4906,7 @@
           </w:tcPr>
           <w:p>
             <w:pPr>
-              <w:spacing w:after="40" w:line="240" w:lineRule="auto"/>
+              <w:spacing w:after="40"/>
               <w:rPr>
                 <w:sz w:val="24"/>
                 <w:szCs w:val="24"/>
@@ -4971,7 +4927,7 @@
           </w:tcPr>
           <w:p>
             <w:pPr>
-              <w:spacing w:after="40" w:line="240" w:lineRule="auto"/>
+              <w:spacing w:after="40"/>
               <w:rPr>
                 <w:sz w:val="24"/>
                 <w:szCs w:val="24"/>
@@ -4992,7 +4948,7 @@
           </w:tcPr>
           <w:p>
             <w:pPr>
-              <w:spacing w:after="40" w:line="240" w:lineRule="auto"/>
+              <w:spacing w:after="40"/>
             </w:pPr>
             <w:r>
               <w:rPr>
@@ -6333,7 +6289,7 @@
           </w:tcPr>
           <w:p>
             <w:pPr>
-              <w:spacing w:after="40" w:line="240" w:lineRule="auto"/>
+              <w:spacing w:after="40"/>
             </w:pPr>
             <w:r>
               <w:rPr>
@@ -6350,7 +6306,7 @@
           </w:tcPr>
           <w:p>
             <w:pPr>
-              <w:spacing w:after="40" w:line="240" w:lineRule="auto"/>
+              <w:spacing w:after="40"/>
             </w:pPr>
             <w:r>
               <w:rPr>
@@ -6367,7 +6323,7 @@
           </w:tcPr>
           <w:p>
             <w:pPr>
-              <w:spacing w:after="40" w:line="240" w:lineRule="auto"/>
+              <w:spacing w:after="40"/>
             </w:pPr>
             <w:r>
               <w:rPr>
@@ -6384,7 +6340,7 @@
           </w:tcPr>
           <w:p>
             <w:pPr>
-              <w:spacing w:after="40" w:line="240" w:lineRule="auto"/>
+              <w:spacing w:after="40"/>
             </w:pPr>
             <w:r>
               <w:rPr>
@@ -6401,7 +6357,7 @@
           </w:tcPr>
           <w:p>
             <w:pPr>
-              <w:spacing w:after="40" w:line="240" w:lineRule="auto"/>
+              <w:spacing w:after="40"/>
             </w:pPr>
             <w:r>
               <w:rPr>
@@ -6423,7 +6379,7 @@
           </w:tcPr>
           <w:p>
             <w:pPr>
-              <w:spacing w:after="40" w:line="240" w:lineRule="auto"/>
+              <w:spacing w:after="40"/>
               <w:rPr>
                 <w:sz w:val="24"/>
                 <w:szCs w:val="24"/>
@@ -6444,7 +6400,7 @@
           </w:tcPr>
           <w:p>
             <w:pPr>
-              <w:spacing w:after="40" w:line="240" w:lineRule="auto"/>
+              <w:spacing w:after="40"/>
               <w:rPr>
                 <w:sz w:val="24"/>
                 <w:szCs w:val="24"/>
@@ -6465,7 +6421,7 @@
           </w:tcPr>
           <w:p>
             <w:pPr>
-              <w:spacing w:after="40" w:line="240" w:lineRule="auto"/>
+              <w:spacing w:after="40"/>
               <w:rPr>
                 <w:sz w:val="24"/>
                 <w:szCs w:val="24"/>
@@ -6486,7 +6442,7 @@
           </w:tcPr>
           <w:p>
             <w:pPr>
-              <w:spacing w:after="40" w:line="240" w:lineRule="auto"/>
+              <w:spacing w:after="40"/>
               <w:rPr>
                 <w:sz w:val="24"/>
                 <w:szCs w:val="24"/>
@@ -6507,7 +6463,7 @@
           </w:tcPr>
           <w:p>
             <w:pPr>
-              <w:spacing w:after="40" w:line="240" w:lineRule="auto"/>
+              <w:spacing w:after="40"/>
               <w:rPr>
                 <w:sz w:val="24"/>
                 <w:szCs w:val="24"/>
@@ -6533,7 +6489,7 @@
           </w:tcPr>
           <w:p>
             <w:pPr>
-              <w:spacing w:after="40" w:line="240" w:lineRule="auto"/>
+              <w:spacing w:after="40"/>
               <w:rPr>
                 <w:sz w:val="24"/>
                 <w:szCs w:val="24"/>
@@ -6554,7 +6510,7 @@
           </w:tcPr>
           <w:p>
             <w:pPr>
-              <w:spacing w:after="40" w:line="240" w:lineRule="auto"/>
+              <w:spacing w:after="40"/>
               <w:rPr>
                 <w:sz w:val="24"/>
                 <w:szCs w:val="24"/>
@@ -6575,7 +6531,7 @@
           </w:tcPr>
           <w:p>
             <w:pPr>
-              <w:spacing w:after="40" w:line="240" w:lineRule="auto"/>
+              <w:spacing w:after="40"/>
               <w:rPr>
                 <w:sz w:val="24"/>
                 <w:szCs w:val="24"/>
@@ -6596,7 +6552,7 @@
           </w:tcPr>
           <w:p>
             <w:pPr>
-              <w:spacing w:after="40" w:line="240" w:lineRule="auto"/>
+              <w:spacing w:after="40"/>
               <w:rPr>
                 <w:sz w:val="24"/>
                 <w:szCs w:val="24"/>
@@ -6617,7 +6573,7 @@
           </w:tcPr>
           <w:p>
             <w:pPr>
-              <w:spacing w:after="40" w:line="240" w:lineRule="auto"/>
+              <w:spacing w:after="40"/>
               <w:rPr>
                 <w:sz w:val="24"/>
                 <w:szCs w:val="24"/>
@@ -6643,7 +6599,7 @@
           </w:tcPr>
           <w:p>
             <w:pPr>
-              <w:spacing w:after="40" w:line="240" w:lineRule="auto"/>
+              <w:spacing w:after="40"/>
               <w:rPr>
                 <w:sz w:val="24"/>
                 <w:szCs w:val="24"/>
@@ -6664,7 +6620,7 @@
           </w:tcPr>
           <w:p>
             <w:pPr>
-              <w:spacing w:after="40" w:line="240" w:lineRule="auto"/>
+              <w:spacing w:after="40"/>
               <w:rPr>
                 <w:sz w:val="24"/>
                 <w:szCs w:val="24"/>
@@ -6685,7 +6641,7 @@
           </w:tcPr>
           <w:p>
             <w:pPr>
-              <w:spacing w:after="40" w:line="240" w:lineRule="auto"/>
+              <w:spacing w:after="40"/>
               <w:rPr>
                 <w:sz w:val="24"/>
                 <w:szCs w:val="24"/>
@@ -6706,7 +6662,7 @@
           </w:tcPr>
           <w:p>
             <w:pPr>
-              <w:spacing w:after="40" w:line="240" w:lineRule="auto"/>
+              <w:spacing w:after="40"/>
               <w:rPr>
                 <w:sz w:val="24"/>
                 <w:szCs w:val="24"/>
@@ -6727,7 +6683,7 @@
           </w:tcPr>
           <w:p>
             <w:pPr>
-              <w:spacing w:after="40" w:line="240" w:lineRule="auto"/>
+              <w:spacing w:after="40"/>
               <w:rPr>
                 <w:sz w:val="24"/>
                 <w:szCs w:val="24"/>
@@ -6753,7 +6709,7 @@
           </w:tcPr>
           <w:p>
             <w:pPr>
-              <w:spacing w:after="40" w:line="240" w:lineRule="auto"/>
+              <w:spacing w:after="40"/>
               <w:rPr>
                 <w:sz w:val="24"/>
                 <w:szCs w:val="24"/>
@@ -6774,7 +6730,7 @@
           </w:tcPr>
           <w:p>
             <w:pPr>
-              <w:spacing w:after="40" w:line="240" w:lineRule="auto"/>
+              <w:spacing w:after="40"/>
               <w:rPr>
                 <w:sz w:val="24"/>
                 <w:szCs w:val="24"/>
@@ -6795,7 +6751,7 @@
           </w:tcPr>
           <w:p>
             <w:pPr>
-              <w:spacing w:after="40" w:line="240" w:lineRule="auto"/>
+              <w:spacing w:after="40"/>
               <w:rPr>
                 <w:sz w:val="24"/>
                 <w:szCs w:val="24"/>
@@ -6816,7 +6772,7 @@
           </w:tcPr>
           <w:p>
             <w:pPr>
-              <w:spacing w:after="40" w:line="240" w:lineRule="auto"/>
+              <w:spacing w:after="40"/>
               <w:rPr>
                 <w:sz w:val="24"/>
                 <w:szCs w:val="24"/>
@@ -6837,7 +6793,7 @@
           </w:tcPr>
           <w:p>
             <w:pPr>
-              <w:spacing w:after="40" w:line="240" w:lineRule="auto"/>
+              <w:spacing w:after="40"/>
               <w:rPr>
                 <w:sz w:val="24"/>
                 <w:szCs w:val="24"/>
@@ -7491,7 +7447,7 @@
           </w:tcPr>
           <w:p>
             <w:pPr>
-              <w:spacing w:after="40" w:line="240" w:lineRule="auto"/>
+              <w:spacing w:after="40"/>
             </w:pPr>
             <w:r>
               <w:rPr>
@@ -7508,7 +7464,7 @@
           </w:tcPr>
           <w:p>
             <w:pPr>
-              <w:spacing w:after="40" w:line="240" w:lineRule="auto"/>
+              <w:spacing w:after="40"/>
             </w:pPr>
             <w:r>
               <w:rPr>
@@ -7525,7 +7481,7 @@
           </w:tcPr>
           <w:p>
             <w:pPr>
-              <w:spacing w:after="40" w:line="240" w:lineRule="auto"/>
+              <w:spacing w:after="40"/>
             </w:pPr>
             <w:r>
               <w:rPr>
@@ -7542,7 +7498,7 @@
           </w:tcPr>
           <w:p>
             <w:pPr>
-              <w:spacing w:after="40" w:line="240" w:lineRule="auto"/>
+              <w:spacing w:after="40"/>
             </w:pPr>
             <w:r>
               <w:rPr>
@@ -7559,7 +7515,7 @@
           </w:tcPr>
           <w:p>
             <w:pPr>
-              <w:spacing w:after="40" w:line="240" w:lineRule="auto"/>
+              <w:spacing w:after="40"/>
             </w:pPr>
             <w:r>
               <w:rPr>
@@ -7576,7 +7532,7 @@
           </w:tcPr>
           <w:p>
             <w:pPr>
-              <w:spacing w:after="40" w:line="240" w:lineRule="auto"/>
+              <w:spacing w:after="40"/>
             </w:pPr>
             <w:r>
               <w:rPr>
@@ -7598,7 +7554,7 @@
           </w:tcPr>
           <w:p>
             <w:pPr>
-              <w:spacing w:after="40" w:line="240" w:lineRule="auto"/>
+              <w:spacing w:after="40"/>
               <w:rPr>
                 <w:sz w:val="24"/>
                 <w:szCs w:val="24"/>
@@ -7619,7 +7575,7 @@
           </w:tcPr>
           <w:p>
             <w:pPr>
-              <w:spacing w:after="40" w:line="240" w:lineRule="auto"/>
+              <w:spacing w:after="40"/>
               <w:rPr>
                 <w:sz w:val="24"/>
                 <w:szCs w:val="24"/>
@@ -7640,7 +7596,7 @@
           </w:tcPr>
           <w:p>
             <w:pPr>
-              <w:spacing w:after="40" w:line="240" w:lineRule="auto"/>
+              <w:spacing w:after="40"/>
               <w:rPr>
                 <w:sz w:val="24"/>
                 <w:szCs w:val="24"/>
@@ -7661,7 +7617,7 @@
           </w:tcPr>
           <w:p>
             <w:pPr>
-              <w:spacing w:after="40" w:line="240" w:lineRule="auto"/>
+              <w:spacing w:after="40"/>
               <w:rPr>
                 <w:sz w:val="24"/>
                 <w:szCs w:val="24"/>
@@ -7682,7 +7638,7 @@
           </w:tcPr>
           <w:p>
             <w:pPr>
-              <w:spacing w:after="40" w:line="240" w:lineRule="auto"/>
+              <w:spacing w:after="40"/>
               <w:rPr>
                 <w:sz w:val="24"/>
                 <w:szCs w:val="24"/>
@@ -7703,7 +7659,7 @@
           </w:tcPr>
           <w:p>
             <w:pPr>
-              <w:spacing w:after="40" w:line="240" w:lineRule="auto"/>
+              <w:spacing w:after="40"/>
               <w:rPr>
                 <w:sz w:val="24"/>
                 <w:szCs w:val="24"/>
@@ -7738,7 +7694,7 @@
           </w:tcPr>
           <w:p>
             <w:pPr>
-              <w:spacing w:after="40" w:line="240" w:lineRule="auto"/>
+              <w:spacing w:after="40"/>
               <w:rPr>
                 <w:sz w:val="24"/>
                 <w:szCs w:val="24"/>
@@ -7759,7 +7715,7 @@
           </w:tcPr>
           <w:p>
             <w:pPr>
-              <w:spacing w:after="40" w:line="240" w:lineRule="auto"/>
+              <w:spacing w:after="40"/>
               <w:rPr>
                 <w:sz w:val="24"/>
                 <w:szCs w:val="24"/>
@@ -7780,7 +7736,7 @@
           </w:tcPr>
           <w:p>
             <w:pPr>
-              <w:spacing w:after="40" w:line="240" w:lineRule="auto"/>
+              <w:spacing w:after="40"/>
               <w:rPr>
                 <w:sz w:val="24"/>
                 <w:szCs w:val="24"/>
@@ -7801,7 +7757,7 @@
           </w:tcPr>
           <w:p>
             <w:pPr>
-              <w:spacing w:after="40" w:line="240" w:lineRule="auto"/>
+              <w:spacing w:after="40"/>
               <w:rPr>
                 <w:sz w:val="24"/>
                 <w:szCs w:val="24"/>
@@ -7822,7 +7778,7 @@
           </w:tcPr>
           <w:p>
             <w:pPr>
-              <w:spacing w:after="40" w:line="240" w:lineRule="auto"/>
+              <w:spacing w:after="40"/>
               <w:rPr>
                 <w:sz w:val="24"/>
                 <w:szCs w:val="24"/>
@@ -7843,7 +7799,7 @@
           </w:tcPr>
           <w:p>
             <w:pPr>
-              <w:spacing w:after="40" w:line="240" w:lineRule="auto"/>
+              <w:spacing w:after="40"/>
               <w:rPr>
                 <w:sz w:val="24"/>
                 <w:szCs w:val="24"/>
@@ -7869,7 +7825,7 @@
           </w:tcPr>
           <w:p>
             <w:pPr>
-              <w:spacing w:after="40" w:line="240" w:lineRule="auto"/>
+              <w:spacing w:after="40"/>
               <w:rPr>
                 <w:sz w:val="24"/>
                 <w:szCs w:val="24"/>
@@ -7890,7 +7846,7 @@
           </w:tcPr>
           <w:p>
             <w:pPr>
-              <w:spacing w:after="40" w:line="240" w:lineRule="auto"/>
+              <w:spacing w:after="40"/>
               <w:rPr>
                 <w:sz w:val="24"/>
                 <w:szCs w:val="24"/>
@@ -7911,7 +7867,7 @@
           </w:tcPr>
           <w:p>
             <w:pPr>
-              <w:spacing w:after="40" w:line="240" w:lineRule="auto"/>
+              <w:spacing w:after="40"/>
               <w:rPr>
                 <w:sz w:val="24"/>
                 <w:szCs w:val="24"/>
@@ -7932,7 +7888,7 @@
           </w:tcPr>
           <w:p>
             <w:pPr>
-              <w:spacing w:after="40" w:line="240" w:lineRule="auto"/>
+              <w:spacing w:after="40"/>
               <w:rPr>
                 <w:sz w:val="24"/>
                 <w:szCs w:val="24"/>
@@ -7953,7 +7909,7 @@
           </w:tcPr>
           <w:p>
             <w:pPr>
-              <w:spacing w:after="40" w:line="240" w:lineRule="auto"/>
+              <w:spacing w:after="40"/>
               <w:rPr>
                 <w:sz w:val="24"/>
                 <w:szCs w:val="24"/>
@@ -7974,7 +7930,7 @@
           </w:tcPr>
           <w:p>
             <w:pPr>
-              <w:spacing w:after="40" w:line="240" w:lineRule="auto"/>
+              <w:spacing w:after="40"/>
               <w:rPr>
                 <w:sz w:val="24"/>
                 <w:szCs w:val="24"/>
@@ -8009,7 +7965,7 @@
           </w:tcPr>
           <w:p>
             <w:pPr>
-              <w:spacing w:after="40" w:line="240" w:lineRule="auto"/>
+              <w:spacing w:after="40"/>
               <w:rPr>
                 <w:sz w:val="24"/>
                 <w:szCs w:val="24"/>
@@ -8030,7 +7986,7 @@
           </w:tcPr>
           <w:p>
             <w:pPr>
-              <w:spacing w:after="40" w:line="240" w:lineRule="auto"/>
+              <w:spacing w:after="40"/>
               <w:rPr>
                 <w:sz w:val="24"/>
                 <w:szCs w:val="24"/>
@@ -8051,7 +8007,7 @@
           </w:tcPr>
           <w:p>
             <w:pPr>
-              <w:spacing w:after="40" w:line="240" w:lineRule="auto"/>
+              <w:spacing w:after="40"/>
               <w:rPr>
                 <w:sz w:val="24"/>
                 <w:szCs w:val="24"/>
@@ -8072,7 +8028,7 @@
           </w:tcPr>
           <w:p>
             <w:pPr>
-              <w:spacing w:after="40" w:line="240" w:lineRule="auto"/>
+              <w:spacing w:after="40"/>
               <w:rPr>
                 <w:sz w:val="24"/>
                 <w:szCs w:val="24"/>
@@ -8093,7 +8049,7 @@
           </w:tcPr>
           <w:p>
             <w:pPr>
-              <w:spacing w:after="40" w:line="240" w:lineRule="auto"/>
+              <w:spacing w:after="40"/>
               <w:rPr>
                 <w:sz w:val="24"/>
                 <w:szCs w:val="24"/>
@@ -8114,7 +8070,7 @@
           </w:tcPr>
           <w:p>
             <w:pPr>
-              <w:spacing w:after="40" w:line="240" w:lineRule="auto"/>
+              <w:spacing w:after="40"/>
               <w:rPr>
                 <w:sz w:val="24"/>
                 <w:szCs w:val="24"/>
@@ -8490,7 +8446,7 @@
           </w:tcPr>
           <w:p>
             <w:pPr>
-              <w:spacing w:after="40" w:line="240" w:lineRule="auto"/>
+              <w:spacing w:after="40"/>
             </w:pPr>
             <w:r>
               <w:rPr>
@@ -8507,7 +8463,7 @@
           </w:tcPr>
           <w:p>
             <w:pPr>
-              <w:spacing w:after="40" w:line="240" w:lineRule="auto"/>
+              <w:spacing w:after="40"/>
             </w:pPr>
             <w:r>
               <w:rPr>
@@ -8524,7 +8480,7 @@
           </w:tcPr>
           <w:p>
             <w:pPr>
-              <w:spacing w:after="40" w:line="240" w:lineRule="auto"/>
+              <w:spacing w:after="40"/>
             </w:pPr>
             <w:r>
               <w:rPr>
@@ -8546,7 +8502,7 @@
           </w:tcPr>
           <w:p>
             <w:pPr>
-              <w:spacing w:after="40" w:line="240" w:lineRule="auto"/>
+              <w:spacing w:after="40"/>
               <w:rPr>
                 <w:sz w:val="24"/>
                 <w:szCs w:val="24"/>
@@ -8567,7 +8523,7 @@
           </w:tcPr>
           <w:p>
             <w:pPr>
-              <w:spacing w:after="40" w:line="240" w:lineRule="auto"/>
+              <w:spacing w:after="40"/>
               <w:rPr>
                 <w:sz w:val="24"/>
                 <w:szCs w:val="24"/>
@@ -8588,7 +8544,7 @@
           </w:tcPr>
           <w:p>
             <w:pPr>
-              <w:spacing w:after="40" w:line="240" w:lineRule="auto"/>
+              <w:spacing w:after="40"/>
               <w:rPr>
                 <w:sz w:val="24"/>
                 <w:szCs w:val="24"/>
@@ -8614,7 +8570,7 @@
           </w:tcPr>
           <w:p>
             <w:pPr>
-              <w:spacing w:after="40" w:line="240" w:lineRule="auto"/>
+              <w:spacing w:after="40"/>
               <w:rPr>
                 <w:sz w:val="24"/>
                 <w:szCs w:val="24"/>
@@ -8635,7 +8591,7 @@
           </w:tcPr>
           <w:p>
             <w:pPr>
-              <w:spacing w:after="40" w:line="240" w:lineRule="auto"/>
+              <w:spacing w:after="40"/>
               <w:rPr>
                 <w:sz w:val="24"/>
                 <w:szCs w:val="24"/>
@@ -8656,7 +8612,7 @@
           </w:tcPr>
           <w:p>
             <w:pPr>
-              <w:spacing w:after="40" w:line="240" w:lineRule="auto"/>
+              <w:spacing w:after="40"/>
               <w:rPr>
                 <w:sz w:val="24"/>
                 <w:szCs w:val="24"/>
@@ -8682,7 +8638,7 @@
           </w:tcPr>
           <w:p>
             <w:pPr>
-              <w:spacing w:after="40" w:line="240" w:lineRule="auto"/>
+              <w:spacing w:after="40"/>
               <w:rPr>
                 <w:sz w:val="24"/>
                 <w:szCs w:val="24"/>
@@ -8703,7 +8659,7 @@
           </w:tcPr>
           <w:p>
             <w:pPr>
-              <w:spacing w:after="40" w:line="240" w:lineRule="auto"/>
+              <w:spacing w:after="40"/>
               <w:rPr>
                 <w:sz w:val="24"/>
                 <w:szCs w:val="24"/>
@@ -8724,7 +8680,7 @@
           </w:tcPr>
           <w:p>
             <w:pPr>
-              <w:spacing w:after="40" w:line="240" w:lineRule="auto"/>
+              <w:spacing w:after="40"/>
               <w:rPr>
                 <w:sz w:val="24"/>
                 <w:szCs w:val="24"/>
@@ -8750,7 +8706,7 @@
           </w:tcPr>
           <w:p>
             <w:pPr>
-              <w:spacing w:after="40" w:line="240" w:lineRule="auto"/>
+              <w:spacing w:after="40"/>
               <w:rPr>
                 <w:sz w:val="24"/>
                 <w:szCs w:val="24"/>
@@ -8771,7 +8727,7 @@
           </w:tcPr>
           <w:p>
             <w:pPr>
-              <w:spacing w:after="40" w:line="240" w:lineRule="auto"/>
+              <w:spacing w:after="40"/>
               <w:rPr>
                 <w:sz w:val="24"/>
                 <w:szCs w:val="24"/>
@@ -8792,7 +8748,7 @@
           </w:tcPr>
           <w:p>
             <w:pPr>
-              <w:spacing w:after="40" w:line="240" w:lineRule="auto"/>
+              <w:spacing w:after="40"/>
               <w:rPr>
                 <w:sz w:val="24"/>
                 <w:szCs w:val="24"/>
@@ -8818,7 +8774,7 @@
           </w:tcPr>
           <w:p>
             <w:pPr>
-              <w:spacing w:after="40" w:line="240" w:lineRule="auto"/>
+              <w:spacing w:after="40"/>
               <w:rPr>
                 <w:sz w:val="24"/>
                 <w:szCs w:val="24"/>
@@ -8839,7 +8795,7 @@
           </w:tcPr>
           <w:p>
             <w:pPr>
-              <w:spacing w:after="40" w:line="240" w:lineRule="auto"/>
+              <w:spacing w:after="40"/>
               <w:rPr>
                 <w:sz w:val="24"/>
                 <w:szCs w:val="24"/>
@@ -8860,7 +8816,7 @@
           </w:tcPr>
           <w:p>
             <w:pPr>
-              <w:spacing w:after="40" w:line="240" w:lineRule="auto"/>
+              <w:spacing w:after="40"/>
               <w:rPr>
                 <w:sz w:val="24"/>
                 <w:szCs w:val="24"/>
@@ -8947,7 +8903,7 @@
           </w:tcPr>
           <w:p>
             <w:pPr>
-              <w:spacing w:after="40" w:line="240" w:lineRule="auto"/>
+              <w:spacing w:after="40"/>
             </w:pPr>
             <w:r>
               <w:rPr>
@@ -8964,7 +8920,7 @@
           </w:tcPr>
           <w:p>
             <w:pPr>
-              <w:spacing w:after="40" w:line="240" w:lineRule="auto"/>
+              <w:spacing w:after="40"/>
             </w:pPr>
             <w:r>
               <w:rPr>
@@ -8981,7 +8937,7 @@
           </w:tcPr>
           <w:p>
             <w:pPr>
-              <w:spacing w:after="40" w:line="240" w:lineRule="auto"/>
+              <w:spacing w:after="40"/>
             </w:pPr>
             <w:r>
               <w:rPr>
@@ -8998,7 +8954,7 @@
           </w:tcPr>
           <w:p>
             <w:pPr>
-              <w:spacing w:after="40" w:line="240" w:lineRule="auto"/>
+              <w:spacing w:after="40"/>
             </w:pPr>
             <w:r>
               <w:rPr>
@@ -9015,7 +8971,7 @@
           </w:tcPr>
           <w:p>
             <w:pPr>
-              <w:spacing w:after="40" w:line="240" w:lineRule="auto"/>
+              <w:spacing w:after="40"/>
             </w:pPr>
             <w:r>
               <w:rPr>
@@ -9037,7 +8993,7 @@
           </w:tcPr>
           <w:p>
             <w:pPr>
-              <w:spacing w:after="40" w:line="240" w:lineRule="auto"/>
+              <w:spacing w:after="40"/>
               <w:rPr>
                 <w:sz w:val="24"/>
                 <w:szCs w:val="24"/>
@@ -9058,7 +9014,7 @@
           </w:tcPr>
           <w:p>
             <w:pPr>
-              <w:spacing w:after="40" w:line="240" w:lineRule="auto"/>
+              <w:spacing w:after="40"/>
               <w:rPr>
                 <w:sz w:val="24"/>
                 <w:szCs w:val="24"/>
@@ -9079,7 +9035,7 @@
           </w:tcPr>
           <w:p>
             <w:pPr>
-              <w:spacing w:after="40" w:line="240" w:lineRule="auto"/>
+              <w:spacing w:after="40"/>
               <w:rPr>
                 <w:sz w:val="24"/>
                 <w:szCs w:val="24"/>
@@ -9100,7 +9056,7 @@
           </w:tcPr>
           <w:p>
             <w:pPr>
-              <w:spacing w:after="40" w:line="240" w:lineRule="auto"/>
+              <w:spacing w:after="40"/>
               <w:rPr>
                 <w:sz w:val="24"/>
                 <w:szCs w:val="24"/>
@@ -9121,7 +9077,7 @@
           </w:tcPr>
           <w:p>
             <w:pPr>
-              <w:spacing w:after="40" w:line="240" w:lineRule="auto"/>
+              <w:spacing w:after="40"/>
               <w:rPr>
                 <w:sz w:val="24"/>
                 <w:szCs w:val="24"/>
@@ -9400,7 +9356,7 @@
           </w:tcPr>
           <w:p>
             <w:pPr>
-              <w:spacing w:after="40" w:line="240" w:lineRule="auto"/>
+              <w:spacing w:after="40"/>
             </w:pPr>
             <w:r>
               <w:rPr>
@@ -9417,7 +9373,7 @@
           </w:tcPr>
           <w:p>
             <w:pPr>
-              <w:spacing w:after="40" w:line="240" w:lineRule="auto"/>
+              <w:spacing w:after="40"/>
             </w:pPr>
             <w:r>
               <w:rPr>
@@ -9434,7 +9390,7 @@
           </w:tcPr>
           <w:p>
             <w:pPr>
-              <w:spacing w:after="40" w:line="240" w:lineRule="auto"/>
+              <w:spacing w:after="40"/>
             </w:pPr>
             <w:r>
               <w:rPr>
@@ -9451,7 +9407,7 @@
           </w:tcPr>
           <w:p>
             <w:pPr>
-              <w:spacing w:after="40" w:line="240" w:lineRule="auto"/>
+              <w:spacing w:after="40"/>
             </w:pPr>
             <w:r>
               <w:rPr>
@@ -9468,7 +9424,7 @@
           </w:tcPr>
           <w:p>
             <w:pPr>
-              <w:spacing w:after="40" w:line="240" w:lineRule="auto"/>
+              <w:spacing w:after="40"/>
             </w:pPr>
             <w:r>
               <w:rPr>
@@ -9485,7 +9441,7 @@
           </w:tcPr>
           <w:p>
             <w:pPr>
-              <w:spacing w:after="40" w:line="240" w:lineRule="auto"/>
+              <w:spacing w:after="40"/>
             </w:pPr>
             <w:r>
               <w:rPr>
@@ -9507,7 +9463,7 @@
           </w:tcPr>
           <w:p>
             <w:pPr>
-              <w:spacing w:after="40" w:line="240" w:lineRule="auto"/>
+              <w:spacing w:after="40"/>
               <w:rPr>
                 <w:sz w:val="24"/>
                 <w:szCs w:val="24"/>
@@ -9536,7 +9492,7 @@
           </w:tcPr>
           <w:p>
             <w:pPr>
-              <w:spacing w:after="40" w:line="240" w:lineRule="auto"/>
+              <w:spacing w:after="40"/>
               <w:rPr>
                 <w:sz w:val="24"/>
                 <w:szCs w:val="24"/>
@@ -9558,7 +9514,7 @@
           </w:tcPr>
           <w:p>
             <w:pPr>
-              <w:spacing w:after="40" w:line="240" w:lineRule="auto"/>
+              <w:spacing w:after="40"/>
               <w:rPr>
                 <w:sz w:val="24"/>
                 <w:szCs w:val="24"/>
@@ -9579,7 +9535,7 @@
           </w:tcPr>
           <w:p>
             <w:pPr>
-              <w:spacing w:after="40" w:line="240" w:lineRule="auto"/>
+              <w:spacing w:after="40"/>
               <w:rPr>
                 <w:sz w:val="24"/>
                 <w:szCs w:val="24"/>
@@ -9600,7 +9556,7 @@
           </w:tcPr>
           <w:p>
             <w:pPr>
-              <w:spacing w:after="40" w:line="240" w:lineRule="auto"/>
+              <w:spacing w:after="40"/>
               <w:rPr>
                 <w:sz w:val="24"/>
                 <w:szCs w:val="24"/>
@@ -9621,7 +9577,7 @@
           </w:tcPr>
           <w:p>
             <w:pPr>
-              <w:spacing w:after="40" w:line="240" w:lineRule="auto"/>
+              <w:spacing w:after="40"/>
               <w:rPr>
                 <w:sz w:val="24"/>
                 <w:szCs w:val="24"/>
@@ -9647,7 +9603,7 @@
           </w:tcPr>
           <w:p>
             <w:pPr>
-              <w:spacing w:after="40" w:line="240" w:lineRule="auto"/>
+              <w:spacing w:after="40"/>
               <w:rPr>
                 <w:sz w:val="24"/>
                 <w:szCs w:val="24"/>
@@ -9668,7 +9624,7 @@
           </w:tcPr>
           <w:p>
             <w:pPr>
-              <w:spacing w:after="40" w:line="240" w:lineRule="auto"/>
+              <w:spacing w:after="40"/>
               <w:rPr>
                 <w:sz w:val="24"/>
                 <w:szCs w:val="24"/>
@@ -9689,7 +9645,7 @@
           </w:tcPr>
           <w:p>
             <w:pPr>
-              <w:spacing w:after="40" w:line="240" w:lineRule="auto"/>
+              <w:spacing w:after="40"/>
               <w:rPr>
                 <w:sz w:val="24"/>
                 <w:szCs w:val="24"/>
@@ -9710,7 +9666,7 @@
           </w:tcPr>
           <w:p>
             <w:pPr>
-              <w:spacing w:after="40" w:line="240" w:lineRule="auto"/>
+              <w:spacing w:after="40"/>
               <w:rPr>
                 <w:sz w:val="24"/>
                 <w:szCs w:val="24"/>
@@ -9731,7 +9687,7 @@
           </w:tcPr>
           <w:p>
             <w:pPr>
-              <w:spacing w:after="40" w:line="240" w:lineRule="auto"/>
+              <w:spacing w:after="40"/>
               <w:rPr>
                 <w:sz w:val="24"/>
                 <w:szCs w:val="24"/>
@@ -9752,7 +9708,7 @@
           </w:tcPr>
           <w:p>
             <w:pPr>
-              <w:spacing w:after="40" w:line="240" w:lineRule="auto"/>
+              <w:spacing w:after="40"/>
               <w:rPr>
                 <w:sz w:val="24"/>
                 <w:szCs w:val="24"/>
@@ -9778,7 +9734,7 @@
           </w:tcPr>
           <w:p>
             <w:pPr>
-              <w:spacing w:after="40" w:line="240" w:lineRule="auto"/>
+              <w:spacing w:after="40"/>
               <w:rPr>
                 <w:sz w:val="24"/>
                 <w:szCs w:val="24"/>
@@ -9799,7 +9755,7 @@
           </w:tcPr>
           <w:p>
             <w:pPr>
-              <w:spacing w:after="40" w:line="240" w:lineRule="auto"/>
+              <w:spacing w:after="40"/>
               <w:rPr>
                 <w:sz w:val="24"/>
                 <w:szCs w:val="24"/>
@@ -9820,7 +9776,7 @@
           </w:tcPr>
           <w:p>
             <w:pPr>
-              <w:spacing w:after="40" w:line="240" w:lineRule="auto"/>
+              <w:spacing w:after="40"/>
               <w:rPr>
                 <w:sz w:val="24"/>
                 <w:szCs w:val="24"/>
@@ -9841,7 +9797,7 @@
           </w:tcPr>
           <w:p>
             <w:pPr>
-              <w:spacing w:after="40" w:line="240" w:lineRule="auto"/>
+              <w:spacing w:after="40"/>
               <w:rPr>
                 <w:sz w:val="24"/>
                 <w:szCs w:val="24"/>
@@ -9862,7 +9818,7 @@
           </w:tcPr>
           <w:p>
             <w:pPr>
-              <w:spacing w:after="40" w:line="240" w:lineRule="auto"/>
+              <w:spacing w:after="40"/>
               <w:rPr>
                 <w:sz w:val="24"/>
                 <w:szCs w:val="24"/>
@@ -9883,7 +9839,7 @@
           </w:tcPr>
           <w:p>
             <w:pPr>
-              <w:spacing w:after="40" w:line="240" w:lineRule="auto"/>
+              <w:spacing w:after="40"/>
               <w:rPr>
                 <w:sz w:val="24"/>
                 <w:szCs w:val="24"/>
@@ -9909,7 +9865,7 @@
           </w:tcPr>
           <w:p>
             <w:pPr>
-              <w:spacing w:after="40" w:line="240" w:lineRule="auto"/>
+              <w:spacing w:after="40"/>
               <w:rPr>
                 <w:sz w:val="24"/>
                 <w:szCs w:val="24"/>
@@ -9930,7 +9886,7 @@
           </w:tcPr>
           <w:p>
             <w:pPr>
-              <w:spacing w:after="40" w:line="240" w:lineRule="auto"/>
+              <w:spacing w:after="40"/>
               <w:rPr>
                 <w:sz w:val="24"/>
                 <w:szCs w:val="24"/>
@@ -9951,7 +9907,7 @@
           </w:tcPr>
           <w:p>
             <w:pPr>
-              <w:spacing w:after="40" w:line="240" w:lineRule="auto"/>
+              <w:spacing w:after="40"/>
               <w:rPr>
                 <w:sz w:val="24"/>
                 <w:szCs w:val="24"/>
@@ -9972,7 +9928,7 @@
           </w:tcPr>
           <w:p>
             <w:pPr>
-              <w:spacing w:after="40" w:line="240" w:lineRule="auto"/>
+              <w:spacing w:after="40"/>
               <w:rPr>
                 <w:sz w:val="24"/>
                 <w:szCs w:val="24"/>
@@ -9993,7 +9949,7 @@
           </w:tcPr>
           <w:p>
             <w:pPr>
-              <w:spacing w:after="40" w:line="240" w:lineRule="auto"/>
+              <w:spacing w:after="40"/>
               <w:rPr>
                 <w:sz w:val="24"/>
                 <w:szCs w:val="24"/>
@@ -10014,7 +9970,7 @@
           </w:tcPr>
           <w:p>
             <w:pPr>
-              <w:spacing w:after="40" w:line="240" w:lineRule="auto"/>
+              <w:spacing w:after="40"/>
               <w:rPr>
                 <w:sz w:val="24"/>
                 <w:szCs w:val="24"/>
@@ -10040,7 +9996,7 @@
           </w:tcPr>
           <w:p>
             <w:pPr>
-              <w:spacing w:after="40" w:line="240" w:lineRule="auto"/>
+              <w:spacing w:after="40"/>
               <w:rPr>
                 <w:sz w:val="24"/>
                 <w:szCs w:val="24"/>
@@ -10061,7 +10017,7 @@
           </w:tcPr>
           <w:p>
             <w:pPr>
-              <w:spacing w:after="40" w:line="240" w:lineRule="auto"/>
+              <w:spacing w:after="40"/>
               <w:rPr>
                 <w:sz w:val="24"/>
                 <w:szCs w:val="24"/>
@@ -10082,7 +10038,7 @@
           </w:tcPr>
           <w:p>
             <w:pPr>
-              <w:spacing w:after="40" w:line="240" w:lineRule="auto"/>
+              <w:spacing w:after="40"/>
               <w:rPr>
                 <w:sz w:val="24"/>
                 <w:szCs w:val="24"/>
@@ -10103,7 +10059,7 @@
           </w:tcPr>
           <w:p>
             <w:pPr>
-              <w:spacing w:after="40" w:line="240" w:lineRule="auto"/>
+              <w:spacing w:after="40"/>
               <w:rPr>
                 <w:sz w:val="24"/>
                 <w:szCs w:val="24"/>
@@ -10124,7 +10080,7 @@
           </w:tcPr>
           <w:p>
             <w:pPr>
-              <w:spacing w:after="40" w:line="240" w:lineRule="auto"/>
+              <w:spacing w:after="40"/>
               <w:rPr>
                 <w:sz w:val="24"/>
                 <w:szCs w:val="24"/>
@@ -10145,7 +10101,7 @@
           </w:tcPr>
           <w:p>
             <w:pPr>
-              <w:spacing w:after="40" w:line="240" w:lineRule="auto"/>
+              <w:spacing w:after="40"/>
               <w:rPr>
                 <w:sz w:val="24"/>
                 <w:szCs w:val="24"/>
@@ -10987,7 +10943,7 @@
                     <pic:cNvPicPr/>
                   </pic:nvPicPr>
                   <pic:blipFill>
-                    <a:blip r:embed="rId7"/>
+                    <a:blip r:embed="rId9"/>
                     <a:stretch>
                       <a:fillRect/>
                     </a:stretch>
@@ -11131,7 +11087,7 @@
           </w:tcPr>
           <w:p>
             <w:pPr>
-              <w:spacing w:after="40" w:line="240" w:lineRule="auto"/>
+              <w:spacing w:after="40"/>
             </w:pPr>
             <w:r>
               <w:rPr>
@@ -11148,7 +11104,7 @@
           </w:tcPr>
           <w:p>
             <w:pPr>
-              <w:spacing w:after="40" w:line="240" w:lineRule="auto"/>
+              <w:spacing w:after="40"/>
             </w:pPr>
             <w:r>
               <w:rPr>
@@ -11165,7 +11121,7 @@
           </w:tcPr>
           <w:p>
             <w:pPr>
-              <w:spacing w:after="40" w:line="240" w:lineRule="auto"/>
+              <w:spacing w:after="40"/>
             </w:pPr>
             <w:r>
               <w:rPr>
@@ -11182,7 +11138,7 @@
           </w:tcPr>
           <w:p>
             <w:pPr>
-              <w:spacing w:after="40" w:line="240" w:lineRule="auto"/>
+              <w:spacing w:after="40"/>
             </w:pPr>
             <w:r>
               <w:rPr>
@@ -11199,7 +11155,7 @@
           </w:tcPr>
           <w:p>
             <w:pPr>
-              <w:spacing w:after="40" w:line="240" w:lineRule="auto"/>
+              <w:spacing w:after="40"/>
             </w:pPr>
             <w:r>
               <w:rPr>
@@ -11221,7 +11177,7 @@
           </w:tcPr>
           <w:p>
             <w:pPr>
-              <w:spacing w:after="40" w:line="240" w:lineRule="auto"/>
+              <w:spacing w:after="40"/>
               <w:rPr>
                 <w:sz w:val="24"/>
                 <w:szCs w:val="24"/>
@@ -11242,7 +11198,7 @@
           </w:tcPr>
           <w:p>
             <w:pPr>
-              <w:spacing w:after="40" w:line="240" w:lineRule="auto"/>
+              <w:spacing w:after="40"/>
               <w:rPr>
                 <w:sz w:val="24"/>
                 <w:szCs w:val="24"/>
@@ -11263,7 +11219,7 @@
           </w:tcPr>
           <w:p>
             <w:pPr>
-              <w:spacing w:after="40" w:line="240" w:lineRule="auto"/>
+              <w:spacing w:after="40"/>
               <w:rPr>
                 <w:sz w:val="24"/>
                 <w:szCs w:val="24"/>
@@ -11284,7 +11240,7 @@
           </w:tcPr>
           <w:p>
             <w:pPr>
-              <w:spacing w:after="40" w:line="240" w:lineRule="auto"/>
+              <w:spacing w:after="40"/>
               <w:rPr>
                 <w:sz w:val="24"/>
                 <w:szCs w:val="24"/>
@@ -11305,7 +11261,7 @@
           </w:tcPr>
           <w:p>
             <w:pPr>
-              <w:spacing w:after="40" w:line="240" w:lineRule="auto"/>
+              <w:spacing w:after="40"/>
               <w:rPr>
                 <w:sz w:val="24"/>
                 <w:szCs w:val="24"/>
@@ -11331,7 +11287,7 @@
           </w:tcPr>
           <w:p>
             <w:pPr>
-              <w:spacing w:after="40" w:line="240" w:lineRule="auto"/>
+              <w:spacing w:after="40"/>
               <w:rPr>
                 <w:sz w:val="24"/>
                 <w:szCs w:val="24"/>
@@ -11352,7 +11308,7 @@
           </w:tcPr>
           <w:p>
             <w:pPr>
-              <w:spacing w:after="40" w:line="240" w:lineRule="auto"/>
+              <w:spacing w:after="40"/>
               <w:rPr>
                 <w:sz w:val="24"/>
                 <w:szCs w:val="24"/>
@@ -11373,7 +11329,7 @@
           </w:tcPr>
           <w:p>
             <w:pPr>
-              <w:spacing w:after="40" w:line="240" w:lineRule="auto"/>
+              <w:spacing w:after="40"/>
               <w:rPr>
                 <w:sz w:val="24"/>
                 <w:szCs w:val="24"/>
@@ -11394,7 +11350,7 @@
           </w:tcPr>
           <w:p>
             <w:pPr>
-              <w:spacing w:after="40" w:line="240" w:lineRule="auto"/>
+              <w:spacing w:after="40"/>
               <w:rPr>
                 <w:sz w:val="24"/>
                 <w:szCs w:val="24"/>
@@ -11415,7 +11371,7 @@
           </w:tcPr>
           <w:p>
             <w:pPr>
-              <w:spacing w:after="40" w:line="240" w:lineRule="auto"/>
+              <w:spacing w:after="40"/>
               <w:rPr>
                 <w:sz w:val="24"/>
                 <w:szCs w:val="24"/>
@@ -11441,7 +11397,7 @@
           </w:tcPr>
           <w:p>
             <w:pPr>
-              <w:spacing w:after="40" w:line="240" w:lineRule="auto"/>
+              <w:spacing w:after="40"/>
               <w:rPr>
                 <w:sz w:val="24"/>
                 <w:szCs w:val="24"/>
@@ -11462,7 +11418,7 @@
           </w:tcPr>
           <w:p>
             <w:pPr>
-              <w:spacing w:after="40" w:line="240" w:lineRule="auto"/>
+              <w:spacing w:after="40"/>
               <w:rPr>
                 <w:sz w:val="24"/>
                 <w:szCs w:val="24"/>
@@ -11483,7 +11439,7 @@
           </w:tcPr>
           <w:p>
             <w:pPr>
-              <w:spacing w:after="40" w:line="240" w:lineRule="auto"/>
+              <w:spacing w:after="40"/>
               <w:rPr>
                 <w:sz w:val="24"/>
                 <w:szCs w:val="24"/>
@@ -11504,7 +11460,7 @@
           </w:tcPr>
           <w:p>
             <w:pPr>
-              <w:spacing w:after="40" w:line="240" w:lineRule="auto"/>
+              <w:spacing w:after="40"/>
               <w:rPr>
                 <w:sz w:val="24"/>
                 <w:szCs w:val="24"/>
@@ -11525,7 +11481,7 @@
           </w:tcPr>
           <w:p>
             <w:pPr>
-              <w:spacing w:after="40" w:line="240" w:lineRule="auto"/>
+              <w:spacing w:after="40"/>
               <w:rPr>
                 <w:sz w:val="24"/>
                 <w:szCs w:val="24"/>
@@ -11551,7 +11507,7 @@
           </w:tcPr>
           <w:p>
             <w:pPr>
-              <w:spacing w:after="40" w:line="240" w:lineRule="auto"/>
+              <w:spacing w:after="40"/>
               <w:rPr>
                 <w:sz w:val="24"/>
                 <w:szCs w:val="24"/>
@@ -11572,7 +11528,7 @@
           </w:tcPr>
           <w:p>
             <w:pPr>
-              <w:spacing w:after="40" w:line="240" w:lineRule="auto"/>
+              <w:spacing w:after="40"/>
             </w:pPr>
           </w:p>
         </w:tc>
@@ -11582,7 +11538,7 @@
           </w:tcPr>
           <w:p>
             <w:pPr>
-              <w:spacing w:after="40" w:line="240" w:lineRule="auto"/>
+              <w:spacing w:after="40"/>
             </w:pPr>
           </w:p>
         </w:tc>
@@ -11592,7 +11548,7 @@
           </w:tcPr>
           <w:p>
             <w:pPr>
-              <w:spacing w:after="40" w:line="240" w:lineRule="auto"/>
+              <w:spacing w:after="40"/>
               <w:rPr>
                 <w:sz w:val="24"/>
                 <w:szCs w:val="24"/>
@@ -11613,7 +11569,7 @@
           </w:tcPr>
           <w:p>
             <w:pPr>
-              <w:spacing w:after="40" w:line="240" w:lineRule="auto"/>
+              <w:spacing w:after="40"/>
               <w:rPr>
                 <w:sz w:val="24"/>
                 <w:szCs w:val="24"/>
@@ -11639,7 +11595,7 @@
           </w:tcPr>
           <w:p>
             <w:pPr>
-              <w:spacing w:after="40" w:line="240" w:lineRule="auto"/>
+              <w:spacing w:after="40"/>
               <w:rPr>
                 <w:sz w:val="24"/>
                 <w:szCs w:val="24"/>
@@ -11660,7 +11616,7 @@
           </w:tcPr>
           <w:p>
             <w:pPr>
-              <w:spacing w:after="40" w:line="240" w:lineRule="auto"/>
+              <w:spacing w:after="40"/>
             </w:pPr>
           </w:p>
         </w:tc>
@@ -11670,7 +11626,7 @@
           </w:tcPr>
           <w:p>
             <w:pPr>
-              <w:spacing w:after="40" w:line="240" w:lineRule="auto"/>
+              <w:spacing w:after="40"/>
             </w:pPr>
           </w:p>
         </w:tc>
@@ -11680,7 +11636,7 @@
           </w:tcPr>
           <w:p>
             <w:pPr>
-              <w:spacing w:after="40" w:line="240" w:lineRule="auto"/>
+              <w:spacing w:after="40"/>
               <w:rPr>
                 <w:sz w:val="24"/>
                 <w:szCs w:val="24"/>
@@ -11701,7 +11657,7 @@
           </w:tcPr>
           <w:p>
             <w:pPr>
-              <w:spacing w:after="40" w:line="240" w:lineRule="auto"/>
+              <w:spacing w:after="40"/>
             </w:pPr>
           </w:p>
         </w:tc>
@@ -11716,7 +11672,7 @@
           </w:tcPr>
           <w:p>
             <w:pPr>
-              <w:spacing w:after="40" w:line="240" w:lineRule="auto"/>
+              <w:spacing w:after="40"/>
               <w:rPr>
                 <w:sz w:val="24"/>
                 <w:szCs w:val="24"/>
@@ -11737,7 +11693,7 @@
           </w:tcPr>
           <w:p>
             <w:pPr>
-              <w:spacing w:after="40" w:line="240" w:lineRule="auto"/>
+              <w:spacing w:after="40"/>
             </w:pPr>
           </w:p>
         </w:tc>
@@ -11747,7 +11703,7 @@
           </w:tcPr>
           <w:p>
             <w:pPr>
-              <w:spacing w:after="40" w:line="240" w:lineRule="auto"/>
+              <w:spacing w:after="40"/>
             </w:pPr>
           </w:p>
         </w:tc>
@@ -11757,7 +11713,7 @@
           </w:tcPr>
           <w:p>
             <w:pPr>
-              <w:spacing w:after="40" w:line="240" w:lineRule="auto"/>
+              <w:spacing w:after="40"/>
               <w:rPr>
                 <w:sz w:val="24"/>
                 <w:szCs w:val="24"/>
@@ -11778,7 +11734,7 @@
           </w:tcPr>
           <w:p>
             <w:pPr>
-              <w:spacing w:after="40" w:line="240" w:lineRule="auto"/>
+              <w:spacing w:after="40"/>
             </w:pPr>
           </w:p>
         </w:tc>
@@ -11823,7 +11779,7 @@
           </w:tcPr>
           <w:p>
             <w:pPr>
-              <w:spacing w:after="40" w:line="240" w:lineRule="auto"/>
+              <w:spacing w:after="40"/>
             </w:pPr>
           </w:p>
         </w:tc>
@@ -11833,7 +11789,7 @@
           </w:tcPr>
           <w:p>
             <w:pPr>
-              <w:spacing w:after="40" w:line="240" w:lineRule="auto"/>
+              <w:spacing w:after="40"/>
             </w:pPr>
             <w:r>
               <w:rPr>
@@ -11850,7 +11806,7 @@
           </w:tcPr>
           <w:p>
             <w:pPr>
-              <w:spacing w:after="40" w:line="240" w:lineRule="auto"/>
+              <w:spacing w:after="40"/>
             </w:pPr>
             <w:r>
               <w:rPr>
@@ -11867,7 +11823,7 @@
           </w:tcPr>
           <w:p>
             <w:pPr>
-              <w:spacing w:after="40" w:line="240" w:lineRule="auto"/>
+              <w:spacing w:after="40"/>
             </w:pPr>
             <w:r>
               <w:rPr>
@@ -11889,7 +11845,7 @@
           </w:tcPr>
           <w:p>
             <w:pPr>
-              <w:spacing w:after="40" w:line="240" w:lineRule="auto"/>
+              <w:spacing w:after="40"/>
               <w:rPr>
                 <w:sz w:val="24"/>
                 <w:szCs w:val="24"/>
@@ -11910,7 +11866,7 @@
           </w:tcPr>
           <w:p>
             <w:pPr>
-              <w:spacing w:after="40" w:line="240" w:lineRule="auto"/>
+              <w:spacing w:after="40"/>
               <w:rPr>
                 <w:sz w:val="24"/>
                 <w:szCs w:val="24"/>
@@ -11931,7 +11887,7 @@
           </w:tcPr>
           <w:p>
             <w:pPr>
-              <w:spacing w:after="40" w:line="240" w:lineRule="auto"/>
+              <w:spacing w:after="40"/>
               <w:rPr>
                 <w:sz w:val="24"/>
                 <w:szCs w:val="24"/>
@@ -11952,7 +11908,7 @@
           </w:tcPr>
           <w:p>
             <w:pPr>
-              <w:spacing w:after="40" w:line="240" w:lineRule="auto"/>
+              <w:spacing w:after="40"/>
               <w:rPr>
                 <w:sz w:val="24"/>
                 <w:szCs w:val="24"/>
@@ -11978,7 +11934,7 @@
           </w:tcPr>
           <w:p>
             <w:pPr>
-              <w:spacing w:after="40" w:line="240" w:lineRule="auto"/>
+              <w:spacing w:after="40"/>
               <w:rPr>
                 <w:sz w:val="24"/>
                 <w:szCs w:val="24"/>
@@ -11999,7 +11955,7 @@
           </w:tcPr>
           <w:p>
             <w:pPr>
-              <w:spacing w:after="40" w:line="240" w:lineRule="auto"/>
+              <w:spacing w:after="40"/>
               <w:rPr>
                 <w:sz w:val="24"/>
                 <w:szCs w:val="24"/>
@@ -12020,7 +11976,7 @@
           </w:tcPr>
           <w:p>
             <w:pPr>
-              <w:spacing w:after="40" w:line="240" w:lineRule="auto"/>
+              <w:spacing w:after="40"/>
               <w:rPr>
                 <w:sz w:val="24"/>
                 <w:szCs w:val="24"/>
@@ -12041,7 +11997,7 @@
           </w:tcPr>
           <w:p>
             <w:pPr>
-              <w:spacing w:after="40" w:line="240" w:lineRule="auto"/>
+              <w:spacing w:after="40"/>
               <w:rPr>
                 <w:sz w:val="24"/>
                 <w:szCs w:val="24"/>
@@ -12067,7 +12023,7 @@
           </w:tcPr>
           <w:p>
             <w:pPr>
-              <w:spacing w:after="40" w:line="240" w:lineRule="auto"/>
+              <w:spacing w:after="40"/>
               <w:rPr>
                 <w:sz w:val="24"/>
                 <w:szCs w:val="24"/>
@@ -12088,7 +12044,7 @@
           </w:tcPr>
           <w:p>
             <w:pPr>
-              <w:spacing w:after="40" w:line="240" w:lineRule="auto"/>
+              <w:spacing w:after="40"/>
               <w:rPr>
                 <w:sz w:val="24"/>
                 <w:szCs w:val="24"/>
@@ -12109,7 +12065,7 @@
           </w:tcPr>
           <w:p>
             <w:pPr>
-              <w:spacing w:after="40" w:line="240" w:lineRule="auto"/>
+              <w:spacing w:after="40"/>
               <w:rPr>
                 <w:sz w:val="24"/>
                 <w:szCs w:val="24"/>
@@ -12130,7 +12086,7 @@
           </w:tcPr>
           <w:p>
             <w:pPr>
-              <w:spacing w:after="40" w:line="240" w:lineRule="auto"/>
+              <w:spacing w:after="40"/>
               <w:rPr>
                 <w:sz w:val="24"/>
                 <w:szCs w:val="24"/>
@@ -12172,7 +12128,7 @@
                     <pic:cNvPicPr/>
                   </pic:nvPicPr>
                   <pic:blipFill>
-                    <a:blip r:embed="rId8"/>
+                    <a:blip r:embed="rId10"/>
                     <a:stretch>
                       <a:fillRect/>
                     </a:stretch>
@@ -12229,7 +12185,7 @@
                     <pic:cNvPicPr/>
                   </pic:nvPicPr>
                   <pic:blipFill>
-                    <a:blip r:embed="rId9"/>
+                    <a:blip r:embed="rId11"/>
                     <a:stretch>
                       <a:fillRect/>
                     </a:stretch>
@@ -12382,7 +12338,7 @@
           </w:tcPr>
           <w:p>
             <w:pPr>
-              <w:spacing w:after="40" w:line="240" w:lineRule="auto"/>
+              <w:spacing w:after="40"/>
             </w:pPr>
           </w:p>
         </w:tc>
@@ -12392,7 +12348,7 @@
           </w:tcPr>
           <w:p>
             <w:pPr>
-              <w:spacing w:after="40" w:line="240" w:lineRule="auto"/>
+              <w:spacing w:after="40"/>
             </w:pPr>
             <w:r>
               <w:rPr>
@@ -12409,7 +12365,7 @@
           </w:tcPr>
           <w:p>
             <w:pPr>
-              <w:spacing w:after="40" w:line="240" w:lineRule="auto"/>
+              <w:spacing w:after="40"/>
             </w:pPr>
             <w:r>
               <w:rPr>
@@ -12431,7 +12387,7 @@
           </w:tcPr>
           <w:p>
             <w:pPr>
-              <w:spacing w:after="40" w:line="240" w:lineRule="auto"/>
+              <w:spacing w:after="40"/>
               <w:rPr>
                 <w:sz w:val="24"/>
                 <w:szCs w:val="24"/>
@@ -12452,7 +12408,7 @@
           </w:tcPr>
           <w:p>
             <w:pPr>
-              <w:spacing w:after="40" w:line="240" w:lineRule="auto"/>
+              <w:spacing w:after="40"/>
               <w:rPr>
                 <w:sz w:val="24"/>
                 <w:szCs w:val="24"/>
@@ -12473,7 +12429,7 @@
           </w:tcPr>
           <w:p>
             <w:pPr>
-              <w:spacing w:after="40" w:line="240" w:lineRule="auto"/>
+              <w:spacing w:after="40"/>
               <w:rPr>
                 <w:sz w:val="24"/>
                 <w:szCs w:val="24"/>
@@ -12499,7 +12455,7 @@
           </w:tcPr>
           <w:p>
             <w:pPr>
-              <w:spacing w:after="40" w:line="240" w:lineRule="auto"/>
+              <w:spacing w:after="40"/>
               <w:rPr>
                 <w:sz w:val="24"/>
                 <w:szCs w:val="24"/>
@@ -12520,7 +12476,7 @@
           </w:tcPr>
           <w:p>
             <w:pPr>
-              <w:spacing w:after="40" w:line="240" w:lineRule="auto"/>
+              <w:spacing w:after="40"/>
               <w:rPr>
                 <w:sz w:val="24"/>
                 <w:szCs w:val="24"/>
@@ -12541,7 +12497,7 @@
           </w:tcPr>
           <w:p>
             <w:pPr>
-              <w:spacing w:after="40" w:line="240" w:lineRule="auto"/>
+              <w:spacing w:after="40"/>
               <w:rPr>
                 <w:sz w:val="24"/>
                 <w:szCs w:val="24"/>
@@ -12567,7 +12523,7 @@
           </w:tcPr>
           <w:p>
             <w:pPr>
-              <w:spacing w:after="40" w:line="240" w:lineRule="auto"/>
+              <w:spacing w:after="40"/>
               <w:rPr>
                 <w:sz w:val="24"/>
                 <w:szCs w:val="24"/>
@@ -12588,7 +12544,7 @@
           </w:tcPr>
           <w:p>
             <w:pPr>
-              <w:spacing w:after="40" w:line="240" w:lineRule="auto"/>
+              <w:spacing w:after="40"/>
               <w:rPr>
                 <w:sz w:val="24"/>
                 <w:szCs w:val="24"/>
@@ -12609,7 +12565,7 @@
           </w:tcPr>
           <w:p>
             <w:pPr>
-              <w:spacing w:after="40" w:line="240" w:lineRule="auto"/>
+              <w:spacing w:after="40"/>
               <w:rPr>
                 <w:sz w:val="24"/>
                 <w:szCs w:val="24"/>
@@ -12635,7 +12591,7 @@
           </w:tcPr>
           <w:p>
             <w:pPr>
-              <w:spacing w:after="40" w:line="240" w:lineRule="auto"/>
+              <w:spacing w:after="40"/>
               <w:rPr>
                 <w:sz w:val="24"/>
                 <w:szCs w:val="24"/>
@@ -12656,7 +12612,7 @@
           </w:tcPr>
           <w:p>
             <w:pPr>
-              <w:spacing w:after="40" w:line="240" w:lineRule="auto"/>
+              <w:spacing w:after="40"/>
               <w:rPr>
                 <w:sz w:val="24"/>
                 <w:szCs w:val="24"/>
@@ -12677,7 +12633,7 @@
           </w:tcPr>
           <w:p>
             <w:pPr>
-              <w:spacing w:after="40" w:line="240" w:lineRule="auto"/>
+              <w:spacing w:after="40"/>
               <w:rPr>
                 <w:sz w:val="24"/>
                 <w:szCs w:val="24"/>
@@ -12703,7 +12659,7 @@
           </w:tcPr>
           <w:p>
             <w:pPr>
-              <w:spacing w:after="40" w:line="240" w:lineRule="auto"/>
+              <w:spacing w:after="40"/>
               <w:rPr>
                 <w:sz w:val="24"/>
                 <w:szCs w:val="24"/>
@@ -12724,7 +12680,7 @@
           </w:tcPr>
           <w:p>
             <w:pPr>
-              <w:spacing w:after="40" w:line="240" w:lineRule="auto"/>
+              <w:spacing w:after="40"/>
               <w:rPr>
                 <w:sz w:val="24"/>
                 <w:szCs w:val="24"/>
@@ -12745,7 +12701,7 @@
           </w:tcPr>
           <w:p>
             <w:pPr>
-              <w:spacing w:after="40" w:line="240" w:lineRule="auto"/>
+              <w:spacing w:after="40"/>
               <w:rPr>
                 <w:sz w:val="24"/>
                 <w:szCs w:val="24"/>
@@ -13392,7 +13348,7 @@
           </w:tcPr>
           <w:p>
             <w:pPr>
-              <w:spacing w:after="40" w:line="240" w:lineRule="auto"/>
+              <w:spacing w:after="40"/>
             </w:pPr>
             <w:r>
               <w:rPr>
@@ -13409,7 +13365,7 @@
           </w:tcPr>
           <w:p>
             <w:pPr>
-              <w:spacing w:after="40" w:line="240" w:lineRule="auto"/>
+              <w:spacing w:after="40"/>
             </w:pPr>
             <w:r>
               <w:rPr>
@@ -13426,7 +13382,7 @@
           </w:tcPr>
           <w:p>
             <w:pPr>
-              <w:spacing w:after="40" w:line="240" w:lineRule="auto"/>
+              <w:spacing w:after="40"/>
             </w:pPr>
             <w:r>
               <w:rPr>
@@ -13443,7 +13399,7 @@
           </w:tcPr>
           <w:p>
             <w:pPr>
-              <w:spacing w:after="40" w:line="240" w:lineRule="auto"/>
+              <w:spacing w:after="40"/>
             </w:pPr>
             <w:r>
               <w:rPr>
@@ -13460,7 +13416,7 @@
           </w:tcPr>
           <w:p>
             <w:pPr>
-              <w:spacing w:after="40" w:line="240" w:lineRule="auto"/>
+              <w:spacing w:after="40"/>
             </w:pPr>
             <w:r>
               <w:rPr>
@@ -13477,7 +13433,7 @@
           </w:tcPr>
           <w:p>
             <w:pPr>
-              <w:spacing w:after="40" w:line="240" w:lineRule="auto"/>
+              <w:spacing w:after="40"/>
             </w:pPr>
             <w:r>
               <w:rPr>
@@ -13499,7 +13455,7 @@
           </w:tcPr>
           <w:p>
             <w:pPr>
-              <w:spacing w:after="40" w:line="240" w:lineRule="auto"/>
+              <w:spacing w:after="40"/>
               <w:rPr>
                 <w:sz w:val="24"/>
                 <w:szCs w:val="24"/>
@@ -13520,7 +13476,7 @@
           </w:tcPr>
           <w:p>
             <w:pPr>
-              <w:spacing w:after="40" w:line="240" w:lineRule="auto"/>
+              <w:spacing w:after="40"/>
               <w:rPr>
                 <w:sz w:val="24"/>
                 <w:szCs w:val="24"/>
@@ -13541,7 +13497,7 @@
           </w:tcPr>
           <w:p>
             <w:pPr>
-              <w:spacing w:after="40" w:line="240" w:lineRule="auto"/>
+              <w:spacing w:after="40"/>
               <w:rPr>
                 <w:sz w:val="24"/>
                 <w:szCs w:val="24"/>
@@ -13562,7 +13518,7 @@
           </w:tcPr>
           <w:p>
             <w:pPr>
-              <w:spacing w:after="40" w:line="240" w:lineRule="auto"/>
+              <w:spacing w:after="40"/>
               <w:rPr>
                 <w:sz w:val="24"/>
                 <w:szCs w:val="24"/>
@@ -13583,7 +13539,7 @@
           </w:tcPr>
           <w:p>
             <w:pPr>
-              <w:spacing w:after="40" w:line="240" w:lineRule="auto"/>
+              <w:spacing w:after="40"/>
               <w:rPr>
                 <w:sz w:val="24"/>
                 <w:szCs w:val="24"/>
@@ -13604,7 +13560,7 @@
           </w:tcPr>
           <w:p>
             <w:pPr>
-              <w:spacing w:after="40" w:line="240" w:lineRule="auto"/>
+              <w:spacing w:after="40"/>
               <w:rPr>
                 <w:sz w:val="24"/>
                 <w:szCs w:val="24"/>
@@ -13630,7 +13586,7 @@
           </w:tcPr>
           <w:p>
             <w:pPr>
-              <w:spacing w:after="40" w:line="240" w:lineRule="auto"/>
+              <w:spacing w:after="40"/>
               <w:rPr>
                 <w:sz w:val="24"/>
                 <w:szCs w:val="24"/>
@@ -13651,7 +13607,7 @@
           </w:tcPr>
           <w:p>
             <w:pPr>
-              <w:spacing w:after="40" w:line="240" w:lineRule="auto"/>
+              <w:spacing w:after="40"/>
               <w:rPr>
                 <w:sz w:val="24"/>
                 <w:szCs w:val="24"/>
@@ -13672,7 +13628,7 @@
           </w:tcPr>
           <w:p>
             <w:pPr>
-              <w:spacing w:after="40" w:line="240" w:lineRule="auto"/>
+              <w:spacing w:after="40"/>
               <w:rPr>
                 <w:sz w:val="24"/>
                 <w:szCs w:val="24"/>
@@ -13693,7 +13649,7 @@
           </w:tcPr>
           <w:p>
             <w:pPr>
-              <w:spacing w:after="40" w:line="240" w:lineRule="auto"/>
+              <w:spacing w:after="40"/>
               <w:rPr>
                 <w:sz w:val="24"/>
                 <w:szCs w:val="24"/>
@@ -13714,7 +13670,7 @@
           </w:tcPr>
           <w:p>
             <w:pPr>
-              <w:spacing w:after="40" w:line="240" w:lineRule="auto"/>
+              <w:spacing w:after="40"/>
               <w:rPr>
                 <w:sz w:val="24"/>
                 <w:szCs w:val="24"/>
@@ -13735,7 +13691,7 @@
           </w:tcPr>
           <w:p>
             <w:pPr>
-              <w:spacing w:after="40" w:line="240" w:lineRule="auto"/>
+              <w:spacing w:after="40"/>
               <w:rPr>
                 <w:sz w:val="24"/>
                 <w:szCs w:val="24"/>
@@ -13761,7 +13717,7 @@
           </w:tcPr>
           <w:p>
             <w:pPr>
-              <w:spacing w:after="40" w:line="240" w:lineRule="auto"/>
+              <w:spacing w:after="40"/>
               <w:rPr>
                 <w:sz w:val="24"/>
                 <w:szCs w:val="24"/>
@@ -13782,7 +13738,7 @@
           </w:tcPr>
           <w:p>
             <w:pPr>
-              <w:spacing w:after="40" w:line="240" w:lineRule="auto"/>
+              <w:spacing w:after="40"/>
               <w:rPr>
                 <w:sz w:val="24"/>
                 <w:szCs w:val="24"/>
@@ -13803,7 +13759,7 @@
           </w:tcPr>
           <w:p>
             <w:pPr>
-              <w:spacing w:after="40" w:line="240" w:lineRule="auto"/>
+              <w:spacing w:after="40"/>
               <w:rPr>
                 <w:sz w:val="24"/>
                 <w:szCs w:val="24"/>
@@ -13824,7 +13780,7 @@
           </w:tcPr>
           <w:p>
             <w:pPr>
-              <w:spacing w:after="40" w:line="240" w:lineRule="auto"/>
+              <w:spacing w:after="40"/>
               <w:rPr>
                 <w:sz w:val="24"/>
                 <w:szCs w:val="24"/>
@@ -13845,7 +13801,7 @@
           </w:tcPr>
           <w:p>
             <w:pPr>
-              <w:spacing w:after="40" w:line="240" w:lineRule="auto"/>
+              <w:spacing w:after="40"/>
               <w:rPr>
                 <w:sz w:val="24"/>
                 <w:szCs w:val="24"/>
@@ -13866,7 +13822,7 @@
           </w:tcPr>
           <w:p>
             <w:pPr>
-              <w:spacing w:after="40" w:line="240" w:lineRule="auto"/>
+              <w:spacing w:after="40"/>
               <w:rPr>
                 <w:sz w:val="24"/>
                 <w:szCs w:val="24"/>
@@ -13892,7 +13848,7 @@
           </w:tcPr>
           <w:p>
             <w:pPr>
-              <w:spacing w:after="40" w:line="240" w:lineRule="auto"/>
+              <w:spacing w:after="40"/>
               <w:rPr>
                 <w:sz w:val="24"/>
                 <w:szCs w:val="24"/>
@@ -13913,7 +13869,7 @@
           </w:tcPr>
           <w:p>
             <w:pPr>
-              <w:spacing w:after="40" w:line="240" w:lineRule="auto"/>
+              <w:spacing w:after="40"/>
               <w:rPr>
                 <w:sz w:val="24"/>
                 <w:szCs w:val="24"/>
@@ -13934,7 +13890,7 @@
           </w:tcPr>
           <w:p>
             <w:pPr>
-              <w:spacing w:after="40" w:line="240" w:lineRule="auto"/>
+              <w:spacing w:after="40"/>
               <w:rPr>
                 <w:sz w:val="24"/>
                 <w:szCs w:val="24"/>
@@ -13955,7 +13911,7 @@
           </w:tcPr>
           <w:p>
             <w:pPr>
-              <w:spacing w:after="40" w:line="240" w:lineRule="auto"/>
+              <w:spacing w:after="40"/>
               <w:rPr>
                 <w:sz w:val="24"/>
                 <w:szCs w:val="24"/>
@@ -13976,7 +13932,7 @@
           </w:tcPr>
           <w:p>
             <w:pPr>
-              <w:spacing w:after="40" w:line="240" w:lineRule="auto"/>
+              <w:spacing w:after="40"/>
               <w:rPr>
                 <w:sz w:val="24"/>
                 <w:szCs w:val="24"/>
@@ -13997,7 +13953,7 @@
           </w:tcPr>
           <w:p>
             <w:pPr>
-              <w:spacing w:after="40" w:line="240" w:lineRule="auto"/>
+              <w:spacing w:after="40"/>
               <w:rPr>
                 <w:sz w:val="24"/>
                 <w:szCs w:val="24"/>
@@ -14023,7 +13979,7 @@
           </w:tcPr>
           <w:p>
             <w:pPr>
-              <w:spacing w:after="40" w:line="240" w:lineRule="auto"/>
+              <w:spacing w:after="40"/>
               <w:rPr>
                 <w:sz w:val="24"/>
                 <w:szCs w:val="24"/>
@@ -14044,7 +14000,7 @@
           </w:tcPr>
           <w:p>
             <w:pPr>
-              <w:spacing w:after="40" w:line="240" w:lineRule="auto"/>
+              <w:spacing w:after="40"/>
               <w:rPr>
                 <w:sz w:val="24"/>
                 <w:szCs w:val="24"/>
@@ -14065,7 +14021,7 @@
           </w:tcPr>
           <w:p>
             <w:pPr>
-              <w:spacing w:after="40" w:line="240" w:lineRule="auto"/>
+              <w:spacing w:after="40"/>
               <w:rPr>
                 <w:sz w:val="24"/>
                 <w:szCs w:val="24"/>
@@ -14086,7 +14042,7 @@
           </w:tcPr>
           <w:p>
             <w:pPr>
-              <w:spacing w:after="40" w:line="240" w:lineRule="auto"/>
+              <w:spacing w:after="40"/>
               <w:rPr>
                 <w:sz w:val="24"/>
                 <w:szCs w:val="24"/>
@@ -14107,7 +14063,7 @@
           </w:tcPr>
           <w:p>
             <w:pPr>
-              <w:spacing w:after="40" w:line="240" w:lineRule="auto"/>
+              <w:spacing w:after="40"/>
               <w:rPr>
                 <w:sz w:val="24"/>
                 <w:szCs w:val="24"/>
@@ -14128,7 +14084,7 @@
           </w:tcPr>
           <w:p>
             <w:pPr>
-              <w:spacing w:after="40" w:line="240" w:lineRule="auto"/>
+              <w:spacing w:after="40"/>
               <w:rPr>
                 <w:sz w:val="24"/>
                 <w:szCs w:val="24"/>
@@ -14154,7 +14110,7 @@
           </w:tcPr>
           <w:p>
             <w:pPr>
-              <w:spacing w:after="40" w:line="240" w:lineRule="auto"/>
+              <w:spacing w:after="40"/>
               <w:rPr>
                 <w:sz w:val="24"/>
                 <w:szCs w:val="24"/>
@@ -14175,7 +14131,7 @@
           </w:tcPr>
           <w:p>
             <w:pPr>
-              <w:spacing w:after="40" w:line="240" w:lineRule="auto"/>
+              <w:spacing w:after="40"/>
               <w:rPr>
                 <w:sz w:val="24"/>
                 <w:szCs w:val="24"/>
@@ -14196,7 +14152,7 @@
           </w:tcPr>
           <w:p>
             <w:pPr>
-              <w:spacing w:after="40" w:line="240" w:lineRule="auto"/>
+              <w:spacing w:after="40"/>
               <w:rPr>
                 <w:sz w:val="24"/>
                 <w:szCs w:val="24"/>
@@ -14217,7 +14173,7 @@
           </w:tcPr>
           <w:p>
             <w:pPr>
-              <w:spacing w:after="40" w:line="240" w:lineRule="auto"/>
+              <w:spacing w:after="40"/>
               <w:rPr>
                 <w:sz w:val="24"/>
                 <w:szCs w:val="24"/>
@@ -14238,7 +14194,7 @@
           </w:tcPr>
           <w:p>
             <w:pPr>
-              <w:spacing w:after="40" w:line="240" w:lineRule="auto"/>
+              <w:spacing w:after="40"/>
               <w:rPr>
                 <w:sz w:val="24"/>
                 <w:szCs w:val="24"/>
@@ -14259,7 +14215,7 @@
           </w:tcPr>
           <w:p>
             <w:pPr>
-              <w:spacing w:after="40" w:line="240" w:lineRule="auto"/>
+              <w:spacing w:after="40"/>
               <w:rPr>
                 <w:sz w:val="24"/>
                 <w:szCs w:val="24"/>
@@ -14285,7 +14241,7 @@
           </w:tcPr>
           <w:p>
             <w:pPr>
-              <w:spacing w:after="40" w:line="240" w:lineRule="auto"/>
+              <w:spacing w:after="40"/>
               <w:rPr>
                 <w:sz w:val="24"/>
                 <w:szCs w:val="24"/>
@@ -14306,7 +14262,7 @@
           </w:tcPr>
           <w:p>
             <w:pPr>
-              <w:spacing w:after="40" w:line="240" w:lineRule="auto"/>
+              <w:spacing w:after="40"/>
               <w:rPr>
                 <w:sz w:val="24"/>
                 <w:szCs w:val="24"/>
@@ -14327,7 +14283,7 @@
           </w:tcPr>
           <w:p>
             <w:pPr>
-              <w:spacing w:after="40" w:line="240" w:lineRule="auto"/>
+              <w:spacing w:after="40"/>
               <w:rPr>
                 <w:sz w:val="24"/>
                 <w:szCs w:val="24"/>
@@ -14348,7 +14304,7 @@
           </w:tcPr>
           <w:p>
             <w:pPr>
-              <w:spacing w:after="40" w:line="240" w:lineRule="auto"/>
+              <w:spacing w:after="40"/>
               <w:rPr>
                 <w:sz w:val="24"/>
                 <w:szCs w:val="24"/>
@@ -14369,7 +14325,7 @@
           </w:tcPr>
           <w:p>
             <w:pPr>
-              <w:spacing w:after="40" w:line="240" w:lineRule="auto"/>
+              <w:spacing w:after="40"/>
               <w:rPr>
                 <w:sz w:val="24"/>
                 <w:szCs w:val="24"/>
@@ -14390,7 +14346,7 @@
           </w:tcPr>
           <w:p>
             <w:pPr>
-              <w:spacing w:after="40" w:line="240" w:lineRule="auto"/>
+              <w:spacing w:after="40"/>
               <w:rPr>
                 <w:sz w:val="24"/>
                 <w:szCs w:val="24"/>
@@ -14416,7 +14372,7 @@
           </w:tcPr>
           <w:p>
             <w:pPr>
-              <w:spacing w:after="40" w:line="240" w:lineRule="auto"/>
+              <w:spacing w:after="40"/>
               <w:rPr>
                 <w:sz w:val="24"/>
                 <w:szCs w:val="24"/>
@@ -14437,7 +14393,7 @@
           </w:tcPr>
           <w:p>
             <w:pPr>
-              <w:spacing w:after="40" w:line="240" w:lineRule="auto"/>
+              <w:spacing w:after="40"/>
               <w:rPr>
                 <w:sz w:val="24"/>
                 <w:szCs w:val="24"/>
@@ -14458,7 +14414,7 @@
           </w:tcPr>
           <w:p>
             <w:pPr>
-              <w:spacing w:after="40" w:line="240" w:lineRule="auto"/>
+              <w:spacing w:after="40"/>
               <w:rPr>
                 <w:sz w:val="24"/>
                 <w:szCs w:val="24"/>
@@ -14479,7 +14435,7 @@
           </w:tcPr>
           <w:p>
             <w:pPr>
-              <w:spacing w:after="40" w:line="240" w:lineRule="auto"/>
+              <w:spacing w:after="40"/>
               <w:rPr>
                 <w:sz w:val="24"/>
                 <w:szCs w:val="24"/>
@@ -14500,7 +14456,7 @@
           </w:tcPr>
           <w:p>
             <w:pPr>
-              <w:spacing w:after="40" w:line="240" w:lineRule="auto"/>
+              <w:spacing w:after="40"/>
               <w:rPr>
                 <w:sz w:val="24"/>
                 <w:szCs w:val="24"/>
@@ -14521,7 +14477,7 @@
           </w:tcPr>
           <w:p>
             <w:pPr>
-              <w:spacing w:after="40" w:line="240" w:lineRule="auto"/>
+              <w:spacing w:after="40"/>
               <w:rPr>
                 <w:sz w:val="24"/>
                 <w:szCs w:val="24"/>
@@ -14547,7 +14503,7 @@
           </w:tcPr>
           <w:p>
             <w:pPr>
-              <w:spacing w:after="40" w:line="240" w:lineRule="auto"/>
+              <w:spacing w:after="40"/>
               <w:rPr>
                 <w:sz w:val="24"/>
                 <w:szCs w:val="24"/>
@@ -14568,7 +14524,7 @@
           </w:tcPr>
           <w:p>
             <w:pPr>
-              <w:spacing w:after="40" w:line="240" w:lineRule="auto"/>
+              <w:spacing w:after="40"/>
               <w:rPr>
                 <w:sz w:val="24"/>
                 <w:szCs w:val="24"/>
@@ -14589,7 +14545,7 @@
           </w:tcPr>
           <w:p>
             <w:pPr>
-              <w:spacing w:after="40" w:line="240" w:lineRule="auto"/>
+              <w:spacing w:after="40"/>
               <w:rPr>
                 <w:sz w:val="24"/>
                 <w:szCs w:val="24"/>
@@ -14610,7 +14566,7 @@
           </w:tcPr>
           <w:p>
             <w:pPr>
-              <w:spacing w:after="40" w:line="240" w:lineRule="auto"/>
+              <w:spacing w:after="40"/>
               <w:rPr>
                 <w:sz w:val="24"/>
                 <w:szCs w:val="24"/>
@@ -14631,7 +14587,7 @@
           </w:tcPr>
           <w:p>
             <w:pPr>
-              <w:spacing w:after="40" w:line="240" w:lineRule="auto"/>
+              <w:spacing w:after="40"/>
               <w:rPr>
                 <w:sz w:val="24"/>
                 <w:szCs w:val="24"/>
@@ -14652,7 +14608,7 @@
           </w:tcPr>
           <w:p>
             <w:pPr>
-              <w:spacing w:after="40" w:line="240" w:lineRule="auto"/>
+              <w:spacing w:after="40"/>
               <w:rPr>
                 <w:sz w:val="24"/>
                 <w:szCs w:val="24"/>
@@ -14678,7 +14634,7 @@
           </w:tcPr>
           <w:p>
             <w:pPr>
-              <w:spacing w:after="40" w:line="240" w:lineRule="auto"/>
+              <w:spacing w:after="40"/>
               <w:rPr>
                 <w:sz w:val="24"/>
                 <w:szCs w:val="24"/>
@@ -14699,7 +14655,7 @@
           </w:tcPr>
           <w:p>
             <w:pPr>
-              <w:spacing w:after="40" w:line="240" w:lineRule="auto"/>
+              <w:spacing w:after="40"/>
               <w:rPr>
                 <w:sz w:val="24"/>
                 <w:szCs w:val="24"/>
@@ -14720,7 +14676,7 @@
           </w:tcPr>
           <w:p>
             <w:pPr>
-              <w:spacing w:after="40" w:line="240" w:lineRule="auto"/>
+              <w:spacing w:after="40"/>
               <w:rPr>
                 <w:sz w:val="24"/>
                 <w:szCs w:val="24"/>
@@ -14741,7 +14697,7 @@
           </w:tcPr>
           <w:p>
             <w:pPr>
-              <w:spacing w:after="40" w:line="240" w:lineRule="auto"/>
+              <w:spacing w:after="40"/>
               <w:rPr>
                 <w:sz w:val="24"/>
                 <w:szCs w:val="24"/>
@@ -14762,7 +14718,7 @@
           </w:tcPr>
           <w:p>
             <w:pPr>
-              <w:spacing w:after="40" w:line="240" w:lineRule="auto"/>
+              <w:spacing w:after="40"/>
               <w:rPr>
                 <w:sz w:val="24"/>
                 <w:szCs w:val="24"/>
@@ -14783,7 +14739,7 @@
           </w:tcPr>
           <w:p>
             <w:pPr>
-              <w:spacing w:after="40" w:line="240" w:lineRule="auto"/>
+              <w:spacing w:after="40"/>
               <w:rPr>
                 <w:sz w:val="24"/>
                 <w:szCs w:val="24"/>
@@ -14809,7 +14765,7 @@
           </w:tcPr>
           <w:p>
             <w:pPr>
-              <w:spacing w:after="40" w:line="240" w:lineRule="auto"/>
+              <w:spacing w:after="40"/>
               <w:rPr>
                 <w:sz w:val="24"/>
                 <w:szCs w:val="24"/>
@@ -14830,7 +14786,7 @@
           </w:tcPr>
           <w:p>
             <w:pPr>
-              <w:spacing w:after="40" w:line="240" w:lineRule="auto"/>
+              <w:spacing w:after="40"/>
               <w:rPr>
                 <w:sz w:val="24"/>
                 <w:szCs w:val="24"/>
@@ -14851,7 +14807,7 @@
           </w:tcPr>
           <w:p>
             <w:pPr>
-              <w:spacing w:after="40" w:line="240" w:lineRule="auto"/>
+              <w:spacing w:after="40"/>
               <w:rPr>
                 <w:sz w:val="24"/>
                 <w:szCs w:val="24"/>
@@ -14872,7 +14828,7 @@
           </w:tcPr>
           <w:p>
             <w:pPr>
-              <w:spacing w:after="40" w:line="240" w:lineRule="auto"/>
+              <w:spacing w:after="40"/>
               <w:rPr>
                 <w:sz w:val="24"/>
                 <w:szCs w:val="24"/>
@@ -14893,7 +14849,7 @@
           </w:tcPr>
           <w:p>
             <w:pPr>
-              <w:spacing w:after="40" w:line="240" w:lineRule="auto"/>
+              <w:spacing w:after="40"/>
               <w:rPr>
                 <w:sz w:val="24"/>
                 <w:szCs w:val="24"/>
@@ -14914,7 +14870,7 @@
           </w:tcPr>
           <w:p>
             <w:pPr>
-              <w:spacing w:after="40" w:line="240" w:lineRule="auto"/>
+              <w:spacing w:after="40"/>
               <w:rPr>
                 <w:sz w:val="24"/>
                 <w:szCs w:val="24"/>
@@ -15343,121 +15299,6 @@
                 <pic:pic xmlns:pic="http://schemas.openxmlformats.org/drawingml/2006/picture">
                   <pic:nvPicPr>
                     <pic:cNvPr id="0" name="01_man_hinh_khoi_dau.png"/>
-                    <pic:cNvPicPr/>
-                  </pic:nvPicPr>
-                  <pic:blipFill>
-                    <a:blip r:embed="rId10"/>
-                    <a:stretch>
-                      <a:fillRect/>
-                    </a:stretch>
-                  </pic:blipFill>
-                  <pic:spPr>
-                    <a:xfrm>
-                      <a:off x="0" y="0"/>
-                      <a:ext cx="5580000" cy="3487500"/>
-                    </a:xfrm>
-                    <a:prstGeom prst="rect">
-                      <a:avLst/>
-                    </a:prstGeom>
-                  </pic:spPr>
-                </pic:pic>
-              </a:graphicData>
-            </a:graphic>
-          </wp:inline>
-        </w:drawing>
-      </w:r>
-    </w:p>
-    <w:p>
-      <w:pPr>
-        <w:jc w:val="center"/>
-      </w:pPr>
-      <w:r>
-        <w:rPr>
-          <w:i/>
-          <w:sz w:val="22"/>
-        </w:rPr>
-        <w:t>Hình 5. Màn hình khởi đầu với thanh bên chọn nguồn dữ liệu</w:t>
-      </w:r>
-    </w:p>
-    <w:p>
-      <w:pPr>
-        <w:jc w:val="center"/>
-      </w:pPr>
-      <w:r>
-        <w:rPr>
-          <w:noProof/>
-        </w:rPr>
-        <w:lastRenderedPageBreak/>
-        <w:drawing>
-          <wp:inline distT="0" distB="0" distL="0" distR="0" wp14:anchorId="2645CE12" wp14:editId="5EFF5A82">
-            <wp:extent cx="5580000" cy="3487500"/>
-            <wp:effectExtent l="0" t="0" r="0" b="0"/>
-            <wp:docPr id="6" name="Picture 6"/>
-            <wp:cNvGraphicFramePr>
-              <a:graphicFrameLocks xmlns:a="http://schemas.openxmlformats.org/drawingml/2006/main" noChangeAspect="1"/>
-            </wp:cNvGraphicFramePr>
-            <a:graphic xmlns:a="http://schemas.openxmlformats.org/drawingml/2006/main">
-              <a:graphicData uri="http://schemas.openxmlformats.org/drawingml/2006/picture">
-                <pic:pic xmlns:pic="http://schemas.openxmlformats.org/drawingml/2006/picture">
-                  <pic:nvPicPr>
-                    <pic:cNvPr id="0" name="03_tab_tong_quan.png"/>
-                    <pic:cNvPicPr/>
-                  </pic:nvPicPr>
-                  <pic:blipFill>
-                    <a:blip r:embed="rId11"/>
-                    <a:stretch>
-                      <a:fillRect/>
-                    </a:stretch>
-                  </pic:blipFill>
-                  <pic:spPr>
-                    <a:xfrm>
-                      <a:off x="0" y="0"/>
-                      <a:ext cx="5580000" cy="3487500"/>
-                    </a:xfrm>
-                    <a:prstGeom prst="rect">
-                      <a:avLst/>
-                    </a:prstGeom>
-                  </pic:spPr>
-                </pic:pic>
-              </a:graphicData>
-            </a:graphic>
-          </wp:inline>
-        </w:drawing>
-      </w:r>
-    </w:p>
-    <w:p>
-      <w:pPr>
-        <w:jc w:val="center"/>
-      </w:pPr>
-      <w:r>
-        <w:rPr>
-          <w:i/>
-          <w:sz w:val="22"/>
-        </w:rPr>
-        <w:t>Hình 6. Tab Tổng quan sau khi phân tích dữ liệu mẫu</w:t>
-      </w:r>
-    </w:p>
-    <w:p>
-      <w:pPr>
-        <w:jc w:val="center"/>
-      </w:pPr>
-      <w:r>
-        <w:rPr>
-          <w:noProof/>
-        </w:rPr>
-        <w:drawing>
-          <wp:inline distT="0" distB="0" distL="0" distR="0" wp14:anchorId="0540227E" wp14:editId="0877F985">
-            <wp:extent cx="5580000" cy="3487500"/>
-            <wp:effectExtent l="0" t="0" r="0" b="0"/>
-            <wp:docPr id="7" name="Picture 7"/>
-            <wp:cNvGraphicFramePr>
-              <a:graphicFrameLocks xmlns:a="http://schemas.openxmlformats.org/drawingml/2006/main" noChangeAspect="1"/>
-            </wp:cNvGraphicFramePr>
-            <a:graphic xmlns:a="http://schemas.openxmlformats.org/drawingml/2006/main">
-              <a:graphicData uri="http://schemas.openxmlformats.org/drawingml/2006/picture">
-                <pic:pic xmlns:pic="http://schemas.openxmlformats.org/drawingml/2006/picture">
-                  <pic:nvPicPr>
-                    <pic:cNvPr id="0" name="04_tab_chu_de.png"/>
                     <pic:cNvPicPr/>
                   </pic:nvPicPr>
                   <pic:blipFill>
@@ -15491,7 +15332,7 @@
           <w:i/>
           <w:sz w:val="22"/>
         </w:rPr>
-        <w:t>Hình 7. Tab Chủ đề: từ khóa theo chủ đề và bản đồ khoảng cách</w:t>
+        <w:t>Hình 5. Màn hình khởi đầu với thanh bên chọn nguồn dữ liệu</w:t>
       </w:r>
     </w:p>
     <w:p>
@@ -15504,10 +15345,10 @@
         </w:rPr>
         <w:lastRenderedPageBreak/>
         <w:drawing>
-          <wp:inline distT="0" distB="0" distL="0" distR="0" wp14:anchorId="7DAC0A33" wp14:editId="4C105125">
+          <wp:inline distT="0" distB="0" distL="0" distR="0" wp14:anchorId="2645CE12" wp14:editId="5EFF5A82">
             <wp:extent cx="5580000" cy="3487500"/>
             <wp:effectExtent l="0" t="0" r="0" b="0"/>
-            <wp:docPr id="8" name="Picture 8"/>
+            <wp:docPr id="6" name="Picture 6"/>
             <wp:cNvGraphicFramePr>
               <a:graphicFrameLocks xmlns:a="http://schemas.openxmlformats.org/drawingml/2006/main" noChangeAspect="1"/>
             </wp:cNvGraphicFramePr>
@@ -15515,7 +15356,7 @@
               <a:graphicData uri="http://schemas.openxmlformats.org/drawingml/2006/picture">
                 <pic:pic xmlns:pic="http://schemas.openxmlformats.org/drawingml/2006/picture">
                   <pic:nvPicPr>
-                    <pic:cNvPr id="0" name="05_tab_cam_xuc.png"/>
+                    <pic:cNvPr id="0" name="03_tab_tong_quan.png"/>
                     <pic:cNvPicPr/>
                   </pic:nvPicPr>
                   <pic:blipFill>
@@ -15549,6 +15390,121 @@
           <w:i/>
           <w:sz w:val="22"/>
         </w:rPr>
+        <w:t>Hình 6. Tab Tổng quan sau khi phân tích dữ liệu mẫu</w:t>
+      </w:r>
+    </w:p>
+    <w:p>
+      <w:pPr>
+        <w:jc w:val="center"/>
+      </w:pPr>
+      <w:r>
+        <w:rPr>
+          <w:noProof/>
+        </w:rPr>
+        <w:drawing>
+          <wp:inline distT="0" distB="0" distL="0" distR="0" wp14:anchorId="0540227E" wp14:editId="0877F985">
+            <wp:extent cx="5580000" cy="3487500"/>
+            <wp:effectExtent l="0" t="0" r="0" b="0"/>
+            <wp:docPr id="7" name="Picture 7"/>
+            <wp:cNvGraphicFramePr>
+              <a:graphicFrameLocks xmlns:a="http://schemas.openxmlformats.org/drawingml/2006/main" noChangeAspect="1"/>
+            </wp:cNvGraphicFramePr>
+            <a:graphic xmlns:a="http://schemas.openxmlformats.org/drawingml/2006/main">
+              <a:graphicData uri="http://schemas.openxmlformats.org/drawingml/2006/picture">
+                <pic:pic xmlns:pic="http://schemas.openxmlformats.org/drawingml/2006/picture">
+                  <pic:nvPicPr>
+                    <pic:cNvPr id="0" name="04_tab_chu_de.png"/>
+                    <pic:cNvPicPr/>
+                  </pic:nvPicPr>
+                  <pic:blipFill>
+                    <a:blip r:embed="rId14"/>
+                    <a:stretch>
+                      <a:fillRect/>
+                    </a:stretch>
+                  </pic:blipFill>
+                  <pic:spPr>
+                    <a:xfrm>
+                      <a:off x="0" y="0"/>
+                      <a:ext cx="5580000" cy="3487500"/>
+                    </a:xfrm>
+                    <a:prstGeom prst="rect">
+                      <a:avLst/>
+                    </a:prstGeom>
+                  </pic:spPr>
+                </pic:pic>
+              </a:graphicData>
+            </a:graphic>
+          </wp:inline>
+        </w:drawing>
+      </w:r>
+    </w:p>
+    <w:p>
+      <w:pPr>
+        <w:jc w:val="center"/>
+      </w:pPr>
+      <w:r>
+        <w:rPr>
+          <w:i/>
+          <w:sz w:val="22"/>
+        </w:rPr>
+        <w:t>Hình 7. Tab Chủ đề: từ khóa theo chủ đề và bản đồ khoảng cách</w:t>
+      </w:r>
+    </w:p>
+    <w:p>
+      <w:pPr>
+        <w:jc w:val="center"/>
+      </w:pPr>
+      <w:r>
+        <w:rPr>
+          <w:noProof/>
+        </w:rPr>
+        <w:lastRenderedPageBreak/>
+        <w:drawing>
+          <wp:inline distT="0" distB="0" distL="0" distR="0" wp14:anchorId="7DAC0A33" wp14:editId="4C105125">
+            <wp:extent cx="5580000" cy="3487500"/>
+            <wp:effectExtent l="0" t="0" r="0" b="0"/>
+            <wp:docPr id="8" name="Picture 8"/>
+            <wp:cNvGraphicFramePr>
+              <a:graphicFrameLocks xmlns:a="http://schemas.openxmlformats.org/drawingml/2006/main" noChangeAspect="1"/>
+            </wp:cNvGraphicFramePr>
+            <a:graphic xmlns:a="http://schemas.openxmlformats.org/drawingml/2006/main">
+              <a:graphicData uri="http://schemas.openxmlformats.org/drawingml/2006/picture">
+                <pic:pic xmlns:pic="http://schemas.openxmlformats.org/drawingml/2006/picture">
+                  <pic:nvPicPr>
+                    <pic:cNvPr id="0" name="05_tab_cam_xuc.png"/>
+                    <pic:cNvPicPr/>
+                  </pic:nvPicPr>
+                  <pic:blipFill>
+                    <a:blip r:embed="rId15"/>
+                    <a:stretch>
+                      <a:fillRect/>
+                    </a:stretch>
+                  </pic:blipFill>
+                  <pic:spPr>
+                    <a:xfrm>
+                      <a:off x="0" y="0"/>
+                      <a:ext cx="5580000" cy="3487500"/>
+                    </a:xfrm>
+                    <a:prstGeom prst="rect">
+                      <a:avLst/>
+                    </a:prstGeom>
+                  </pic:spPr>
+                </pic:pic>
+              </a:graphicData>
+            </a:graphic>
+          </wp:inline>
+        </w:drawing>
+      </w:r>
+    </w:p>
+    <w:p>
+      <w:pPr>
+        <w:jc w:val="center"/>
+      </w:pPr>
+      <w:r>
+        <w:rPr>
+          <w:i/>
+          <w:sz w:val="22"/>
+        </w:rPr>
         <w:t>Hình 8. Tab Cảm xúc: tỉ lệ ba sắc thái và cảm xúc theo chủ đề</w:t>
       </w:r>
     </w:p>
@@ -16532,7 +16488,55 @@
           <w:sz w:val="24"/>
           <w:szCs w:val="24"/>
         </w:rPr>
-        <w:t xml:space="preserve"> cho kết quả xác định trên cùng một máy: hai lần chạy cùng lệnh cho cùng phép gán chủ đề từng dòng. Giữa các máy có bản dựng BLAS khác nhau, số chủ đề và tỉ lệ nhiễu có thể lệch nhỏ; đó là điều bình thường </w:t>
+        <w:t xml:space="preserve"> cho kết quả xác định trên cùng một máy: hai lần chạy cùng lệnh cho cùng phép gán chủ đề từng dòng. Giữa các máy có bản dựng BLAS khác nhau, số chủ đề và tỉ lệ nhiễu có thể lệch nhỏ; đó là </w:t>
+      </w:r>
+      <w:proofErr w:type="spellStart"/>
+      <w:r>
+        <w:rPr>
+          <w:sz w:val="24"/>
+          <w:szCs w:val="24"/>
+        </w:rPr>
+        <w:t>điều</w:t>
+      </w:r>
+      <w:proofErr w:type="spellEnd"/>
+      <w:r>
+        <w:rPr>
+          <w:sz w:val="24"/>
+          <w:szCs w:val="24"/>
+        </w:rPr>
+        <w:t xml:space="preserve"> </w:t>
+      </w:r>
+      <w:proofErr w:type="spellStart"/>
+      <w:r>
+        <w:rPr>
+          <w:sz w:val="24"/>
+          <w:szCs w:val="24"/>
+        </w:rPr>
+        <w:t>bình</w:t>
+      </w:r>
+      <w:proofErr w:type="spellEnd"/>
+      <w:r>
+        <w:rPr>
+          <w:sz w:val="24"/>
+          <w:szCs w:val="24"/>
+        </w:rPr>
+        <w:t xml:space="preserve"> </w:t>
+      </w:r>
+      <w:proofErr w:type="spellStart"/>
+      <w:r>
+        <w:rPr>
+          <w:sz w:val="24"/>
+          <w:szCs w:val="24"/>
+        </w:rPr>
+        <w:t>thường</w:t>
+      </w:r>
+      <w:proofErr w:type="spellEnd"/>
+      <w:r>
+        <w:rPr>
+          <w:sz w:val="24"/>
+          <w:szCs w:val="24"/>
+        </w:rPr>
+        <w:t xml:space="preserve"> </w:t>
       </w:r>
       <w:proofErr w:type="spellStart"/>
       <w:r>
@@ -16773,7 +16777,7 @@
           </w:tcPr>
           <w:p>
             <w:pPr>
-              <w:spacing w:after="40" w:line="240" w:lineRule="auto"/>
+              <w:spacing w:after="40"/>
             </w:pPr>
             <w:r>
               <w:rPr>
@@ -16790,7 +16794,7 @@
           </w:tcPr>
           <w:p>
             <w:pPr>
-              <w:spacing w:after="40" w:line="240" w:lineRule="auto"/>
+              <w:spacing w:after="40"/>
             </w:pPr>
             <w:r>
               <w:rPr>
@@ -16812,7 +16816,7 @@
           </w:tcPr>
           <w:p>
             <w:pPr>
-              <w:spacing w:after="40" w:line="240" w:lineRule="auto"/>
+              <w:spacing w:after="40"/>
               <w:rPr>
                 <w:sz w:val="24"/>
                 <w:szCs w:val="24"/>
@@ -16833,7 +16837,7 @@
           </w:tcPr>
           <w:p>
             <w:pPr>
-              <w:spacing w:after="40" w:line="240" w:lineRule="auto"/>
+              <w:spacing w:after="40"/>
             </w:pPr>
             <w:r>
               <w:rPr>
@@ -16869,7 +16873,7 @@
           </w:tcPr>
           <w:p>
             <w:pPr>
-              <w:spacing w:after="40" w:line="240" w:lineRule="auto"/>
+              <w:spacing w:after="40"/>
               <w:rPr>
                 <w:sz w:val="24"/>
                 <w:szCs w:val="24"/>
@@ -16890,7 +16894,7 @@
           </w:tcPr>
           <w:p>
             <w:pPr>
-              <w:spacing w:after="40" w:line="240" w:lineRule="auto"/>
+              <w:spacing w:after="40"/>
             </w:pPr>
             <w:r>
               <w:rPr>
@@ -16958,7 +16962,7 @@
           </w:tcPr>
           <w:p>
             <w:pPr>
-              <w:spacing w:after="40" w:line="240" w:lineRule="auto"/>
+              <w:spacing w:after="40"/>
               <w:rPr>
                 <w:sz w:val="24"/>
                 <w:szCs w:val="24"/>
@@ -16979,7 +16983,7 @@
           </w:tcPr>
           <w:p>
             <w:pPr>
-              <w:spacing w:after="40" w:line="240" w:lineRule="auto"/>
+              <w:spacing w:after="40"/>
             </w:pPr>
             <w:r>
               <w:rPr>
@@ -17015,7 +17019,7 @@
           </w:tcPr>
           <w:p>
             <w:pPr>
-              <w:spacing w:after="40" w:line="240" w:lineRule="auto"/>
+              <w:spacing w:after="40"/>
               <w:rPr>
                 <w:sz w:val="24"/>
                 <w:szCs w:val="24"/>
@@ -17036,7 +17040,7 @@
           </w:tcPr>
           <w:p>
             <w:pPr>
-              <w:spacing w:after="40" w:line="240" w:lineRule="auto"/>
+              <w:spacing w:after="40"/>
             </w:pPr>
             <w:r>
               <w:rPr>
@@ -17072,7 +17076,7 @@
           </w:tcPr>
           <w:p>
             <w:pPr>
-              <w:spacing w:after="40" w:line="240" w:lineRule="auto"/>
+              <w:spacing w:after="40"/>
               <w:rPr>
                 <w:sz w:val="24"/>
                 <w:szCs w:val="24"/>
@@ -17093,7 +17097,7 @@
           </w:tcPr>
           <w:p>
             <w:pPr>
-              <w:spacing w:after="40" w:line="240" w:lineRule="auto"/>
+              <w:spacing w:after="40"/>
             </w:pPr>
             <w:r>
               <w:rPr>
@@ -17143,7 +17147,7 @@
           </w:tcPr>
           <w:p>
             <w:pPr>
-              <w:spacing w:after="40" w:line="240" w:lineRule="auto"/>
+              <w:spacing w:after="40"/>
               <w:rPr>
                 <w:sz w:val="24"/>
                 <w:szCs w:val="24"/>
@@ -17164,7 +17168,7 @@
           </w:tcPr>
           <w:p>
             <w:pPr>
-              <w:spacing w:after="40" w:line="240" w:lineRule="auto"/>
+              <w:spacing w:after="40"/>
             </w:pPr>
             <w:r>
               <w:rPr>
@@ -17230,7 +17234,7 @@
           </w:tcPr>
           <w:p>
             <w:pPr>
-              <w:spacing w:after="40" w:line="240" w:lineRule="auto"/>
+              <w:spacing w:after="40"/>
               <w:rPr>
                 <w:sz w:val="24"/>
                 <w:szCs w:val="24"/>
@@ -17259,7 +17263,7 @@
           </w:tcPr>
           <w:p>
             <w:pPr>
-              <w:spacing w:after="40" w:line="240" w:lineRule="auto"/>
+              <w:spacing w:after="40"/>
             </w:pPr>
             <w:r>
               <w:rPr>
@@ -17325,17 +17329,18 @@
           </w:tcPr>
           <w:p>
             <w:pPr>
-              <w:spacing w:after="40" w:line="240" w:lineRule="auto"/>
-              <w:rPr>
-                <w:sz w:val="24"/>
-                <w:szCs w:val="24"/>
-              </w:rPr>
-            </w:pPr>
-            <w:r>
-              <w:rPr>
-                <w:sz w:val="24"/>
-                <w:szCs w:val="24"/>
-              </w:rPr>
+              <w:spacing w:after="40"/>
+              <w:rPr>
+                <w:sz w:val="24"/>
+                <w:szCs w:val="24"/>
+              </w:rPr>
+            </w:pPr>
+            <w:r>
+              <w:rPr>
+                <w:sz w:val="24"/>
+                <w:szCs w:val="24"/>
+              </w:rPr>
+              <w:lastRenderedPageBreak/>
               <w:t>Độ ổn định theo hạt giống (mục 6.2)</w:t>
             </w:r>
           </w:p>
@@ -17346,7 +17351,7 @@
           </w:tcPr>
           <w:p>
             <w:pPr>
-              <w:spacing w:after="40" w:line="240" w:lineRule="auto"/>
+              <w:spacing w:after="40"/>
             </w:pPr>
             <w:r>
               <w:rPr>
@@ -17382,7 +17387,7 @@
           </w:tcPr>
           <w:p>
             <w:pPr>
-              <w:spacing w:after="40" w:line="240" w:lineRule="auto"/>
+              <w:spacing w:after="40"/>
               <w:rPr>
                 <w:sz w:val="24"/>
                 <w:szCs w:val="24"/>
@@ -17403,7 +17408,7 @@
           </w:tcPr>
           <w:p>
             <w:pPr>
-              <w:spacing w:after="40" w:line="240" w:lineRule="auto"/>
+              <w:spacing w:after="40"/>
             </w:pPr>
             <w:r>
               <w:rPr>
@@ -17425,7 +17430,7 @@
           </w:tcPr>
           <w:p>
             <w:pPr>
-              <w:spacing w:after="40" w:line="240" w:lineRule="auto"/>
+              <w:spacing w:after="40"/>
               <w:rPr>
                 <w:sz w:val="24"/>
                 <w:szCs w:val="24"/>
@@ -17446,7 +17451,7 @@
           </w:tcPr>
           <w:p>
             <w:pPr>
-              <w:spacing w:after="40" w:line="240" w:lineRule="auto"/>
+              <w:spacing w:after="40"/>
             </w:pPr>
             <w:r>
               <w:rPr>
@@ -17468,7 +17473,7 @@
           </w:tcPr>
           <w:p>
             <w:pPr>
-              <w:spacing w:after="40" w:line="240" w:lineRule="auto"/>
+              <w:spacing w:after="40"/>
               <w:rPr>
                 <w:sz w:val="24"/>
                 <w:szCs w:val="24"/>
@@ -17489,7 +17494,7 @@
           </w:tcPr>
           <w:p>
             <w:pPr>
-              <w:spacing w:after="40" w:line="240" w:lineRule="auto"/>
+              <w:spacing w:after="40"/>
             </w:pPr>
             <w:r>
               <w:rPr>
@@ -17539,7 +17544,7 @@
           </w:tcPr>
           <w:p>
             <w:pPr>
-              <w:spacing w:after="40" w:line="240" w:lineRule="auto"/>
+              <w:spacing w:after="40"/>
               <w:rPr>
                 <w:sz w:val="24"/>
                 <w:szCs w:val="24"/>
@@ -17560,7 +17565,7 @@
           </w:tcPr>
           <w:p>
             <w:pPr>
-              <w:spacing w:after="40" w:line="240" w:lineRule="auto"/>
+              <w:spacing w:after="40"/>
             </w:pPr>
             <w:r>
               <w:rPr>
@@ -17624,7 +17629,7 @@
           </w:tcPr>
           <w:p>
             <w:pPr>
-              <w:spacing w:after="40" w:line="240" w:lineRule="auto"/>
+              <w:spacing w:after="40"/>
               <w:rPr>
                 <w:sz w:val="24"/>
                 <w:szCs w:val="24"/>
@@ -17645,7 +17650,7 @@
           </w:tcPr>
           <w:p>
             <w:pPr>
-              <w:spacing w:after="40" w:line="240" w:lineRule="auto"/>
+              <w:spacing w:after="40"/>
             </w:pPr>
             <w:r>
               <w:rPr>
@@ -17667,7 +17672,7 @@
           </w:tcPr>
           <w:p>
             <w:pPr>
-              <w:spacing w:after="40" w:line="240" w:lineRule="auto"/>
+              <w:spacing w:after="40"/>
               <w:rPr>
                 <w:sz w:val="24"/>
                 <w:szCs w:val="24"/>
@@ -17688,7 +17693,7 @@
           </w:tcPr>
           <w:p>
             <w:pPr>
-              <w:spacing w:after="40" w:line="240" w:lineRule="auto"/>
+              <w:spacing w:after="40"/>
             </w:pPr>
             <w:r>
               <w:rPr>
@@ -17732,13 +17737,314 @@
       </w:r>
     </w:p>
     <w:sectPr>
+      <w:headerReference w:type="default" r:id="rId16"/>
+      <w:footerReference w:type="default" r:id="rId17"/>
       <w:pgSz w:w="11906" w:h="16838"/>
       <w:pgMar w:top="1417" w:right="1417" w:bottom="1417" w:left="1417" w:header="720" w:footer="720" w:gutter="0"/>
+      <w:pgNumType w:start="2"/>
       <w:cols w:space="720"/>
       <w:docGrid w:linePitch="360"/>
     </w:sectPr>
   </w:body>
 </w:document>
+</file>
+
+<file path=word/endnotes.xml><?xml version="1.0" encoding="utf-8"?>
+<w:endnotes xmlns:wpc="http://schemas.microsoft.com/office/word/2010/wordprocessingCanvas" xmlns:cx="http://schemas.microsoft.com/office/drawing/2014/chartex" xmlns:cx1="http://schemas.microsoft.com/office/drawing/2015/9/8/chartex" xmlns:cx2="http://schemas.microsoft.com/office/drawing/2015/10/21/chartex" xmlns:cx3="http://schemas.microsoft.com/office/drawing/2016/5/9/chartex" xmlns:cx4="http://schemas.microsoft.com/office/drawing/2016/5/10/chartex" xmlns:cx5="http://schemas.microsoft.com/office/drawing/2016/5/11/chartex" xmlns:cx6="http://schemas.microsoft.com/office/drawing/2016/5/12/chartex" xmlns:cx7="http://schemas.microsoft.com/office/drawing/2016/5/13/chartex" xmlns:cx8="http://schemas.microsoft.com/office/drawing/2016/5/14/chartex" xmlns:mc="http://schemas.openxmlformats.org/markup-compatibility/2006" xmlns:m="http://schemas.openxmlformats.org/officeDocument/2006/math" xmlns:aink="http://schemas.microsoft.com/office/drawing/2016/ink" xmlns:am3d="http://schemas.microsoft.com/office/drawing/2017/model3d" xmlns:oel="http://schemas.microsoft.com/office/2019/extlst" xmlns:r="http://schemas.openxmlformats.org/officeDocument/2006/relationships" xmlns:wp14="http://schemas.microsoft.com/office/word/2010/wordprocessingDrawing" xmlns:wp="http://schemas.openxmlformats.org/drawingml/2006/wordprocessingDrawing" xmlns:wpg="http://schemas.microsoft.com/office/word/2010/wordprocessingGroup" xmlns:wpi="http://schemas.microsoft.com/office/word/2010/wordprocessingInk" xmlns:wps="http://schemas.microsoft.com/office/word/2010/wordprocessingShape" xmlns:o="urn:schemas-microsoft-com:office:office" xmlns:v="urn:schemas-microsoft-com:vml" xmlns:w10="urn:schemas-microsoft-com:office:word" xmlns:w="http://schemas.openxmlformats.org/wordprocessingml/2006/main" xmlns:w14="http://schemas.microsoft.com/office/word/2010/wordml" xmlns:w15="http://schemas.microsoft.com/office/word/2012/wordml" xmlns:w16cei="http://schemas.microsoft.com/office/word/2026/wordml/cei" xmlns:w16cex="http://schemas.microsoft.com/office/word/2018/wordml/cex" xmlns:w16cid="http://schemas.microsoft.com/office/word/2016/wordml/cid" xmlns:w16="http://schemas.microsoft.com/office/word/2018/wordml" xmlns:w16sdtdh="http://schemas.microsoft.com/office/word/2020/wordml/sdtdatahash" xmlns:w16sdtfl="http://schemas.microsoft.com/office/word/2024/wordml/sdtformatlock" xmlns:w16se="http://schemas.microsoft.com/office/word/2015/wordml/symex" xmlns:w16du="http://schemas.microsoft.com/office/word/2023/wordml/word16du" xmlns:wne="http://schemas.microsoft.com/office/word/2006/wordml" mc:Ignorable="w14 w15 w16se w16cid w16 w16cex w16sdtdh w16sdtfl w16du wp14">
+  <w:endnote w:type="separator" w:id="-1">
+    <w:p>
+      <w:pPr>
+        <w:spacing w:after="0" w:line="240" w:lineRule="auto"/>
+      </w:pPr>
+      <w:r>
+        <w:separator/>
+      </w:r>
+    </w:p>
+  </w:endnote>
+  <w:endnote w:type="continuationSeparator" w:id="0">
+    <w:p>
+      <w:pPr>
+        <w:spacing w:after="0" w:line="240" w:lineRule="auto"/>
+      </w:pPr>
+      <w:r>
+        <w:continuationSeparator/>
+      </w:r>
+    </w:p>
+  </w:endnote>
+</w:endnotes>
+</file>
+
+<file path=word/footer1.xml><?xml version="1.0" encoding="utf-8"?>
+<w:ftr xmlns:wpc="http://schemas.microsoft.com/office/word/2010/wordprocessingCanvas" xmlns:cx="http://schemas.microsoft.com/office/drawing/2014/chartex" xmlns:cx1="http://schemas.microsoft.com/office/drawing/2015/9/8/chartex" xmlns:cx2="http://schemas.microsoft.com/office/drawing/2015/10/21/chartex" xmlns:cx3="http://schemas.microsoft.com/office/drawing/2016/5/9/chartex" xmlns:cx4="http://schemas.microsoft.com/office/drawing/2016/5/10/chartex" xmlns:cx5="http://schemas.microsoft.com/office/drawing/2016/5/11/chartex" xmlns:cx6="http://schemas.microsoft.com/office/drawing/2016/5/12/chartex" xmlns:cx7="http://schemas.microsoft.com/office/drawing/2016/5/13/chartex" xmlns:cx8="http://schemas.microsoft.com/office/drawing/2016/5/14/chartex" xmlns:mc="http://schemas.openxmlformats.org/markup-compatibility/2006" xmlns:m="http://schemas.openxmlformats.org/officeDocument/2006/math" xmlns:aink="http://schemas.microsoft.com/office/drawing/2016/ink" xmlns:am3d="http://schemas.microsoft.com/office/drawing/2017/model3d" xmlns:oel="http://schemas.microsoft.com/office/2019/extlst" xmlns:r="http://schemas.openxmlformats.org/officeDocument/2006/relationships" xmlns:wp14="http://schemas.microsoft.com/office/word/2010/wordprocessingDrawing" xmlns:wp="http://schemas.openxmlformats.org/drawingml/2006/wordprocessingDrawing" xmlns:wpg="http://schemas.microsoft.com/office/word/2010/wordprocessingGroup" xmlns:wpi="http://schemas.microsoft.com/office/word/2010/wordprocessingInk" xmlns:wps="http://schemas.microsoft.com/office/word/2010/wordprocessingShape" xmlns:o="urn:schemas-microsoft-com:office:office" xmlns:v="urn:schemas-microsoft-com:vml" xmlns:w10="urn:schemas-microsoft-com:office:word" xmlns:w="http://schemas.openxmlformats.org/wordprocessingml/2006/main" xmlns:w14="http://schemas.microsoft.com/office/word/2010/wordml" xmlns:w15="http://schemas.microsoft.com/office/word/2012/wordml" xmlns:w16cei="http://schemas.microsoft.com/office/word/2026/wordml/cei" xmlns:w16cex="http://schemas.microsoft.com/office/word/2018/wordml/cex" xmlns:w16cid="http://schemas.microsoft.com/office/word/2016/wordml/cid" xmlns:w16="http://schemas.microsoft.com/office/word/2018/wordml" xmlns:w16sdtdh="http://schemas.microsoft.com/office/word/2020/wordml/sdtdatahash" xmlns:w16sdtfl="http://schemas.microsoft.com/office/word/2024/wordml/sdtformatlock" xmlns:w16se="http://schemas.microsoft.com/office/word/2015/wordml/symex" xmlns:w16du="http://schemas.microsoft.com/office/word/2023/wordml/word16du" xmlns:wne="http://schemas.microsoft.com/office/word/2006/wordml" mc:Ignorable="w14 w15 w16se w16cid w16 w16cex w16sdtdh w16sdtfl w16du wp14">
+  <w:sdt>
+    <w:sdtPr>
+      <w:rPr>
+        <w:rStyle w:val="PageNumber"/>
+        <w:color w:val="7F7F7F" w:themeColor="text1" w:themeTint="80"/>
+      </w:rPr>
+      <w:id w:val="720632607"/>
+      <w:docPartObj>
+        <w:docPartGallery w:val="Page Numbers (Bottom of Page)"/>
+        <w:docPartUnique/>
+      </w:docPartObj>
+    </w:sdtPr>
+    <w:sdtContent>
+      <w:p>
+        <w:pPr>
+          <w:pStyle w:val="Footer"/>
+          <w:framePr w:w="9364" w:wrap="none" w:vAnchor="text" w:hAnchor="page" w:x="1426" w:y="1"/>
+          <w:pBdr>
+            <w:top w:val="single" w:sz="4" w:space="1" w:color="7F7F7F" w:themeColor="text1" w:themeTint="80"/>
+          </w:pBdr>
+          <w:jc w:val="right"/>
+          <w:rPr>
+            <w:rStyle w:val="PageNumber"/>
+            <w:color w:val="7F7F7F" w:themeColor="text1" w:themeTint="80"/>
+          </w:rPr>
+        </w:pPr>
+        <w:r>
+          <w:rPr>
+            <w:rStyle w:val="PageNumber"/>
+            <w:color w:val="7F7F7F" w:themeColor="text1" w:themeTint="80"/>
+          </w:rPr>
+          <w:fldChar w:fldCharType="begin"/>
+        </w:r>
+        <w:r>
+          <w:rPr>
+            <w:rStyle w:val="PageNumber"/>
+            <w:color w:val="7F7F7F" w:themeColor="text1" w:themeTint="80"/>
+          </w:rPr>
+          <w:instrText xml:space="preserve"> PAGE </w:instrText>
+        </w:r>
+        <w:r>
+          <w:rPr>
+            <w:rStyle w:val="PageNumber"/>
+            <w:color w:val="7F7F7F" w:themeColor="text1" w:themeTint="80"/>
+          </w:rPr>
+          <w:fldChar w:fldCharType="separate"/>
+        </w:r>
+        <w:r>
+          <w:rPr>
+            <w:rStyle w:val="PageNumber"/>
+            <w:color w:val="7F7F7F" w:themeColor="text1" w:themeTint="80"/>
+          </w:rPr>
+          <w:t>2</w:t>
+        </w:r>
+        <w:r>
+          <w:rPr>
+            <w:rStyle w:val="PageNumber"/>
+            <w:color w:val="7F7F7F" w:themeColor="text1" w:themeTint="80"/>
+          </w:rPr>
+          <w:fldChar w:fldCharType="end"/>
+        </w:r>
+      </w:p>
+    </w:sdtContent>
+  </w:sdt>
+  <w:p>
+    <w:pPr>
+      <w:pStyle w:val="Footer"/>
+      <w:ind w:right="360"/>
+      <w:rPr>
+        <w:color w:val="7F7F7F" w:themeColor="text1" w:themeTint="80"/>
+      </w:rPr>
+    </w:pPr>
+    <w:proofErr w:type="spellStart"/>
+    <w:r>
+      <w:rPr>
+        <w:color w:val="7F7F7F" w:themeColor="text1" w:themeTint="80"/>
+      </w:rPr>
+      <w:t>Phân</w:t>
+    </w:r>
+    <w:proofErr w:type="spellEnd"/>
+    <w:r>
+      <w:rPr>
+        <w:color w:val="7F7F7F" w:themeColor="text1" w:themeTint="80"/>
+      </w:rPr>
+      <w:t xml:space="preserve"> </w:t>
+    </w:r>
+    <w:proofErr w:type="spellStart"/>
+    <w:r>
+      <w:rPr>
+        <w:color w:val="7F7F7F" w:themeColor="text1" w:themeTint="80"/>
+      </w:rPr>
+      <w:t>tích</w:t>
+    </w:r>
+    <w:proofErr w:type="spellEnd"/>
+    <w:r>
+      <w:rPr>
+        <w:color w:val="7F7F7F" w:themeColor="text1" w:themeTint="80"/>
+      </w:rPr>
+      <w:t xml:space="preserve"> </w:t>
+    </w:r>
+    <w:proofErr w:type="spellStart"/>
+    <w:r>
+      <w:rPr>
+        <w:color w:val="7F7F7F" w:themeColor="text1" w:themeTint="80"/>
+      </w:rPr>
+      <w:t>chủ</w:t>
+    </w:r>
+    <w:proofErr w:type="spellEnd"/>
+    <w:r>
+      <w:rPr>
+        <w:color w:val="7F7F7F" w:themeColor="text1" w:themeTint="80"/>
+      </w:rPr>
+      <w:t xml:space="preserve"> </w:t>
+    </w:r>
+    <w:proofErr w:type="spellStart"/>
+    <w:r>
+      <w:rPr>
+        <w:color w:val="7F7F7F" w:themeColor="text1" w:themeTint="80"/>
+      </w:rPr>
+      <w:t>đề</w:t>
+    </w:r>
+    <w:proofErr w:type="spellEnd"/>
+    <w:r>
+      <w:rPr>
+        <w:color w:val="7F7F7F" w:themeColor="text1" w:themeTint="80"/>
+      </w:rPr>
+      <w:t xml:space="preserve"> </w:t>
+    </w:r>
+    <w:proofErr w:type="spellStart"/>
+    <w:r>
+      <w:rPr>
+        <w:color w:val="7F7F7F" w:themeColor="text1" w:themeTint="80"/>
+      </w:rPr>
+      <w:t>và</w:t>
+    </w:r>
+    <w:proofErr w:type="spellEnd"/>
+    <w:r>
+      <w:rPr>
+        <w:color w:val="7F7F7F" w:themeColor="text1" w:themeTint="80"/>
+      </w:rPr>
+      <w:t xml:space="preserve"> </w:t>
+    </w:r>
+    <w:proofErr w:type="spellStart"/>
+    <w:r>
+      <w:rPr>
+        <w:color w:val="7F7F7F" w:themeColor="text1" w:themeTint="80"/>
+      </w:rPr>
+      <w:t>cảm</w:t>
+    </w:r>
+    <w:proofErr w:type="spellEnd"/>
+    <w:r>
+      <w:rPr>
+        <w:color w:val="7F7F7F" w:themeColor="text1" w:themeTint="80"/>
+      </w:rPr>
+      <w:t xml:space="preserve"> </w:t>
+    </w:r>
+    <w:proofErr w:type="spellStart"/>
+    <w:r>
+      <w:rPr>
+        <w:color w:val="7F7F7F" w:themeColor="text1" w:themeTint="80"/>
+      </w:rPr>
+      <w:t>xúc</w:t>
+    </w:r>
+    <w:proofErr w:type="spellEnd"/>
+    <w:r>
+      <w:rPr>
+        <w:color w:val="7F7F7F" w:themeColor="text1" w:themeTint="80"/>
+        <w:lang w:val="vi-VN"/>
+      </w:rPr>
+      <w:t xml:space="preserve"> </w:t>
+    </w:r>
+    <w:proofErr w:type="spellStart"/>
+    <w:r>
+      <w:rPr>
+        <w:color w:val="7F7F7F" w:themeColor="text1" w:themeTint="80"/>
+      </w:rPr>
+      <w:t>bình</w:t>
+    </w:r>
+    <w:proofErr w:type="spellEnd"/>
+    <w:r>
+      <w:rPr>
+        <w:color w:val="7F7F7F" w:themeColor="text1" w:themeTint="80"/>
+      </w:rPr>
+      <w:t xml:space="preserve"> </w:t>
+    </w:r>
+    <w:proofErr w:type="spellStart"/>
+    <w:r>
+      <w:rPr>
+        <w:color w:val="7F7F7F" w:themeColor="text1" w:themeTint="80"/>
+      </w:rPr>
+      <w:t>luận</w:t>
+    </w:r>
+    <w:proofErr w:type="spellEnd"/>
+    <w:r>
+      <w:rPr>
+        <w:color w:val="7F7F7F" w:themeColor="text1" w:themeTint="80"/>
+      </w:rPr>
+      <w:t xml:space="preserve"> YouTube </w:t>
+    </w:r>
+    <w:proofErr w:type="spellStart"/>
+    <w:r>
+      <w:rPr>
+        <w:color w:val="7F7F7F" w:themeColor="text1" w:themeTint="80"/>
+      </w:rPr>
+      <w:t>tiếng</w:t>
+    </w:r>
+    <w:proofErr w:type="spellEnd"/>
+    <w:r>
+      <w:rPr>
+        <w:color w:val="7F7F7F" w:themeColor="text1" w:themeTint="80"/>
+      </w:rPr>
+      <w:t xml:space="preserve"> Việt</w:t>
+    </w:r>
+  </w:p>
+</w:ftr>
+</file>
+
+<file path=word/footnotes.xml><?xml version="1.0" encoding="utf-8"?>
+<w:footnotes xmlns:wpc="http://schemas.microsoft.com/office/word/2010/wordprocessingCanvas" xmlns:cx="http://schemas.microsoft.com/office/drawing/2014/chartex" xmlns:cx1="http://schemas.microsoft.com/office/drawing/2015/9/8/chartex" xmlns:cx2="http://schemas.microsoft.com/office/drawing/2015/10/21/chartex" xmlns:cx3="http://schemas.microsoft.com/office/drawing/2016/5/9/chartex" xmlns:cx4="http://schemas.microsoft.com/office/drawing/2016/5/10/chartex" xmlns:cx5="http://schemas.microsoft.com/office/drawing/2016/5/11/chartex" xmlns:cx6="http://schemas.microsoft.com/office/drawing/2016/5/12/chartex" xmlns:cx7="http://schemas.microsoft.com/office/drawing/2016/5/13/chartex" xmlns:cx8="http://schemas.microsoft.com/office/drawing/2016/5/14/chartex" xmlns:mc="http://schemas.openxmlformats.org/markup-compatibility/2006" xmlns:m="http://schemas.openxmlformats.org/officeDocument/2006/math" xmlns:aink="http://schemas.microsoft.com/office/drawing/2016/ink" xmlns:am3d="http://schemas.microsoft.com/office/drawing/2017/model3d" xmlns:oel="http://schemas.microsoft.com/office/2019/extlst" xmlns:r="http://schemas.openxmlformats.org/officeDocument/2006/relationships" xmlns:wp14="http://schemas.microsoft.com/office/word/2010/wordprocessingDrawing" xmlns:wp="http://schemas.openxmlformats.org/drawingml/2006/wordprocessingDrawing" xmlns:wpg="http://schemas.microsoft.com/office/word/2010/wordprocessingGroup" xmlns:wpi="http://schemas.microsoft.com/office/word/2010/wordprocessingInk" xmlns:wps="http://schemas.microsoft.com/office/word/2010/wordprocessingShape" xmlns:o="urn:schemas-microsoft-com:office:office" xmlns:v="urn:schemas-microsoft-com:vml" xmlns:w10="urn:schemas-microsoft-com:office:word" xmlns:w="http://schemas.openxmlformats.org/wordprocessingml/2006/main" xmlns:w14="http://schemas.microsoft.com/office/word/2010/wordml" xmlns:w15="http://schemas.microsoft.com/office/word/2012/wordml" xmlns:w16cei="http://schemas.microsoft.com/office/word/2026/wordml/cei" xmlns:w16cex="http://schemas.microsoft.com/office/word/2018/wordml/cex" xmlns:w16cid="http://schemas.microsoft.com/office/word/2016/wordml/cid" xmlns:w16="http://schemas.microsoft.com/office/word/2018/wordml" xmlns:w16sdtdh="http://schemas.microsoft.com/office/word/2020/wordml/sdtdatahash" xmlns:w16sdtfl="http://schemas.microsoft.com/office/word/2024/wordml/sdtformatlock" xmlns:w16se="http://schemas.microsoft.com/office/word/2015/wordml/symex" xmlns:w16du="http://schemas.microsoft.com/office/word/2023/wordml/word16du" xmlns:wne="http://schemas.microsoft.com/office/word/2006/wordml" mc:Ignorable="w14 w15 w16se w16cid w16 w16cex w16sdtdh w16sdtfl w16du wp14">
+  <w:footnote w:type="separator" w:id="-1">
+    <w:p>
+      <w:pPr>
+        <w:spacing w:after="0" w:line="240" w:lineRule="auto"/>
+      </w:pPr>
+      <w:r>
+        <w:separator/>
+      </w:r>
+    </w:p>
+  </w:footnote>
+  <w:footnote w:type="continuationSeparator" w:id="0">
+    <w:p>
+      <w:pPr>
+        <w:spacing w:after="0" w:line="240" w:lineRule="auto"/>
+      </w:pPr>
+      <w:r>
+        <w:continuationSeparator/>
+      </w:r>
+    </w:p>
+  </w:footnote>
+</w:footnotes>
+</file>
+
+<file path=word/header1.xml><?xml version="1.0" encoding="utf-8"?>
+<w:hdr xmlns:wpc="http://schemas.microsoft.com/office/word/2010/wordprocessingCanvas" xmlns:cx="http://schemas.microsoft.com/office/drawing/2014/chartex" xmlns:cx1="http://schemas.microsoft.com/office/drawing/2015/9/8/chartex" xmlns:cx2="http://schemas.microsoft.com/office/drawing/2015/10/21/chartex" xmlns:cx3="http://schemas.microsoft.com/office/drawing/2016/5/9/chartex" xmlns:cx4="http://schemas.microsoft.com/office/drawing/2016/5/10/chartex" xmlns:cx5="http://schemas.microsoft.com/office/drawing/2016/5/11/chartex" xmlns:cx6="http://schemas.microsoft.com/office/drawing/2016/5/12/chartex" xmlns:cx7="http://schemas.microsoft.com/office/drawing/2016/5/13/chartex" xmlns:cx8="http://schemas.microsoft.com/office/drawing/2016/5/14/chartex" xmlns:mc="http://schemas.openxmlformats.org/markup-compatibility/2006" xmlns:m="http://schemas.openxmlformats.org/officeDocument/2006/math" xmlns:aink="http://schemas.microsoft.com/office/drawing/2016/ink" xmlns:am3d="http://schemas.microsoft.com/office/drawing/2017/model3d" xmlns:oel="http://schemas.microsoft.com/office/2019/extlst" xmlns:r="http://schemas.openxmlformats.org/officeDocument/2006/relationships" xmlns:wp14="http://schemas.microsoft.com/office/word/2010/wordprocessingDrawing" xmlns:wp="http://schemas.openxmlformats.org/drawingml/2006/wordprocessingDrawing" xmlns:wpg="http://schemas.microsoft.com/office/word/2010/wordprocessingGroup" xmlns:wpi="http://schemas.microsoft.com/office/word/2010/wordprocessingInk" xmlns:wps="http://schemas.microsoft.com/office/word/2010/wordprocessingShape" xmlns:o="urn:schemas-microsoft-com:office:office" xmlns:v="urn:schemas-microsoft-com:vml" xmlns:w10="urn:schemas-microsoft-com:office:word" xmlns:w="http://schemas.openxmlformats.org/wordprocessingml/2006/main" xmlns:w14="http://schemas.microsoft.com/office/word/2010/wordml" xmlns:w15="http://schemas.microsoft.com/office/word/2012/wordml" xmlns:w16cei="http://schemas.microsoft.com/office/word/2026/wordml/cei" xmlns:w16cex="http://schemas.microsoft.com/office/word/2018/wordml/cex" xmlns:w16cid="http://schemas.microsoft.com/office/word/2016/wordml/cid" xmlns:w16="http://schemas.microsoft.com/office/word/2018/wordml" xmlns:w16sdtdh="http://schemas.microsoft.com/office/word/2020/wordml/sdtdatahash" xmlns:w16sdtfl="http://schemas.microsoft.com/office/word/2024/wordml/sdtformatlock" xmlns:w16se="http://schemas.microsoft.com/office/word/2015/wordml/symex" xmlns:w16du="http://schemas.microsoft.com/office/word/2023/wordml/word16du" xmlns:wne="http://schemas.microsoft.com/office/word/2006/wordml" mc:Ignorable="w14 w15 w16se w16cid w16 w16cex w16sdtdh w16sdtfl w16du wp14">
+  <w:p>
+    <w:pPr>
+      <w:pStyle w:val="Header"/>
+      <w:pBdr>
+        <w:bottom w:val="single" w:sz="4" w:space="1" w:color="7F7F7F" w:themeColor="text1" w:themeTint="80"/>
+      </w:pBdr>
+      <w:rPr>
+        <w:color w:val="7F7F7F" w:themeColor="text1" w:themeTint="80"/>
+        <w:lang w:val="vi-VN"/>
+      </w:rPr>
+    </w:pPr>
+    <w:r>
+      <w:rPr>
+        <w:color w:val="7F7F7F" w:themeColor="text1" w:themeTint="80"/>
+        <w:lang w:val="vi-VN"/>
+      </w:rPr>
+      <w:t>Xử Lý Ngôn Ngữ Tự Nhiên</w:t>
+    </w:r>
+  </w:p>
+  <w:p>
+    <w:pPr>
+      <w:pStyle w:val="Header"/>
+    </w:pPr>
+  </w:p>
+</w:hdr>
 </file>
 
 <file path=word/numbering.xml><?xml version="1.0" encoding="utf-8"?>
@@ -17993,8 +18299,8 @@
     <w:lsdException w:name="Normal Indent" w:semiHidden="1" w:unhideWhenUsed="1"/>
     <w:lsdException w:name="footnote text" w:semiHidden="1" w:unhideWhenUsed="1"/>
     <w:lsdException w:name="annotation text" w:semiHidden="1" w:unhideWhenUsed="1"/>
-    <w:lsdException w:name="header" w:semiHidden="1" w:unhideWhenUsed="1"/>
-    <w:lsdException w:name="footer" w:semiHidden="1" w:unhideWhenUsed="1"/>
+    <w:lsdException w:name="header" w:semiHidden="1" w:uiPriority="0" w:unhideWhenUsed="1"/>
+    <w:lsdException w:name="footer" w:semiHidden="1" w:uiPriority="0" w:unhideWhenUsed="1"/>
     <w:lsdException w:name="index heading" w:semiHidden="1" w:unhideWhenUsed="1"/>
     <w:lsdException w:name="caption" w:semiHidden="1" w:uiPriority="35" w:unhideWhenUsed="1" w:qFormat="1"/>
     <w:lsdException w:name="table of figures" w:semiHidden="1" w:unhideWhenUsed="1"/>
@@ -18003,7 +18309,7 @@
     <w:lsdException w:name="footnote reference" w:semiHidden="1" w:unhideWhenUsed="1"/>
     <w:lsdException w:name="annotation reference" w:semiHidden="1" w:unhideWhenUsed="1"/>
     <w:lsdException w:name="line number" w:semiHidden="1" w:unhideWhenUsed="1"/>
-    <w:lsdException w:name="page number" w:semiHidden="1" w:unhideWhenUsed="1"/>
+    <w:lsdException w:name="page number" w:semiHidden="1" w:uiPriority="0" w:unhideWhenUsed="1"/>
     <w:lsdException w:name="endnote reference" w:semiHidden="1" w:unhideWhenUsed="1"/>
     <w:lsdException w:name="endnote text" w:semiHidden="1" w:unhideWhenUsed="1"/>
     <w:lsdException w:name="table of authorities" w:semiHidden="1" w:unhideWhenUsed="1"/>
@@ -18555,6 +18861,7 @@
   <w:style w:type="character" w:default="1" w:styleId="DefaultParagraphFont">
     <w:name w:val="Default Paragraph Font"/>
     <w:uiPriority w:val="1"/>
+    <w:semiHidden/>
     <w:unhideWhenUsed/>
   </w:style>
   <w:style w:type="table" w:default="1" w:styleId="TableNormal">
@@ -18582,7 +18889,6 @@
     <w:name w:val="header"/>
     <w:basedOn w:val="Normal"/>
     <w:link w:val="HeaderChar"/>
-    <w:uiPriority w:val="99"/>
     <w:unhideWhenUsed/>
     <w:rsid w:val="00E618BF"/>
     <w:pPr>
@@ -18597,14 +18903,12 @@
     <w:name w:val="Header Char"/>
     <w:basedOn w:val="DefaultParagraphFont"/>
     <w:link w:val="Header"/>
-    <w:uiPriority w:val="99"/>
     <w:rsid w:val="00E618BF"/>
   </w:style>
   <w:style w:type="paragraph" w:styleId="Footer">
     <w:name w:val="footer"/>
     <w:basedOn w:val="Normal"/>
     <w:link w:val="FooterChar"/>
-    <w:uiPriority w:val="99"/>
     <w:unhideWhenUsed/>
     <w:rsid w:val="00E618BF"/>
     <w:pPr>
@@ -18619,7 +18923,6 @@
     <w:name w:val="Footer Char"/>
     <w:basedOn w:val="DefaultParagraphFont"/>
     <w:link w:val="Footer"/>
-    <w:uiPriority w:val="99"/>
     <w:rsid w:val="00E618BF"/>
   </w:style>
   <w:style w:type="paragraph" w:styleId="NoSpacing">
@@ -29507,6 +29810,11 @@
       <w:szCs w:val="18"/>
     </w:rPr>
   </w:style>
+  <w:style w:type="character" w:styleId="PageNumber">
+    <w:name w:val="page number"/>
+    <w:basedOn w:val="DefaultParagraphFont"/>
+    <w:rsid w:val="00146BF4"/>
+  </w:style>
 </w:styles>
 </file>
 

</xml_diff>

<commit_message>
docs(report): front matter có thông tin bìa rời (Nhóm 19, nộp 22/09/2026)
Thêm các khóa course_en, program, major, group_code, submission_date để
skill uit-cover dựng bìa từ cùng một nguồn với báo cáo Word. Bộ dựng Word
bỏ qua các khóa này nên BAO_CAO.docx không đổi. Bìa đã dựng trong repo
CourseProj-Report_w_Pandoc (configs/CS221-XLNNTN.tex, commit f7629a8).
</commit_message>
<xml_diff>
--- a/report/BAO_CAO.docx
+++ b/report/BAO_CAO.docx
@@ -2138,10 +2138,7 @@
         <w:jc w:val="both"/>
       </w:pPr>
       <w:r>
-        <w:t>Hệ thống đi qua năm bước: dữ liệu, tiền xử lý, biểu diễn, mô hình, đánh giá. Tiền xử lý chuẩn hóa Unicode, teencode và chữ lặp, rồi tách từ bằng pyvi trước khi hạ chữ thường. Hai bài toán con dùng hai cách biểu diễn: vector câu 768 chiều từ mô hình Sentence-BERT tiếng Việt cho gom cụm chủ đề bằng BERTopic, và TF-IDF unigram cộng bigram cho phân loại cảm xúc bằng LinearSVC. Mọi bước chọn mô hình chạy bằng cross-validation 5-fold trên 15.997 dòng huấn luyện; 4.000 dòng kiểm tra được đánh giá đúng một lần. Toà</w:t>
-      </w:r>
-      <w:r>
-        <w:t>n bộ pipeline đóng gói thành ứng dụng Streamlit kèm 146 kiểm thử tự động.</w:t>
+        <w:t>Hệ thống đi qua năm bước: dữ liệu, tiền xử lý, biểu diễn, mô hình, đánh giá. Tiền xử lý chuẩn hóa Unicode, teencode và chữ lặp, rồi tách từ bằng pyvi trước khi hạ chữ thường. Hai bài toán con dùng hai cách biểu diễn: vector câu 768 chiều từ mô hình Sentence-BERT tiếng Việt cho gom cụm chủ đề bằng BERTopic, và TF-IDF unigram cộng bigram cho phân loại cảm xúc bằng LinearSVC. Mọi bước chọn mô hình chạy bằng cross-validation 5-fold trên 15.997 dòng huấn luyện; 4.000 dòng kiểm tra được đánh giá đúng một lần. Toàn bộ pipeline đóng gói thành ứng dụng Streamlit kèm 146 kiểm thử tự động.</w:t>
       </w:r>
     </w:p>
     <w:p>
@@ -2149,13 +2146,7 @@
         <w:jc w:val="both"/>
       </w:pPr>
       <w:r>
-        <w:t>Ba kết quả chính. Một, mô hình cảm xúc đạt macro-F1 0,7161 trên tập kiểm tra và 0,7200 ± 0,0037 trên năm hạt giống; lớp trung tính là giới hạn với F1 0,5354. Hai, LinearSVC với C = 0,3 và LogisticRegression cách nhau 0,0010 macro-F1, nhỏ hơn độ lệch chuẩn giữa các fold; phần cải thiện đo được đến từ việc dò C (0,7054 lên 0,7180), còn thay đổi tiền xử lý là trung tính đối với bộ phân loại. Ba, min_samples</w:t>
-      </w:r>
-      <w:r>
-        <w:t xml:space="preserve"> của HDBSCAN quyết định kết quả chủ đề: tham số mặc định của BERTopic đẩy 49,2% bình luận vào nhiễu, còn cấu hình kích thước cụm tối thiểu 15 và min_samples</w:t>
-      </w:r>
-      <w:r>
-        <w:t xml:space="preserve"> 1 cho 26 chủ đề với 33,3% nhiễu trên 1.493 bình luận. Hạn chế cần đọc kèm mọi con số: nhãn là nhãn silver do mô hình ngôn ngữ lớn gán tự động, chưa được người kiểm tra từng dòng, và theo chính tác giả dữ liệu thì lớp trung tính là lớp nhiễu nhất (mục 2.1). Phần đọc tay 150 bình luận dự đoán sai ở mục 7 tìm thấy 7 dòng mà người đọc không đồng ý với nhãn gốc.</w:t>
+        <w:t>Ba kết quả chính. Một, mô hình cảm xúc đạt macro-F1 0,7161 trên tập kiểm tra và 0,7200 ± 0,0037 trên năm hạt giống; lớp trung tính là giới hạn với F1 0,5354. Hai, LinearSVC với C = 0,3 và LogisticRegression cách nhau 0,0010 macro-F1, nhỏ hơn độ lệch chuẩn giữa các fold; phần cải thiện đo được đến từ việc dò C (0,7054 lên 0,7180), còn thay đổi tiền xử lý là trung tính đối với bộ phân loại. Ba, min_samples của HDBSCAN quyết định kết quả chủ đề: tham số mặc định của BERTopic đẩy 49,2% bình luận vào nhiễu, còn cấu hình kích thước cụm tối thiểu 15 và min_samples 1 cho 26 chủ đề với 33,3% nhiễu trên 1.493 bình luận. Hạn chế cần đọc kèm mọi con số: nhãn là nhãn silver do mô hình ngôn ngữ lớn gán tự động, chưa được người kiểm tra từng dòng, và theo chính tác giả dữ liệu thì lớp trung tính là lớp nhiễu nhất (mục 2.1). Phần đọc tay 150 bình luận dự đoán sai ở mục 7 tìm thấy 7 dòng mà người đọc không đồng ý với nhãn gốc.</w:t>
       </w:r>
     </w:p>
     <w:p>
@@ -2195,10 +2186,7 @@
         <w:jc w:val="both"/>
       </w:pPr>
       <w:r>
-        <w:t>Đồ án đi theo đúng năm bước của môn học (dữ liệu, tiền xử lý, biểu diễn, mô hình, đánh giá) và đóng góp ở hai mặt. Về phương pháp, chúng tôi ghép hai hướng biểu diễn khác nhau cho hai bài toán con: vector câu 768 chiều từ mô hình Sentence-BERT tiếng Việt cho việc gom cụm chủ đề bằng BERTopic, và TF-IDF n-gram cho việc phân loại cảm xúc bằng LinearSVC huấn luyện trên 20.000 bình luận có nhãn. Về thực nghiệm, mọi lựa chọn đều có đối chứng: bốn mô hình nền và lưới tham số C cho phân loại cảm xúc, so sánh hai p</w:t>
-      </w:r>
-      <w:r>
-        <w:t>hiên bản tiền xử lý trên năm hạt giống, và bảng khảo sát tham số HDBSCAN cho phần chủ đề. Toàn bộ pipeline được đóng gói thành một ứng dụng Streamlit và một bộ 146 kiểm thử tự động.</w:t>
+        <w:t>Đồ án đi theo đúng năm bước của môn học (dữ liệu, tiền xử lý, biểu diễn, mô hình, đánh giá) và đóng góp ở hai mặt. Về phương pháp, chúng tôi ghép hai hướng biểu diễn khác nhau cho hai bài toán con: vector câu 768 chiều từ mô hình Sentence-BERT tiếng Việt cho việc gom cụm chủ đề bằng BERTopic, và TF-IDF n-gram cho việc phân loại cảm xúc bằng LinearSVC huấn luyện trên 20.000 bình luận có nhãn. Về thực nghiệm, mọi lựa chọn đều có đối chứng: bốn mô hình nền và lưới tham số C cho phân loại cảm xúc, so sánh hai phiên bản tiền xử lý trên năm hạt giống, và bảng khảo sát tham số HDBSCAN cho phần chủ đề. Toàn bộ pipeline được đóng gói thành một ứng dụng Streamlit và một bộ 146 kiểm thử tự động.</w:t>
       </w:r>
     </w:p>
     <w:p>
@@ -2649,7 +2637,6 @@
         <w:jc w:val="both"/>
       </w:pPr>
       <w:r>
-        <w:lastRenderedPageBreak/>
         <w:t>Theo điều kiện trên, mã nguồn và tệp dữ liệu của đồ án chỉ nộp cho môn học, không đưa lên nơi công khai.</w:t>
       </w:r>
     </w:p>
@@ -2659,6 +2646,7 @@
       </w:pPr>
       <w:bookmarkStart w:id="4" w:name="_Toc240922945"/>
       <w:r>
+        <w:lastRenderedPageBreak/>
         <w:t>2.2. Thống kê</w:t>
       </w:r>
       <w:bookmarkEnd w:id="4"/>
@@ -3353,10 +3341,7 @@
         <w:jc w:val="both"/>
       </w:pPr>
       <w:r>
-        <w:t xml:space="preserve">Hai điểm cần đọc kỹ. Số 7.000 tròn cho nhãn 0 và tổng 20.000 tròn là kết quả của bước lấy mẫu lại do tác giả gói dữ liệu thực hiện (mục 2.1): giữ toàn bộ bình luận trung tính hợp lệ, lấy 7.000 bình luận tiêu cực, phần còn lại lấy từ bình luận tích cực, trong khi dữ liệu gốc khoảng 88% tích cực. Tỉ lệ ba lớp trong bảng vì vậy do tác giả chọn để giảm mất cân bằng, không phản ánh tỉ lệ thật trên YouTube, và mọi số đo ở mục 6 đều đo trên phân bố này. Toàn bộ bình luận đều nói về một chương trình duy nhất, "Anh </w:t>
-      </w:r>
-      <w:r>
-        <w:t>Trai Say Hi", nên các con số ở mục 6 chỉ có giá trị trong miền đó; hệ quả được bàn ở mục 9.</w:t>
+        <w:t>Hai điểm cần đọc kỹ. Số 7.000 tròn cho nhãn 0 và tổng 20.000 tròn là kết quả của bước lấy mẫu lại do tác giả gói dữ liệu thực hiện (mục 2.1): giữ toàn bộ bình luận trung tính hợp lệ, lấy 7.000 bình luận tiêu cực, phần còn lại lấy từ bình luận tích cực, trong khi dữ liệu gốc khoảng 88% tích cực. Tỉ lệ ba lớp trong bảng vì vậy do tác giả chọn để giảm mất cân bằng, không phản ánh tỉ lệ thật trên YouTube, và mọi số đo ở mục 6 đều đo trên phân bố này. Toàn bộ bình luận đều nói về một chương trình duy nhất, "Anh Trai Say Hi", nên các con số ở mục 6 chỉ có giá trị trong miền đó; hệ quả được bàn ở mục 9.</w:t>
       </w:r>
     </w:p>
     <w:p>
@@ -3374,13 +3359,7 @@
         <w:jc w:val="both"/>
       </w:pPr>
       <w:r>
-        <w:t>Ba nhãn dùng theo quy ước của tệp dữ liệu: 0 tiêu cực, 1 trung tính, 2</w:t>
-      </w:r>
-      <w:r>
-        <w:t xml:space="preserve"> tích cực. Theo README của tác giả, nhãn gốc được gán theo từng đối tượng (chương trình hoặc nghệ sĩ) và từng khía cạnh (chuyên môn, ngoại hình/phong cách, tính cách, độ nổi tiếng), rồi gộp thành một nhãn tổng thể: có ít nhất một nhãn tích cực thì tích cực; không có nhãn tích cực nhưng có nhãn tiêu cực thì tiêu cực; chỉ có nhãn trung tính thì trung tính. Bình luận vừa có nhãn tích cực vừa có nhãn tiêu cực đã bị loại. Đọc lại từ dữ liệu, chúng tôi thấy lớp 0 là chê, thất vọng, bức xúc; lớp 2</w:t>
-      </w:r>
-      <w:r>
-        <w:t xml:space="preserve"> là khen, yêu thích, cảm động; lớp 1 là nhận xét không nghiêng về khen hay chê, câu hỏi, câu kể, và cả những câu vừa khen vừa chê nhẹ. Điểm cuối khớp với ghi chú của tác giả rằng trung tính là nhãn nhiễu nhất: một số câu chê nhẹ hoặc khen nhẹ vẫn được gán trung tính.</w:t>
+        <w:t>Ba nhãn dùng theo quy ước của tệp dữ liệu: 0 tiêu cực, 1 trung tính, 2 tích cực. Theo README của tác giả, nhãn gốc được gán theo từng đối tượng (chương trình hoặc nghệ sĩ) và từng khía cạnh (chuyên môn, ngoại hình/phong cách, tính cách, độ nổi tiếng), rồi gộp thành một nhãn tổng thể: có ít nhất một nhãn tích cực thì tích cực; không có nhãn tích cực nhưng có nhãn tiêu cực thì tiêu cực; chỉ có nhãn trung tính thì trung tính. Bình luận vừa có nhãn tích cực vừa có nhãn tiêu cực đã bị loại. Đọc lại từ dữ liệu, chúng tôi thấy lớp 0 là chê, thất vọng, bức xúc; lớp 2 là khen, yêu thích, cảm động; lớp 1 là nhận xét không nghiêng về khen hay chê, câu hỏi, câu kể, và cả những câu vừa khen vừa chê nhẹ. Điểm cuối khớp với ghi chú của tác giả rằng trung tính là nhãn nhiễu nhất: một số câu chê nhẹ hoặc khen nhẹ vẫn được gán trung tính.</w:t>
       </w:r>
     </w:p>
     <w:p>
@@ -3389,7 +3368,6 @@
       </w:pPr>
       <w:bookmarkStart w:id="6" w:name="_Toc240922947"/>
       <w:r>
-        <w:lastRenderedPageBreak/>
         <w:t>2.4. Chia tập huấn luyện và kiểm tra</w:t>
       </w:r>
       <w:bookmarkEnd w:id="6"/>
@@ -3399,24 +3377,19 @@
         <w:jc w:val="both"/>
       </w:pPr>
       <w:r>
-        <w:t>Sau tiền xử lý, 19.997 dòng được chia phân tầng theo nhãn thành 15.997 dòng huấn luyện và 4.000 dòng kiểm tra với hạt giống 42 (results/metrics.json, khóa split</w:t>
+        <w:t xml:space="preserve">Sau tiền xử lý, 19.997 dòng được chia phân tầng theo nhãn thành 15.997 dòng huấn luyện và 4.000 dòng kiểm tra với hạt giống 42 (results/metrics.json, khóa split). Mọi bước chọn mô </w:t>
       </w:r>
       <w:r>
-        <w:t>). Mọi bước chọn mô hình và dò tham số chỉ dùng tập huấn luyện bằng cross-validation 5-fold; tập kiểm tra được đánh giá đúng một lần ở mục 6.</w:t>
+        <w:lastRenderedPageBreak/>
+        <w:t>hình và dò tham số chỉ dùng tập huấn luyện bằng cross-validation 5-fold; tập kiểm tra được đánh giá đúng một lần ở mục 6.</w:t>
       </w:r>
     </w:p>
     <w:p>
-      <w:r>
-        <w:br w:type="page"/>
-      </w:r>
-    </w:p>
-    <w:p>
       <w:pPr>
         <w:pStyle w:val="Heading1"/>
       </w:pPr>
       <w:bookmarkStart w:id="7" w:name="_Toc240922948"/>
       <w:r>
-        <w:lastRenderedPageBreak/>
         <w:t>3. Tiền xử lý</w:t>
       </w:r>
       <w:bookmarkEnd w:id="7"/>
@@ -3558,13 +3531,7 @@
         <w:jc w:val="both"/>
       </w:pPr>
       <w:r>
-        <w:t>pyvi phân biệt chữ hoa và chữ thường khi ghép tên riêng. Kiểm tra trực tiếp ngày 18-09-2026: ViTokenizer.tokenize("Đông Hùng hát") trả về Đông_Hùng hát</w:t>
-      </w:r>
-      <w:r>
-        <w:t>, còn với đầu vào đã hạ chữ thường trả về đông hùng hát, tức là hai âm tiết rời. Phiên bản đầu của đồ án hạ chữ thường ngay trong bước làm sạch, nên cụm đông_hùng mà báo cáo cũ lấy làm ví dụ thực ra chưa bao giờ được tạo ra. Phiên bản hiện tại giữ nguyên chữ hoa qua clean_text, tách từ, rồi mới hạ chữ thường; nhờ vậy tên riêng như Đông_Hùng là token đơn trong cả từ khóa chủ đề lẫn đặc trưng TF-IDF. Thứ tự này chỉ đem lại lợi ích cho tên riêng: các từ ghép thông thường như chương_trình, khán_giả</w:t>
-      </w:r>
-      <w:r>
-        <w:t xml:space="preserve"> được pyvi ghép đúng dù đầu vào viết hoa hay viết thường (kiểm tra cùng ngày).</w:t>
+        <w:t>pyvi phân biệt chữ hoa và chữ thường khi ghép tên riêng. Kiểm tra trực tiếp ngày 18-09-2026: ViTokenizer.tokenize("Đông Hùng hát") trả về Đông_Hùng hát, còn với đầu vào đã hạ chữ thường trả về đông hùng hát, tức là hai âm tiết rời. Phiên bản đầu của đồ án hạ chữ thường ngay trong bước làm sạch, nên cụm đông_hùng mà báo cáo cũ lấy làm ví dụ thực ra chưa bao giờ được tạo ra. Phiên bản hiện tại giữ nguyên chữ hoa qua clean_text, tách từ, rồi mới hạ chữ thường; nhờ vậy tên riêng như Đông_Hùng là token đơn trong cả từ khóa chủ đề lẫn đặc trưng TF-IDF. Thứ tự này chỉ đem lại lợi ích cho tên riêng: các từ ghép thông thường như chương_trình, khán_giả được pyvi ghép đúng dù đầu vào viết hoa hay viết thường (kiểm tra cùng ngày).</w:t>
       </w:r>
     </w:p>
     <w:p>
@@ -3582,10 +3549,11 @@
         <w:jc w:val="both"/>
       </w:pPr>
       <w:r>
-        <w:t>Từ điển chỉ chuẩn hóa biến thể chính tả của cùng một từ về dạng chuẩn: ko, k, hok, khong thành không; đc, dc thành được; j thành gì; oke, okie thành ok. Từ điển không dịch tiếng lóng hay từ chửi sang một từ mang sắc thái cảm xúc. Phiên bản cũ có các ánh xạ ok thành tốt, vcl thành rất, đkm thành tồi, và sp thành sản phẩm</w:t>
+        <w:t xml:space="preserve">Từ điển chỉ chuẩn hóa biến thể chính tả của cùng một từ về dạng chuẩn: ko, k, hok, khong thành không; đc, dc thành được; j thành gì; oke, okie thành ok. Từ điển không dịch tiếng lóng hay từ chửi sang một từ mang sắc thái cảm xúc. Phiên bản cũ có các ánh xạ ok thành tốt, vcl thành rất, đkm thành tồi, và sp thành sản phẩm (một ánh xạ của miền thương mại điện tử, không phù hợp với bình luận YouTube). Những ánh xạ này là tự gán nhãn cảm xúc cho dữ </w:t>
       </w:r>
       <w:r>
-        <w:t xml:space="preserve"> (một ánh xạ của miền thương mại điện tử, không phù hợp với bình luận YouTube). Những ánh xạ này là tự gán nhãn cảm xúc cho dữ liệu trước khi mô hình được học; chúng tôi bỏ chúng và để bộ phân loại tự học trọng số của các token đó từ 20.000 mẫu có nhãn.</w:t>
+        <w:lastRenderedPageBreak/>
+        <w:t>liệu trước khi mô hình được học; chúng tôi bỏ chúng và để bộ phân loại tự học trọng số của các token đó từ 20.000 mẫu có nhãn.</w:t>
       </w:r>
     </w:p>
     <w:p>
@@ -3594,7 +3562,6 @@
       </w:pPr>
       <w:bookmarkStart w:id="11" w:name="_Toc240922952"/>
       <w:r>
-        <w:lastRenderedPageBreak/>
         <w:t>3.4. Từ dừng chỉ dùng cho từ khóa chủ đề</w:t>
       </w:r>
       <w:bookmarkEnd w:id="11"/>
@@ -3604,10 +3571,7 @@
         <w:jc w:val="both"/>
       </w:pPr>
       <w:r>
-        <w:t>Tệp src/resources/vietnamese_stopwords.txt có 236 mục do nhóm tự biên soạn, viết ở dạng đã tách từ (như_thế_nào, tuy_nhiên</w:t>
-      </w:r>
-      <w:r>
-        <w:t>) để khớp trực tiếp với token của pyvi. Danh sách chỉ giữ hư từ và tiểu từ kiểu chat; từ mang nội dung hoặc sắc thái (hay, hát, buồn, đỉnh) không có trong đó vì đó chính là thứ mô hình chủ đề cần thấy.</w:t>
+        <w:t>Tệp src/resources/vietnamese_stopwords.txt có 236 mục do nhóm tự biên soạn, viết ở dạng đã tách từ (như_thế_nào, tuy_nhiên) để khớp trực tiếp với token của pyvi. Danh sách chỉ giữ hư từ và tiểu từ kiểu chat; từ mang nội dung hoặc sắc thái (hay, hát, buồn, đỉnh) không có trong đó vì đó chính là thứ mô hình chủ đề cần thấy.</w:t>
       </w:r>
     </w:p>
     <w:p>
@@ -3615,10 +3579,7 @@
         <w:jc w:val="both"/>
       </w:pPr>
       <w:r>
-        <w:t>Danh sách này chỉ được đưa vào CountVectorizer của bước c-TF-IDF (mục 4.3), không đưa vào TF-IDF của bộ phân loại cảm xúc. Lý do: không và các từ phủ định khác nằm trong danh sách từ dừng, trong khi không là đặc trưng có trọng số dương lớn nhất của lớp tiêu cực (+2,93 trong results/top_features.txt</w:t>
-      </w:r>
-      <w:r>
-        <w:t>). Loại từ dừng ở đây sẽ làm mất chính tín hiệu phủ định.</w:t>
+        <w:t>Danh sách này chỉ được đưa vào CountVectorizer của bước c-TF-IDF (mục 4.3), không đưa vào TF-IDF của bộ phân loại cảm xúc. Lý do: không và các từ phủ định khác nằm trong danh sách từ dừng, trong khi không là đặc trưng có trọng số dương lớn nhất của lớp tiêu cực (+2,93 trong results/top_features.txt). Loại từ dừng ở đây sẽ làm mất chính tín hiệu phủ định.</w:t>
       </w:r>
     </w:p>
     <w:p>
@@ -3636,10 +3597,7 @@
         <w:jc w:val="both"/>
       </w:pPr>
       <w:r>
-        <w:t xml:space="preserve">Để biết thay đổi tiền xử lý ảnh hưởng thế nào tới bộ phân loại, chúng tôi chạy cùng một pipeline TF-IDF + LinearSVC với hai phiên bản tiền xử lý trên năm hạt giống chia tập (0 đến 4). Phiên bản cũ là bản sao đóng băng của mã tiền xử lý ban đầu (experiments/preprocess_baseline.py); phiên bản mới là src/preprocess.py hiện tại. Script experiments/ab_preprocess.py ghi kết quả vào results/ab_preprocess.txt và </w:t>
-      </w:r>
-      <w:r>
-        <w:t>results/ab_preprocess.csv. Giá trị trong bảng là trung bình ± độ lệch chuẩn mẫu (ddof = 1) trên năm hạt giống.</w:t>
+        <w:t>Để biết thay đổi tiền xử lý ảnh hưởng thế nào tới bộ phân loại, chúng tôi chạy cùng một pipeline TF-IDF + LinearSVC với hai phiên bản tiền xử lý trên năm hạt giống chia tập (0 đến 4). Phiên bản cũ là bản sao đóng băng của mã tiền xử lý ban đầu (experiments/preprocess_baseline.py); phiên bản mới là src/preprocess.py hiện tại. Script experiments/ab_preprocess.py ghi kết quả vào results/ab_preprocess.txt và results/ab_preprocess.csv. Giá trị trong bảng là trung bình ± độ lệch chuẩn mẫu (ddof = 1) trên năm hạt giống.</w:t>
       </w:r>
     </w:p>
     <w:tbl>
@@ -4122,10 +4080,7 @@
         <w:jc w:val="both"/>
       </w:pPr>
       <w:r>
-        <w:t xml:space="preserve">Văn bản đã tách từ được đưa qua TfidfVectorizer với ngram_range=(1, 2), max_features=15000, </w:t>
-      </w:r>
-      <w:r>
-        <w:t>sublinear_tf=True (results/metrics.json, khóa features). Bigram là cần thiết vì phủ định trong tiếng Việt đứng trước từ được phủ định: không hay, không thích là hai trong năm đặc trưng mạnh nhất của lớp tiêu cực, còn hay mà, hay nhưng là đặc trưng của lớp trung tính (results/top_features.txt). Với unigram thuần, hay sẽ kéo cả ba câu về lớp tích cực.</w:t>
+        <w:t>Văn bản đã tách từ được đưa qua TfidfVectorizer với ngram_range=(1, 2), max_features=15000, sublinear_tf=True (results/metrics.json, khóa features). Bigram là cần thiết vì phủ định trong tiếng Việt đứng trước từ được phủ định: không hay, không thích là hai trong năm đặc trưng mạnh nhất của lớp tiêu cực, còn hay mà, hay nhưng là đặc trưng của lớp trung tính (results/top_features.txt). Với unigram thuần, hay sẽ kéo cả ba câu về lớp tích cực.</w:t>
       </w:r>
     </w:p>
     <w:p>
@@ -4143,10 +4098,7 @@
         <w:jc w:val="both"/>
       </w:pPr>
       <w:r>
-        <w:t>Mỗi bình luận đã tách từ được mã hóa bằng keepitreal/vietnamese-sbert</w:t>
-      </w:r>
-      <w:r>
-        <w:t>, một mô hình Sentence-BERT tiếng Việt. Thẻ mô hình không nêu mô hình gốc; chúng tôi suy ra nó được tinh chỉnh từ PhoBERT-base dựa trên config.json của mô hình trên Hugging Face Hub: _name_or_path là sentence_phobert_nli, kiến trúc RoBERTa, 12 tầng, kích thước ẩn 768, bộ tách từ PhobertTokenizer với từ vựng 64.001, max_position_embeddings 258. Theo thẻ mô hình sentence-transformers: max_seq_length 256, mean pooling, huấn luyện bằng CosineSimilarityLoss. Kết quả là một vector câu 768 chiều cho mỗi bình luận.</w:t>
+        <w:t>Mỗi bình luận đã tách từ được mã hóa bằng keepitreal/vietnamese-sbert, một mô hình Sentence-BERT tiếng Việt. Thẻ mô hình không nêu mô hình gốc; chúng tôi suy ra nó được tinh chỉnh từ PhoBERT-base dựa trên config.json của mô hình trên Hugging Face Hub: _name_or_path là sentence_phobert_nli, kiến trúc RoBERTa, 12 tầng, kích thước ẩn 768, bộ tách từ PhobertTokenizer với từ vựng 64.001, max_position_embeddings 258. Theo thẻ mô hình sentence-transformers: max_seq_length 256, mean pooling, huấn luyện bằng CosineSimilarityLoss. Kết quả là một vector câu 768 chiều cho mỗi bình luận.</w:t>
       </w:r>
     </w:p>
     <w:p>
@@ -4716,14 +4668,11 @@
         <w:jc w:val="both"/>
       </w:pPr>
       <w:r>
-        <w:t xml:space="preserve">Trọng số của cụm 1: hát 6 × 0,981 = 5,88; hay 3 × 0,693 = 2,08; quảng_cáo 1 × 0,811 = 0,81; hạng 0. Cụm 3: quảng_cáo 6 × 0,811 = 4,87; hay 4 × 0,693 = 2,77. Từ hay có mặt ở cả ba cụm nên thành phần logarit của nó thấp nhất; nó vẫn lọt vào từ khóa của mọi cụm nhưng luôn </w:t>
+        <w:t xml:space="preserve">Trọng số của cụm 1: hát 6 × 0,981 = 5,88; hay 3 × 0,693 = 2,08; quảng_cáo 1 × 0,811 = 0,81; hạng 0. Cụm 3: quảng_cáo 6 × 0,811 = 4,87; hay 4 × 0,693 = 2,77. Từ hay có mặt ở cả ba cụm nên thành phần logarit của nó thấp nhất; nó vẫn lọt vào từ khóa của mọi cụm nhưng luôn đứng sau từ đặc trưng riêng. Đó là lý do danh sách từ dừng ở mục 3.4 vẫn cần thiết: hư từ như </w:t>
       </w:r>
       <w:r>
         <w:lastRenderedPageBreak/>
-        <w:t>đứng sau từ đặc trưng riêng. Đó là lý do danh sách từ dừng ở mục 3.4 vẫn cần thiết: hư từ như là, của, mà</w:t>
-      </w:r>
-      <w:r>
-        <w:t xml:space="preserve"> xuất hiện ở mọi cụm với tần suất rất cao, và tần suất thô đủ để chúng chiếm đầu bảng nếu không bị loại.</w:t>
+        <w:t>là, của, mà xuất hiện ở mọi cụm với tần suất rất cao, và tần suất thô đủ để chúng chiếm đầu bảng nếu không bị loại.</w:t>
       </w:r>
     </w:p>
     <w:p>
@@ -4735,17 +4684,11 @@
       </w:r>
     </w:p>
     <w:p>
-      <w:r>
-        <w:br w:type="page"/>
-      </w:r>
-    </w:p>
-    <w:p>
       <w:pPr>
         <w:pStyle w:val="Heading1"/>
       </w:pPr>
       <w:bookmarkStart w:id="17" w:name="_Toc240922958"/>
       <w:r>
-        <w:lastRenderedPageBreak/>
         <w:t>5. Mô hình</w:t>
       </w:r>
       <w:bookmarkEnd w:id="17"/>
@@ -4765,10 +4708,7 @@
         <w:jc w:val="both"/>
       </w:pPr>
       <w:r>
-        <w:t xml:space="preserve">Bốn mô hình được so sánh bằng cross-validation 5-fold phân tầng trên 15.997 dòng huấn luyện, cùng một bộ đặc trưng TF-IDF (results/model_comparison.csv). LogisticRegression và LinearSVC dùng </w:t>
-      </w:r>
-      <w:r>
-        <w:t>class_weight="balanced" để bù cho lớp trung tính chỉ chiếm 17%.</w:t>
+        <w:t>Bốn mô hình được so sánh bằng cross-validation 5-fold phân tầng trên 15.997 dòng huấn luyện, cùng một bộ đặc trưng TF-IDF (results/model_comparison.csv). LogisticRegression và LinearSVC dùng class_weight="balanced" để bù cho lớp trung tính chỉ chiếm 17%.</w:t>
       </w:r>
     </w:p>
     <w:tbl>
@@ -5105,10 +5045,7 @@
         <w:jc w:val="both"/>
       </w:pPr>
       <w:r>
-        <w:t xml:space="preserve">Tham số C của LinearSVC được dò trên lưới bốn giá trị theo macro-F1 cross-validation, vẫn chỉ trên tập huấn luyện (results/metrics.json, khóa </w:t>
-      </w:r>
-      <w:r>
-        <w:t>selected_model.c_grid_results):</w:t>
+        <w:t>Tham số C của LinearSVC được dò trên lưới bốn giá trị theo macro-F1 cross-validation, vẫn chỉ trên tập huấn luyện (results/metrics.json, khóa selected_model.c_grid_results):</w:t>
       </w:r>
     </w:p>
     <w:tbl>
@@ -5324,10 +5261,7 @@
         <w:jc w:val="both"/>
       </w:pPr>
       <w:r>
-        <w:t>Pipeline trong src/topic_pipeline.py</w:t>
-      </w:r>
-      <w:r>
-        <w:t xml:space="preserve"> khai báo tường minh bốn thành phần:</w:t>
+        <w:t>Pipeline trong src/topic_pipeline.py khai báo tường minh bốn thành phần:</w:t>
       </w:r>
     </w:p>
     <w:p>
@@ -5359,6 +5293,7 @@
         <w:pStyle w:val="ListBullet"/>
       </w:pPr>
       <w:r>
+        <w:lastRenderedPageBreak/>
         <w:t>c-TF-IDF chọn 10 từ khóa cho mỗi chủ đề.</w:t>
       </w:r>
     </w:p>
@@ -5367,14 +5302,7 @@
         <w:jc w:val="both"/>
       </w:pPr>
       <w:r>
-        <w:t xml:space="preserve">Tham số mặc định của BERTopic không dùng được cho bình luận cùng một chương trình. Bảng dưới là kết quả khảo sát trên 1.500 dòng đầu của tập dữ liệu (còn 1.493 bình luận hợp lệ sau tiền xử lý; không phải bình luận của một video thật), nhúng bằng vietnamese-sbert, </w:t>
-      </w:r>
-      <w:r>
-        <w:lastRenderedPageBreak/>
-        <w:t xml:space="preserve">UMAP 15/5 hạt giống 42, danh sách 236 từ dừng của mục 3.4, chạy bằng script experiments/topic_ablation.py; kết quả ghi trong </w:t>
-      </w:r>
-      <w:r>
-        <w:t>results/topic_ablation.txt và results/topic_ablation.csv.</w:t>
+        <w:t>Tham số mặc định của BERTopic không dùng được cho bình luận cùng một chương trình. Bảng dưới là kết quả khảo sát trên 1.500 dòng đầu của tập dữ liệu (còn 1.493 bình luận hợp lệ sau tiền xử lý; không phải bình luận của một video thật), nhúng bằng vietnamese-sbert, UMAP 15/5 hạt giống 42, danh sách 236 từ dừng của mục 3.4, chạy bằng script experiments/topic_ablation.py; kết quả ghi trong results/topic_ablation.txt và results/topic_ablation.csv.</w:t>
       </w:r>
     </w:p>
     <w:tbl>
@@ -5989,13 +5917,7 @@
         <w:jc w:val="both"/>
       </w:pPr>
       <w:r>
-        <w:t xml:space="preserve">Bảng cho thấy hai kiểu thất bại đối nghịch. Với tham số mặc định của BERTopic (eom, kích thước cụm tối thiểu 10, </w:t>
-      </w:r>
-      <w:r>
-        <w:t>min_samples theo mặc định của HDBSCAN), gần nửa bình luận (49,2%) bị xếp vào nhiễu. Ngược lại, khi tăng min_samples lên 5 (hàng thứ hai), HDBSCAN trả về phép chia gốc: một cụm chứa 91,0% bình luận và không có nhiễu, vô nghĩa đối với một báo cáo chủ đề. min_samples là tham số quyết định hiện tượng này, không phải kích thước cụm tối thiểu. leaf cho nhiều cụm nhỏ nhưng đẩy hơn nửa dữ liệu vào nhiễu. Cấu hình eom, kích thước cụm tối thiểu 15, min_samples</w:t>
-      </w:r>
-      <w:r>
-        <w:t xml:space="preserve"> 1 cân bằng nhất trong bảng (26 chủ đề, 33,3% nhiễu, cụm lớn nhất 7,8%) và được đặt làm giá trị mặc định của ứng dụng. Trong mười chủ đề lớn nhất của lần chạy này (results/topic_cli_demo.txt), các cụm đọc được gồm phần trình diễn (hát, nghe, hay, bài, rap; 117 bình luận), tiếc nuối khi thí sinh bị loại (buồn, tập, lụy, loại; 101), thứ hạng (hạng, cuối, đứng, top; 81), và đánh giá của giám khảo và khán giả (khán_giả, chấm, điểm, bình_chọn, giám_khảo; 37); ba cụm khác xoay quanh tên riêng của từng thí sinh.</w:t>
+        <w:t>Bảng cho thấy hai kiểu thất bại đối nghịch. Với tham số mặc định của BERTopic (eom, kích thước cụm tối thiểu 10, min_samples theo mặc định của HDBSCAN), gần nửa bình luận (49,2%) bị xếp vào nhiễu. Ngược lại, khi tăng min_samples lên 5 (hàng thứ hai), HDBSCAN trả về phép chia gốc: một cụm chứa 91,0% bình luận và không có nhiễu, vô nghĩa đối với một báo cáo chủ đề. min_samples là tham số quyết định hiện tượng này, không phải kích thước cụm tối thiểu. leaf cho nhiều cụm nhỏ nhưng đẩy hơn nửa dữ liệu vào nhiễu. Cấu hình eom, kích thước cụm tối thiểu 15, min_samples 1 cân bằng nhất trong bảng (26 chủ đề, 33,3% nhiễu, cụm lớn nhất 7,8%) và được đặt làm giá trị mặc định của ứng dụng. Trong mười chủ đề lớn nhất của lần chạy này (results/topic_cli_demo.txt), các cụm đọc được gồm phần trình diễn (hát, nghe, hay, bài, rap; 117 bình luận), tiếc nuối khi thí sinh bị loại (buồn, tập, lụy, loại; 101), thứ hạng (hạng, cuối, đứng, top; 81), và đánh giá của giám khảo và khán giả (khán_giả, chấm, điểm, bình_chọn, giám_khảo; 37); ba cụm khác xoay quanh tên riêng của từng thí sinh.</w:t>
       </w:r>
     </w:p>
     <w:p>
@@ -6003,10 +5925,7 @@
         <w:jc w:val="both"/>
       </w:pPr>
       <w:r>
-        <w:t>Số chủ đề và tỉ lệ nhiễu phụ thuộc vào mẫu bình luận, và cần ghi rõ. Chạy CLI với cấu hình mặc định trên 1.500 dòng đầu (1.493 hợp lệ) cho 26 chủ đề và 33,3% nhiễu (results/topic_cli_demo.txt, trùng với hàng eom 15/1 của bảng vì cùng tập bình luận). Chạy ứng dụng trên 1.000 dòng đầu (còn 995) cho 23 chủ đề và 20,6% nhiễu (ảnh chụp ở mục 8). Danh sách từ dừng không ảnh hưởng tới hai con số này: BERTopic gom cụm trước, rồi mới đưa CountVectorizer vào bước chọn từ khóa, nên chạy lại với --no-stopwords</w:t>
-      </w:r>
-      <w:r>
-        <w:t xml:space="preserve"> cho phép gán chủ đề giống hệt từng dòng và chỉ từ khóa thay đổi. Việc cấu hình này có chuyển sang bình luận của một video thật hay không chưa được kiểm chứng, và ứng dụng để mở các tham số để người phân tích tự dò trên từng video.</w:t>
+        <w:t>Số chủ đề và tỉ lệ nhiễu phụ thuộc vào mẫu bình luận, và cần ghi rõ. Chạy CLI với cấu hình mặc định trên 1.500 dòng đầu (1.493 hợp lệ) cho 26 chủ đề và 33,3% nhiễu (results/topic_cli_demo.txt, trùng với hàng eom 15/1 của bảng vì cùng tập bình luận). Chạy ứng dụng trên 1.000 dòng đầu (còn 995) cho 23 chủ đề và 20,6% nhiễu (ảnh chụp ở mục 8). Danh sách từ dừng không ảnh hưởng tới hai con số này: BERTopic gom cụm trước, rồi mới đưa CountVectorizer vào bước chọn từ khóa, nên chạy lại với --no-stopwords cho phép gán chủ đề giống hệt từng dòng và chỉ từ khóa thay đổi. Việc cấu hình này có chuyển sang bình luận của một video thật hay không chưa được kiểm chứng, và ứng dụng để mở các tham số để người phân tích tự dò trên từng video.</w:t>
       </w:r>
     </w:p>
     <w:p>
@@ -6014,10 +5933,11 @@
         <w:jc w:val="both"/>
       </w:pPr>
       <w:r>
-        <w:t>Một bài học kỹ thuật đã xác minh trong mã nguồn thư viện: BERTopic khởi tạo với language="english", và khi không truyền embedding_model, bước tiền xử lý nội bộ xóa mọi ký tự ngoài [A-Za-z0-9 ] trước khi tính c-TF-IDF, biến không thành khng và chương_trình thành chngtrnh</w:t>
+        <w:t xml:space="preserve">Một bài học kỹ thuật đã xác minh trong mã nguồn thư viện: BERTopic khởi tạo với language="english", và khi không truyền embedding_model, bước tiền xử lý nội bộ xóa mọi </w:t>
       </w:r>
       <w:r>
-        <w:t>. Pipeline của đồ án luôn truyền mô hình nhúng vào BERTopic kể cả khi vector đã tính sẵn, và có một kiểm thử đơn vị xác nhận language của mô hình là None.</w:t>
+        <w:lastRenderedPageBreak/>
+        <w:t>ký tự ngoài [A-Za-z0-9 ] trước khi tính c-TF-IDF, biến không thành khng và chương_trình thành chngtrnh. Pipeline của đồ án luôn truyền mô hình nhúng vào BERTopic kể cả khi vector đã tính sẵn, và có một kiểm thử đơn vị xác nhận language của mô hình là None.</w:t>
       </w:r>
     </w:p>
     <w:p>
@@ -6026,7 +5946,6 @@
       </w:pPr>
       <w:bookmarkStart w:id="20" w:name="_Toc240922961"/>
       <w:r>
-        <w:lastRenderedPageBreak/>
         <w:t>5.3. Tóm tắt chủ đề bằng mô hình ngôn ngữ chạy nội bộ</w:t>
       </w:r>
       <w:bookmarkEnd w:id="20"/>
@@ -6036,10 +5955,7 @@
         <w:jc w:val="both"/>
       </w:pPr>
       <w:r>
-        <w:t>Từ khóa c-TF-IDF là danh sách rời. Lớp OllamaSummarizer (src/llm_summary.py) gửi 10 từ khóa và tối đa 10 bình luận tiêu biểu (văn bản gốc, không phải chuỗi đã tách từ) của mỗi chủ đề tới Ollama qua API tương thích OpenAI (http://localhost:11434/v1, mô hình qwen2, temperature=0.3</w:t>
-      </w:r>
-      <w:r>
-        <w:t>, tối đa 150 token) và yêu cầu đúng một câu tiếng Việt dưới 40 từ. Ứng dụng chỉ tóm tắt 8 chủ đề lớn nhất và kiểm tra Ollama có chạy không trước khi gọi.</w:t>
+        <w:t>Từ khóa c-TF-IDF là danh sách rời. Lớp OllamaSummarizer (src/llm_summary.py) gửi 10 từ khóa và tối đa 10 bình luận tiêu biểu (văn bản gốc, không phải chuỗi đã tách từ) của mỗi chủ đề tới Ollama qua API tương thích OpenAI (http://localhost:11434/v1, mô hình qwen2, temperature=0.3, tối đa 150 token) và yêu cầu đúng một câu tiếng Việt dưới 40 từ. Ứng dụng chỉ tóm tắt 8 chủ đề lớn nhất và kiểm tra Ollama có chạy không trước khi gọi.</w:t>
       </w:r>
     </w:p>
     <w:p>
@@ -6051,17 +5967,11 @@
       </w:r>
     </w:p>
     <w:p>
-      <w:r>
-        <w:br w:type="page"/>
-      </w:r>
-    </w:p>
-    <w:p>
       <w:pPr>
         <w:pStyle w:val="Heading1"/>
       </w:pPr>
       <w:bookmarkStart w:id="21" w:name="_Toc240922962"/>
       <w:r>
-        <w:lastRenderedPageBreak/>
         <w:t>6. Đánh giá</w:t>
       </w:r>
       <w:bookmarkEnd w:id="21"/>
@@ -6137,6 +6047,7 @@
       </w:pPr>
       <w:bookmarkStart w:id="22" w:name="_Toc240922963"/>
       <w:r>
+        <w:lastRenderedPageBreak/>
         <w:t>6.1. Kết quả trên tập kiểm tra</w:t>
       </w:r>
       <w:bookmarkEnd w:id="22"/>
@@ -6727,7 +6638,6 @@
         <w:jc w:val="both"/>
       </w:pPr>
       <w:r>
-        <w:lastRenderedPageBreak/>
         <w:t>Ma trận nhầm lẫn (hàng là nhãn thật, cột là dự đoán, thứ tự 0 / 1 / 2):</w:t>
       </w:r>
     </w:p>
@@ -7495,17 +7405,11 @@
       </w:r>
     </w:p>
     <w:p>
-      <w:r>
-        <w:br w:type="page"/>
-      </w:r>
-    </w:p>
-    <w:p>
       <w:pPr>
         <w:pStyle w:val="Heading1"/>
       </w:pPr>
       <w:bookmarkStart w:id="25" w:name="_Toc240922966"/>
       <w:r>
-        <w:lastRenderedPageBreak/>
         <w:t>7. Phân tích lỗi</w:t>
       </w:r>
       <w:bookmarkEnd w:id="25"/>
@@ -7523,13 +7427,7 @@
         <w:jc w:val="both"/>
       </w:pPr>
       <w:r>
-        <w:t>Danh sách đặc trưng trọng số lớn nhất (results/top_features.txt</w:t>
-      </w:r>
-      <w:r>
-        <w:t>) giải thích một phần. Lớp tiêu cực dựa vào không (+2,93), chán, không hay (+2,29), tức, không thích (+2,10), dở, nhạt, thất_vọng, và cả quảng_cáo, khán_giả: hai từ sau là chủ đề, không phải cảm xúc, nghĩa là mô hình học được rằng bình luận về quảng cáo và về khán giả trong tập dữ liệu này phần lớn là chê. Lớp trung tính dựa vào nhưng (+2,95), tiếc, tưởng, tội, ok, hơi, hay mà, hay nhưng, phải_chi, ước gì</w:t>
-      </w:r>
-      <w:r>
-        <w:t>: đây là dấu hiệu của câu vừa khen vừa chê hoặc tiếc nuối, đúng với định nghĩa lớp nhưng cũng cho thấy ranh giới với hai lớp kia mờ ngay trong nhãn. Lớp tích cực dựa vào đỉnh (+3,36), mê (+3,20), hay quá, yêu, tuyệt_vời, dễ_thương, cuốn, và tên riêng atus, negav: mô hình học được rằng bình luận nhắc tới hai thí sinh này thường là khen, một tín hiệu đúng trong miền nhưng không chuyển được sang video khác.</w:t>
+        <w:t>Danh sách đặc trưng trọng số lớn nhất (results/top_features.txt) giải thích một phần. Lớp tiêu cực dựa vào không (+2,93), chán, không hay (+2,29), tức, không thích (+2,10), dở, nhạt, thất_vọng, và cả quảng_cáo, khán_giả: hai từ sau là chủ đề, không phải cảm xúc, nghĩa là mô hình học được rằng bình luận về quảng cáo và về khán giả trong tập dữ liệu này phần lớn là chê. Lớp trung tính dựa vào nhưng (+2,95), tiếc, tưởng, tội, ok, hơi, hay mà, hay nhưng, phải_chi, ước gì: đây là dấu hiệu của câu vừa khen vừa chê hoặc tiếc nuối, đúng với định nghĩa lớp nhưng cũng cho thấy ranh giới với hai lớp kia mờ ngay trong nhãn. Lớp tích cực dựa vào đỉnh (+3,36), mê (+3,20), hay quá, yêu, tuyệt_vời, dễ_thương, cuốn, và tên riêng atus, negav: mô hình học được rằng bình luận nhắc tới hai thí sinh này thường là khen, một tín hiệu đúng trong miền nhưng không chuyển được sang video khác.</w:t>
       </w:r>
     </w:p>
     <w:p>
@@ -7537,10 +7435,7 @@
         <w:jc w:val="both"/>
       </w:pPr>
       <w:r>
-        <w:t>Để biết mô hình sai ở đâu, nhóm xuất toàn bộ 935 bình luận bị dự đoán sai trên tập kiểm tra (</w:t>
-      </w:r>
-      <w:r>
-        <w:t>experiments/export_misclassified.py, đầu ra results/misclassified_test.csv), lấy mẫu phân tầng 150 dòng theo nhãn thật (55 tiêu cực, 50 trung tính, 45 tích cực) rồi đọc từng dòng và xếp vào một hiện tượng ngôn ngữ chính. Kết quả từng dòng nằm ở results/error_analysis_150.csv, bảng tổng hợp và ví dụ ở results/error_analysis_150.txt. Việc gán nhãn do một người đọc một lượt, nên đây là nhận định định tính, không phải phép đo có độ tin cậy thống kê.</w:t>
+        <w:t>Để biết mô hình sai ở đâu, nhóm xuất toàn bộ 935 bình luận bị dự đoán sai trên tập kiểm tra (experiments/export_misclassified.py, đầu ra results/misclassified_test.csv), lấy mẫu phân tầng 150 dòng theo nhãn thật (55 tiêu cực, 50 trung tính, 45 tích cực) rồi đọc từng dòng và xếp vào một hiện tượng ngôn ngữ chính. Kết quả từng dòng nằm ở results/error_analysis_150.csv, bảng tổng hợp và ví dụ ở results/error_analysis_150.txt. Việc gán nhãn do một người đọc một lượt, nên đây là nhận định định tính, không phải phép đo có độ tin cậy thống kê.</w:t>
       </w:r>
     </w:p>
     <w:tbl>
@@ -7579,6 +7474,7 @@
               <w:rPr>
                 <w:b/>
               </w:rPr>
+              <w:lastRenderedPageBreak/>
               <w:t>Hiện tượng</w:t>
             </w:r>
           </w:p>
@@ -8742,7 +8638,6 @@
         <w:rPr>
           <w:i/>
         </w:rPr>
-        <w:lastRenderedPageBreak/>
         <w:t>Cần ngữ cảnh chương trình</w:t>
       </w:r>
       <w:r>
@@ -8837,11 +8732,6 @@
       </w:r>
     </w:p>
     <w:p>
-      <w:r>
-        <w:br w:type="page"/>
-      </w:r>
-    </w:p>
-    <w:p>
       <w:pPr>
         <w:pStyle w:val="Heading1"/>
       </w:pPr>
@@ -8857,13 +8747,7 @@
         <w:jc w:val="both"/>
       </w:pPr>
       <w:r>
-        <w:t>Ứng dụng Streamlit (src/app.py</w:t>
-      </w:r>
-      <w:r>
-        <w:t>) chạy sáu bước theo thứ tự: lấy dữ liệu, làm sạch và tách từ, nhúng câu, gom cụm, phân loại cảm xúc, tóm tắt bằng LLM (tùy chọn). Ba nguồn dữ liệu được hỗ trợ: Link YouTube (cần YOUTUBE_API_KEY), Tệp CSV (tải lên rồi chọn cột văn bản), và Dữ liệu mẫu (đọc N dòng đầu của data/dataset_chuan.csv</w:t>
-      </w:r>
-      <w:r>
-        <w:t>, không cần API key, dành cho người chấm). Với nguồn Dữ liệu mẫu, ứng dụng hiển thị lời nhắc rằng tệp này chính là tập huấn luyện của mô hình cảm xúc, nên tỉ lệ cảm xúc hiển thị lạc quan hơn thực tế và chỉ phần chủ đề là minh họa công bằng.</w:t>
+        <w:t>Ứng dụng Streamlit (src/app.py) chạy sáu bước theo thứ tự: lấy dữ liệu, làm sạch và tách từ, nhúng câu, gom cụm, phân loại cảm xúc, tóm tắt bằng LLM (tùy chọn). Ba nguồn dữ liệu được hỗ trợ: Link YouTube (cần YOUTUBE_API_KEY), Tệp CSV (tải lên rồi chọn cột văn bản), và Dữ liệu mẫu (đọc N dòng đầu của data/dataset_chuan.csv, không cần API key, dành cho người chấm). Với nguồn Dữ liệu mẫu, ứng dụng hiển thị lời nhắc rằng tệp này chính là tập huấn luyện của mô hình cảm xúc, nên tỉ lệ cảm xúc hiển thị lạc quan hơn thực tế và chỉ phần chủ đề là minh họa công bằng.</w:t>
       </w:r>
     </w:p>
     <w:p>
@@ -8871,10 +8755,7 @@
         <w:jc w:val="both"/>
       </w:pPr>
       <w:r>
-        <w:t xml:space="preserve">Kết quả tính toán nặng được giữ lại: bình luận thu thập và vector nhúng nằm trong st.cache_data (khóa là mã video hoặc chuỗi băm nội dung, không bao giờ chứa API key), mô hình nhúng và mô hình cảm xúc nằm trong st.cache_resource, và kết quả phân tích nằm trong </w:t>
-      </w:r>
-      <w:r>
-        <w:t>st.session_state. Nhờ vậy đổi tab, lọc bảng hay tải CSV không chạy lại bước thu thập (tốn quota) và bước nhúng câu.</w:t>
+        <w:t>Kết quả tính toán nặng được giữ lại: bình luận thu thập và vector nhúng nằm trong st.cache_data (khóa là mã video hoặc chuỗi băm nội dung, không bao giờ chứa API key), mô hình nhúng và mô hình cảm xúc nằm trong st.cache_resource, và kết quả phân tích nằm trong st.session_state. Nhờ vậy đổi tab, lọc bảng hay tải CSV không chạy lại bước thu thập (tốn quota) và bước nhúng câu.</w:t>
       </w:r>
     </w:p>
     <w:p>
@@ -9128,24 +9009,15 @@
         <w:jc w:val="both"/>
       </w:pPr>
       <w:r>
-        <w:t>Hạn chế vận hành. YouTube Data API v3 cấp mặc định 10.000 đơn vị quota mỗi ngày; mỗi lệnh commentThreads.list, comments.list, videos.list tốn 1 đơn vị. Bộ thu thập xin part=snippet,replies để dùng các phản hồi trả về kèm theo và chỉ gọi thêm comments.list</w:t>
-      </w:r>
-      <w:r>
-        <w:t xml:space="preserve"> khi một bình luận gốc còn phản hồi chưa lấy được. Theo kinh nghiệm cộng đồng, YouTube ngừng phân trang ở khoảng 1.000 chuỗi bình luận gốc mỗi video; điều này chưa được kiểm chứng trong đồ án, nhưng nếu đúng thì số bình luận thu được có trần dù thanh trượt cho phép tới 5.000. Ollama là tùy chọn: khi không chạy, ứng dụng bỏ qua bước tóm tắt và hiện một cảnh báo.</w:t>
+        <w:t>Hạn chế vận hành. YouTube Data API v3 cấp mặc định 10.000 đơn vị quota mỗi ngày; mỗi lệnh commentThreads.list, comments.list, videos.list tốn 1 đơn vị. Bộ thu thập xin part=snippet,replies để dùng các phản hồi trả về kèm theo và chỉ gọi thêm comments.list khi một bình luận gốc còn phản hồi chưa lấy được. Theo kinh nghiệm cộng đồng, YouTube ngừng phân trang ở khoảng 1.000 chuỗi bình luận gốc mỗi video; điều này chưa được kiểm chứng trong đồ án, nhưng nếu đúng thì số bình luận thu được có trần dù thanh trượt cho phép tới 5.000. Ollama là tùy chọn: khi không chạy, ứng dụng bỏ qua bước tóm tắt và hiện một cảnh báo.</w:t>
       </w:r>
     </w:p>
     <w:p>
-      <w:r>
-        <w:br w:type="page"/>
-      </w:r>
-    </w:p>
-    <w:p>
       <w:pPr>
         <w:pStyle w:val="Heading1"/>
       </w:pPr>
       <w:bookmarkStart w:id="27" w:name="_Toc240922968"/>
       <w:r>
-        <w:lastRenderedPageBreak/>
         <w:t>9. Hạn chế và hướng phát triển</w:t>
       </w:r>
       <w:bookmarkEnd w:id="27"/>
@@ -9187,6 +9059,7 @@
         <w:pStyle w:val="ListBullet"/>
       </w:pPr>
       <w:r>
+        <w:lastRenderedPageBreak/>
         <w:t>Nhãn là nhãn silver do mô hình ngôn ngữ lớn gán tự động, chưa được người kiểm tra từng dòng; theo chính tác giả dữ liệu, lớp trung tính là lớp nhiễu nhất (mục 2.1). Phần đọc tay 150 bình luận dự đoán sai ở mục 7 tìm thấy 7 dòng (4,7% của mẫu lỗi) mà người đọc không đồng ý với nhãn gốc.</w:t>
       </w:r>
     </w:p>
@@ -9235,10 +9108,7 @@
         </w:numPr>
       </w:pPr>
       <w:r>
-        <w:t>Tính coherence c_v</w:t>
-      </w:r>
-      <w:r>
-        <w:t xml:space="preserve"> cho các cấu hình BERTopic trong bảng mục 5.2 và trên bình luận của ít nhất hai video thật, để chọn cấu hình theo số đo thay vì theo cảm nhận.</w:t>
+        <w:t>Tính coherence c_v cho các cấu hình BERTopic trong bảng mục 5.2 và trên bình luận của ít nhất hai video thật, để chọn cấu hình theo số đo thay vì theo cảm nhận.</w:t>
       </w:r>
     </w:p>
     <w:p>
@@ -9422,10 +9292,7 @@
         </w:numPr>
       </w:pPr>
       <w:r>
-        <w:t>Thẻ mô hình keepitreal/vietnamese-sbert, Hugging Face Hub (tệp config.json</w:t>
-      </w:r>
-      <w:r>
-        <w:t xml:space="preserve"> và cấu hình sentence-transformers của mô hình).</w:t>
+        <w:t>Thẻ mô hình keepitreal/vietnamese-sbert, Hugging Face Hub (tệp config.json và cấu hình sentence-transformers của mô hình).</w:t>
       </w:r>
     </w:p>
     <w:p>
@@ -9473,10 +9340,7 @@
         </w:numPr>
       </w:pPr>
       <w:r>
-        <w:t>Google, Tài liệu YouTube Data API v3: commentThreads.list, comments.list, videos.list</w:t>
-      </w:r>
-      <w:r>
-        <w:t xml:space="preserve"> và hạn mức truy vấn.</w:t>
+        <w:t>Google, Tài liệu YouTube Data API v3: commentThreads.list, comments.list, videos.list và hạn mức truy vấn.</w:t>
       </w:r>
     </w:p>
     <w:p>
@@ -9512,10 +9376,7 @@
         <w:jc w:val="both"/>
       </w:pPr>
       <w:r>
-        <w:t>Môi trường: Python 3.11.15 là phiên bản đã kiểm thử (3.12 dự kiến chạy được, chưa thử), pip install -r requirements-dev.txt (xem README.md). Không lệnh nào dưới đây cần API key hay kết nối tới YouTube. Lần chạy đầu của ứng dụng hoặc của src/topic_model.py</w:t>
-      </w:r>
-      <w:r>
-        <w:t xml:space="preserve"> tải mô hình nhúng câu từ Hugging Face Hub về cache; các lệnh gom cụm và hai kiểm thử đầu-cuối đọc mô hình từ cache đó, nên cần chạy một trong hai lệnh này trước khi ngắt mạng.</w:t>
+        <w:t>Môi trường: Python 3.11.15 là phiên bản đã kiểm thử (3.12 dự kiến chạy được, chưa thử), pip install -r requirements-dev.txt (xem README.md). Không lệnh nào dưới đây cần API key hay kết nối tới YouTube. Lần chạy đầu của ứng dụng hoặc của src/topic_model.py tải mô hình nhúng câu từ Hugging Face Hub về cache; các lệnh gom cụm và hai kiểm thử đầu-cuối đọc mô hình từ cache đó, nên cần chạy một trong hai lệnh này trước khi ngắt mạng.</w:t>
       </w:r>
     </w:p>
     <w:p>
@@ -9809,10 +9670,7 @@
         <w:jc w:val="both"/>
       </w:pPr>
       <w:r>
-        <w:t>UMAP với random_state=42</w:t>
-      </w:r>
-      <w:r>
-        <w:t xml:space="preserve"> cho kết quả xác định trên cùng một máy: hai lần chạy cùng lệnh cho cùng phép gán chủ đề từng dòng. Giữa các máy có bản dựng BLAS khác nhau, số chủ đề và tỉ lệ nhiễu có thể lệch nhỏ; đó là điều bình thường và không làm thay đổi kết luận của mục 5.2.</w:t>
+        <w:t>UMAP với random_state=42 cho kết quả xác định trên cùng một máy: hai lần chạy cùng lệnh cho cùng phép gán chủ đề từng dòng. Giữa các máy có bản dựng BLAS khác nhau, số chủ đề và tỉ lệ nhiễu có thể lệch nhỏ; đó là điều bình thường và không làm thay đổi kết luận của mục 5.2.</w:t>
       </w:r>
     </w:p>
     <w:p>
@@ -10127,10 +9985,7 @@
               <w:spacing w:after="40"/>
             </w:pPr>
             <w:r>
-              <w:t xml:space="preserve">results/metrics.json: test; results/classification_report.txt; </w:t>
-            </w:r>
-            <w:r>
-              <w:t>results/confusion_matrix*.png</w:t>
+              <w:t>results/metrics.json: test; results/classification_report.txt; results/confusion_matrix*.png</w:t>
             </w:r>
           </w:p>
         </w:tc>
@@ -10310,10 +10165,7 @@
               <w:spacing w:after="40"/>
             </w:pPr>
             <w:r>
-              <w:t>results/ab_preprocess.txt, results/ab_preprocess.csv</w:t>
-            </w:r>
-            <w:r>
-              <w:t>; script experiments/ab_preprocess.py với experiments/preprocess_baseline.py</w:t>
+              <w:t>results/ab_preprocess.txt, results/ab_preprocess.csv; script experiments/ab_preprocess.py với experiments/preprocess_baseline.py</w:t>
             </w:r>
           </w:p>
         </w:tc>

</xml_diff>